<commit_message>
docs: condense paper to 4-page double-column + add CPU benchmark table
- Trim body from ~2835 to ~2200 words to fit the 4-page double-column ACM SIG
  limit (+1 page refs): fold System Overview into the intro, tighten prose, and
  collapse Table 2 to two columns.
- Add Table 4: measured CPU latency and footprint (TT encode 47 ms, ANN 2.2 ms,
  Qwen 601 ms, BM25 0.5 ms, LambdaMART 3.4 ms, 1.85 GB serving, 24 MB adapter).
- Add two negative results to Section 5 (no post-hoc top-20 edits; zero-shot
  rerankers underperform) for the empirical/failure-analysis angle.

Co-Authored-By: Claude Opus 4.8 <noreply@anthropic.com>
</commit_message>
<xml_diff>
--- a/paper_wikis/paper.docx
+++ b/paper_wikis/paper.docx
@@ -39,130 +39,114 @@
         <w:pStyle w:val="Abstract"/>
       </w:pPr>
       <w:r>
-        <w:t xml:space="preserve">We present a conversational music recommender for the TalkPlayData Challenge (ACM RecSys 2026) that ranks tracks and generates the assistant response at each turn of a multi-turn dialogue, and that trains and serves in its entirety on a single consumer desktop with no discrete GPU. The system has three stages: (i) a </w:t>
+        <w:t>We present a conversational music recommender for the TalkPlayData Challenge (ACM RecSys 2026) that, at each dialogue turn, ranks tracks from a 47,071-track catalog and generates the assistant response, and that trains and serves entirely on a single consumer desktop with no discrete GPU. Retrieval is a union of nine inexpensive sources whose candidates are arbitrated by a gradient-boosted learning-to-rank model over 67 features; the strongest feature is simply how many sources agree on a candidate. The only trained neural component is a LoRA adaptation of a 279M-parameter multilingual encoder over a role-tagged dialogue anchor. Our central finding is that the dataset's goal-progress feedback signal is both misaligned in time and contaminated with user-rejected tracks, that fixing it is the highest-value step in the project, and that the same signal can be reconstructed from raw dialogue when it is withheld at test time. The system reaches a composite score of 0.49 on the blind generalization set.</w:t>
+      </w:r>
+    </w:p>
+    <w:p>
+      <w:pPr>
+        <w:pStyle w:val="CCSHead"/>
+      </w:pPr>
+      <w:r>
+        <w:t>CCS CONCEPTS</w:t>
+      </w:r>
+    </w:p>
+    <w:p>
+      <w:pPr>
+        <w:pStyle w:val="CCSDescription"/>
+      </w:pPr>
+      <w:r>
+        <w:t>Information systems -&gt; Recommender systems; Learning to rank; Language models.</w:t>
+      </w:r>
+    </w:p>
+    <w:p>
+      <w:pPr>
+        <w:pStyle w:val="KeyWordHead"/>
+      </w:pPr>
+      <w:r>
+        <w:t>KEYWORDS</w:t>
+      </w:r>
+    </w:p>
+    <w:p>
+      <w:pPr>
+        <w:pStyle w:val="KeyWords"/>
+      </w:pPr>
+      <w:r>
+        <w:t>conversational recommendation, music recommendation, learning to rank, dense retrieval, LoRA fine-tuning, preference elicitation, CPU-scale systems</w:t>
+      </w:r>
+    </w:p>
+    <w:p>
+      <w:pPr>
+        <w:pStyle w:val="Head1"/>
+      </w:pPr>
+      <w:r>
+        <w:t>1 Introduction</w:t>
+      </w:r>
+    </w:p>
+    <w:p>
+      <w:pPr>
+        <w:pStyle w:val="Para"/>
+      </w:pPr>
+      <w:r>
+        <w:t>The TalkPlayData Challenge frames music recommendation as a multi-turn dialogue. At each turn the system must (a) rank 20 tracks from a catalog of 47,071 so that the single logged next track ranks high, and (b) produce the assistant's reply. Submissions are scored by a composite metric:</w:t>
+      </w:r>
+    </w:p>
+    <w:p>
+      <w:pPr>
+        <w:pStyle w:val="Quote"/>
+      </w:pPr>
+      <w:r>
+        <w:t>Score = 0.50 * nDCG@20 + 0.10 * CatalogDiversity + 0.10 * LexicalDiversity + 0.30 * JudgeNorm,</w:t>
+      </w:r>
+    </w:p>
+    <w:p>
+      <w:pPr>
+        <w:pStyle w:val="Quote"/>
+      </w:pPr>
+      <w:r>
+        <w:t>JudgeNorm = (judge_score - 1) / 4.</w:t>
+      </w:r>
+    </w:p>
+    <w:p>
+      <w:pPr>
+        <w:pStyle w:val="Para"/>
+      </w:pPr>
+      <w:r>
+        <w:t>The judge is a language model that reads only the response text (personalization and explanation quality); it never sees the track list. The blind generalization set ("Blind B") is harder than the labeled data: the conversation goal, the per-turn goal-progress assessments, and the model's internal thoughts are removed, and half of its 80 sessions are cold-start with no user profile.</w:t>
+      </w:r>
+    </w:p>
+    <w:p>
+      <w:pPr>
+        <w:pStyle w:val="Para"/>
+      </w:pPr>
+      <w:r>
+        <w:t xml:space="preserve">Our system has three stages. </w:t>
       </w:r>
       <w:r>
         <w:rPr>
           <w:i/>
         </w:rPr>
-        <w:t>recall</w:t>
-      </w:r>
-      <w:r>
-        <w:t xml:space="preserve"> stage that fuses nine inexpensive retrievers into a candidate pool of roughly three thousand tracks; (ii) a </w:t>
+        <w:t>Recall</w:t>
+      </w:r>
+      <w:r>
+        <w:t xml:space="preserve"> runs nine retrievers per turn and merges their outputs into one deduplicated pool (mean ~3,100 candidates); no single source exceeds ~59% gold recall at 500 candidates, but the fused pool reaches ~89% on the blind-simulated holdout. </w:t>
       </w:r>
       <w:r>
         <w:rPr>
           <w:i/>
         </w:rPr>
-        <w:t>rescore</w:t>
-      </w:r>
-      <w:r>
-        <w:t xml:space="preserve"> stage that arbitrates the pool with a gradient-boosted learning-to-rank model over 67 per-candidate features; and (iii) a decoupled </w:t>
+        <w:t>Rescore</w:t>
+      </w:r>
+      <w:r>
+        <w:t xml:space="preserve"> is a LightGBM LambdaMART model that scores every candidate from 67 features and emits the top 20, replacing hand-tuned score fusion. </w:t>
       </w:r>
       <w:r>
         <w:rPr>
           <w:i/>
         </w:rPr>
-        <w:t>response</w:t>
-      </w:r>
-      <w:r>
-        <w:t xml:space="preserve"> stage. The only trained neural component is a LoRA adaptation of a 279M-parameter multilingual text encoder, fine-tuned on (dialogue, next-track) pairs with a role-tagged dialogue anchor. We show that correctly handling the dataset's goal-progress feedback signal, which is both off-by-one in time and contaminated with user-rejected tracks, is the single highest-value engineering step, and that the same feedback channel can be reconstructed from raw dialogue text when it is withheld at test time. On the blind generalization set our system reaches a composite score of 0.49.</w:t>
-      </w:r>
-    </w:p>
-    <w:p>
-      <w:pPr>
-        <w:pStyle w:val="CCSHead"/>
-      </w:pPr>
-      <w:r>
-        <w:t>CCS CONCEPTS</w:t>
-      </w:r>
-    </w:p>
-    <w:p>
-      <w:pPr>
-        <w:pStyle w:val="CCSDescription"/>
-      </w:pPr>
-      <w:r>
-        <w:t>Information systems -&gt; Recommender systems; Learning to rank; Language models.</w:t>
-      </w:r>
-    </w:p>
-    <w:p>
-      <w:pPr>
-        <w:pStyle w:val="CCSDescription"/>
-      </w:pPr>
-      <w:r>
-        <w:t>Computing methodologies -&gt; Learning latent representations.</w:t>
-      </w:r>
-    </w:p>
-    <w:p>
-      <w:pPr>
-        <w:pStyle w:val="KeyWordHead"/>
-      </w:pPr>
-      <w:r>
-        <w:t>KEYWORDS</w:t>
-      </w:r>
-    </w:p>
-    <w:p>
-      <w:pPr>
-        <w:pStyle w:val="KeyWords"/>
-      </w:pPr>
-      <w:r>
-        <w:t>conversational recommendation, music recommendation, learning to rank, dense retrieval, LoRA fine-tuning, preference elicitation, CPU-scale systems</w:t>
-      </w:r>
-    </w:p>
-    <w:p>
-      <w:pPr>
-        <w:pStyle w:val="Head1"/>
-      </w:pPr>
-      <w:r>
-        <w:t>1 Introduction</w:t>
-      </w:r>
-    </w:p>
-    <w:p>
-      <w:pPr>
-        <w:pStyle w:val="Para"/>
-      </w:pPr>
-      <w:r>
-        <w:t>The TalkPlayData Challenge frames music recommendation as a multi-turn dialogue. At each turn the system must (a) rank 20 tracks from a catalog of 47,071 such that the single logged next track ranks high, and (b) produce the assistant's natural-language reply. Submissions are scored by a composite metric:</w:t>
-      </w:r>
-    </w:p>
-    <w:p>
-      <w:pPr>
-        <w:pStyle w:val="Quote"/>
-      </w:pPr>
-      <w:r>
-        <w:t>Score = 0.50 * nDCG@20 + 0.10 * CatalogDiversity + 0.10 * LexicalDiversity + 0.30 * JudgeNorm,</w:t>
-      </w:r>
-    </w:p>
-    <w:p>
-      <w:pPr>
-        <w:pStyle w:val="Quote"/>
-      </w:pPr>
-      <w:r>
-        <w:t>with JudgeNorm = (judge_score - 1) / 4.</w:t>
-      </w:r>
-    </w:p>
-    <w:p>
-      <w:pPr>
-        <w:pStyle w:val="Para"/>
-      </w:pPr>
-      <w:r>
-        <w:t>The judge is a large language model that reads only the response text along two disclosed axes (personalization, explanation quality); it never sees the track list. With one relevant item per turn, nDCG@20 reduces to 1/log2(rank+1) when the gold track appears in the top 20 and 0 otherwise.</w:t>
-      </w:r>
-    </w:p>
-    <w:p>
-      <w:pPr>
-        <w:pStyle w:val="Para"/>
-      </w:pPr>
-      <w:r>
-        <w:t>The blind generalization set ("Blind B") is deliberately harder than the labeled data: the conversation goal, the per-turn goal-progress assessments, and the model's internal "thoughts" are all removed, and half of its 80 sessions are cold-start with no user identifier or profile.</w:t>
-      </w:r>
-    </w:p>
-    <w:p>
-      <w:pPr>
-        <w:pStyle w:val="Para"/>
-      </w:pPr>
-      <w:r>
-        <w:t>This paper describes the retrieval-and-ranking system behind our best blind result (composite 0.49). We focus on three components: the fused recall architecture and the exact construction of each retriever (Section 3); the LoRA-adapted dialogue encoder and the goal-progress feedback fix that made it work (Section 4); and the learning-to-rank rescorer and its full feature set (Section 5). Section 6 gives a compact account of the iterative gains, Section 7 the efficiency profile, and Section 8 concludes.</w:t>
+        <w:t>Respond</w:t>
+      </w:r>
+      <w:r>
+        <w:t xml:space="preserve"> is decoupled: because the judge reads only text, the response may describe the ranked list but never reorders it. All three stages run on one Apple M4 machine (16 GB unified memory, no GPU), and the only trained neural component is the LoRA encoder of Section 3.</w:t>
       </w:r>
     </w:p>
     <w:p>
@@ -175,13 +159,8 @@
         </w:rPr>
         <w:t>Contributions.</w:t>
       </w:r>
-    </w:p>
-    <w:p>
-      <w:pPr>
-        <w:pStyle w:val="ListParagraph"/>
-      </w:pPr>
-      <w:r>
-        <w:t xml:space="preserve">A recall design that treats retrieval as </w:t>
+      <w:r>
+        <w:t xml:space="preserve"> (1) A recall design that treats retrieval as </w:t>
       </w:r>
       <w:r>
         <w:rPr>
@@ -190,15 +169,7 @@
         <w:t>set union, not weighted fusion</w:t>
       </w:r>
       <w:r>
-        <w:t>: nine independent retrievers each contribute candidates and per-source features, and a learned ranker decides how much to trust each. The strongest single feature is multi-source agreement.</w:t>
-      </w:r>
-    </w:p>
-    <w:p>
-      <w:pPr>
-        <w:pStyle w:val="ListParagraph"/>
-      </w:pPr>
-      <w:r>
-        <w:t xml:space="preserve">A dialogue-aware retriever: a LoRA fine-tune of </w:t>
+        <w:t xml:space="preserve">: each source contributes candidates and per-source features, and a learned ranker decides how far to trust each; multi-source agreement is the single strongest feature. (2) A dialogue-aware retriever: a LoRA fine-tune of </w:t>
       </w:r>
       <w:r>
         <w:rPr>
@@ -207,89 +178,15 @@
         <w:t>multilingual-e5-base</w:t>
       </w:r>
       <w:r>
-        <w:t xml:space="preserve"> on a role-tagged anchor that encodes prior turns, recommendations, and per-turn user reactions.</w:t>
+        <w:t xml:space="preserve"> over a role-tagged anchor encoding prior turns, recommendations, and per-turn reactions. (3) A treatment of the goal-progress feedback signal that is off-by-one in time and contaminated with rejected tracks, plus a test-time reconstruction of that signal from raw dialogue.</w:t>
       </w:r>
     </w:p>
     <w:p>
       <w:pPr>
-        <w:pStyle w:val="ListParagraph"/>
-      </w:pPr>
-      <w:r>
-        <w:t>A treatment of the goal-progress feedback signal, which we show is off-by-one in time and contaminated with rejected tracks, together with a test-time reconstruction of that signal from raw dialogue when it is withheld.</w:t>
-      </w:r>
-    </w:p>
-    <w:p>
-      <w:pPr>
         <w:pStyle w:val="Head1"/>
       </w:pPr>
       <w:r>
-        <w:t>2 System Overview</w:t>
-      </w:r>
-    </w:p>
-    <w:p>
-      <w:pPr>
-        <w:pStyle w:val="Para"/>
-      </w:pPr>
-      <w:r>
-        <w:t>The pipeline is three sequential stages.</w:t>
-      </w:r>
-    </w:p>
-    <w:p>
-      <w:pPr>
-        <w:pStyle w:val="Para"/>
-      </w:pPr>
-      <w:r>
-        <w:rPr>
-          <w:b/>
-        </w:rPr>
-        <w:t>Recall.</w:t>
-      </w:r>
-      <w:r>
-        <w:t xml:space="preserve"> Nine retrievers run per turn and their outputs are merged into one deduplicated candidate pool (mean ~3,100 tracks). No single retriever exceeds ~59% gold recall at 500 candidates; the fused pool reaches ~89% on the blind-simulated holdout.</w:t>
-      </w:r>
-    </w:p>
-    <w:p>
-      <w:pPr>
-        <w:pStyle w:val="Para"/>
-      </w:pPr>
-      <w:r>
-        <w:rPr>
-          <w:b/>
-        </w:rPr>
-        <w:t>Rescore.</w:t>
-      </w:r>
-      <w:r>
-        <w:t xml:space="preserve"> A LightGBM LambdaMART model scores every pooled candidate from 67 features and emits the top 20. This learned ranker replaces hand-tuned score fusion and lets any retriever contribute candidates without a manually assigned weight.</w:t>
-      </w:r>
-    </w:p>
-    <w:p>
-      <w:pPr>
-        <w:pStyle w:val="Para"/>
-      </w:pPr>
-      <w:r>
-        <w:rPr>
-          <w:b/>
-        </w:rPr>
-        <w:t>Respond.</w:t>
-      </w:r>
-      <w:r>
-        <w:t xml:space="preserve"> Because the judge reads only text, response generation is decoupled from ranking: the response may describe the ranked list but never reorders it. This stage is out of scope here.</w:t>
-      </w:r>
-    </w:p>
-    <w:p>
-      <w:pPr>
-        <w:pStyle w:val="Para"/>
-      </w:pPr>
-      <w:r>
-        <w:t>All three stages run on one consumer machine (Apple M4, 16 GB unified memory, no discrete GPU). The only trained neural component is the LoRA encoder of Section 4.</w:t>
-      </w:r>
-    </w:p>
-    <w:p>
-      <w:pPr>
-        <w:pStyle w:val="Head1"/>
-      </w:pPr>
-      <w:r>
-        <w:t>3 Recall Architecture</w:t>
+        <w:t>2 Recall Architecture</w:t>
       </w:r>
     </w:p>
     <w:p>
@@ -306,7 +203,7 @@
         <w:t>add candidates, never re-weight sources by hand</w:t>
       </w:r>
       <w:r>
-        <w:t>: even low-precision sources help because source membership feeds the agreement feature of Section 5.</w:t>
+        <w:t>: even low-precision sources help, because source membership feeds the agreement feature of Section 4.</w:t>
       </w:r>
     </w:p>
     <w:p>
@@ -664,7 +561,7 @@
               <w:rPr>
                 <w:sz w:val="18"/>
               </w:rPr>
-              <w:t>full discographies</w:t>
+              <w:t>discographies</w:t>
             </w:r>
           </w:p>
         </w:tc>
@@ -756,7 +653,7 @@
               <w:rPr>
                 <w:sz w:val="18"/>
               </w:rPr>
-              <w:t>second dense opinion, different embedding space</w:t>
+              <w:t>second dense opinion, different space</w:t>
             </w:r>
           </w:p>
         </w:tc>
@@ -978,7 +875,7 @@
               <w:rPr>
                 <w:sz w:val="18"/>
               </w:rPr>
-              <w:t>tracks that followed recent history tracks</w:t>
+              <w:t>tracks that followed recent history</w:t>
             </w:r>
           </w:p>
         </w:tc>
@@ -1060,18 +957,16 @@
     </w:tbl>
     <w:p>
       <w:pPr>
-        <w:pStyle w:val="Head2"/>
-      </w:pPr>
-      <w:r>
-        <w:t>3.1 Lexical retrieval (source 1)</w:t>
-      </w:r>
-    </w:p>
-    <w:p>
-      <w:pPr>
         <w:pStyle w:val="Para"/>
       </w:pPr>
       <w:r>
-        <w:t xml:space="preserve">BM25 (Okapi, via </w:t>
+        <w:rPr>
+          <w:i/>
+        </w:rPr>
+        <w:t>Lexical (source 1).</w:t>
+      </w:r>
+      <w:r>
+        <w:t xml:space="preserve"> BM25 (via </w:t>
       </w:r>
       <w:r>
         <w:rPr>
@@ -1080,60 +975,21 @@
         <w:t>bm25s</w:t>
       </w:r>
       <w:r>
-        <w:t xml:space="preserve">) indexes each track's name, artist, album, and tag list. Indexing the </w:t>
-      </w:r>
+        <w:t>) indexes each track's name, artist, album, and tag list; indexing the tags matters because conversational requests use genre/mood/era vocabulary that only tags carry. The query is the latest user message plus the goal, culture, last four played tracks, and last four turns; older turns are excluded because they dilute the current request's IDF mass.</w:t>
+      </w:r>
+    </w:p>
+    <w:p>
+      <w:pPr>
+        <w:pStyle w:val="Para"/>
+      </w:pPr>
       <w:r>
         <w:rPr>
           <w:i/>
         </w:rPr>
-        <w:t>tag list</w:t>
-      </w:r>
-      <w:r>
-        <w:t xml:space="preserve"> is important: conversational requests use genre/mood/era vocabulary ("something mellow and acoustic") that only the tags carry. The query is assembled from the latest user message, the stated goal, the listener culture, the last four played tracks (name/artist/tags), and the last four dialogue turns. Turns older than four are deliberately excluded: adding them dilutes the inverse-document-frequency mass of the current request. Turns whose vocabulary misses the index are smoothed by a score floor (0.05) so they are not dropped from the pool.</w:t>
-      </w:r>
-    </w:p>
-    <w:p>
-      <w:pPr>
-        <w:pStyle w:val="Head2"/>
-      </w:pPr>
-      <w:r>
-        <w:t>3.2 Dense retrieval (sources 2, 5)</w:t>
-      </w:r>
-    </w:p>
-    <w:p>
-      <w:pPr>
-        <w:pStyle w:val="Para"/>
-      </w:pPr>
-      <w:r>
-        <w:t>Two independent dense retrievers provide complementary embedding spaces.</w:t>
-      </w:r>
-    </w:p>
-    <w:p>
-      <w:pPr>
-        <w:pStyle w:val="Para"/>
-      </w:pPr>
-      <w:r>
-        <w:rPr>
-          <w:i/>
-        </w:rPr>
-        <w:t>Source 2</w:t>
-      </w:r>
-      <w:r>
-        <w:t xml:space="preserve"> is our fine-tuned two-tower encoder (Section 4). At query time the dialogue anchor is encoded once and compared to a precomputed matrix of 47,071 track embeddings (768-dim, L2-normalized). Retrieval is an exact brute-force matmul followed by a top-2000 partial sort; at this catalog size an approximate index (FAISS/HNSW) is unnecessary and would only lose recall.</w:t>
-      </w:r>
-    </w:p>
-    <w:p>
-      <w:pPr>
-        <w:pStyle w:val="Para"/>
-      </w:pPr>
-      <w:r>
-        <w:rPr>
-          <w:i/>
-        </w:rPr>
-        <w:t>Source 5</w:t>
-      </w:r>
-      <w:r>
-        <w:t xml:space="preserve"> is the competition-provided </w:t>
+        <w:t>Dense (sources 2, 5).</w:t>
+      </w:r>
+      <w:r>
+        <w:t xml:space="preserve"> Two independent dense retrievers give complementary spaces. Source 2 is our fine-tuned two-tower encoder (Section 3): the dialogue anchor is encoded once and matched against a precomputed 47,071 x 768 L2-normalized matrix by exact brute-force matmul (top-2000); at this catalog size an approximate index is unnecessary and only loses recall. Source 5 is the competition-provided </w:t>
       </w:r>
       <w:r>
         <w:rPr>
@@ -1142,57 +998,35 @@
         <w:t>Qwen3-Embedding-0.6B</w:t>
       </w:r>
       <w:r>
-        <w:t xml:space="preserve"> metadata embedding. The track side is precomputed; the query side is encoded by the frozen 0.6B model with the model's instruction prefix, then matched by exact matmul (top-500). Because it is a different pretraining distribution, it recovers gold tracks that the two-tower misses, and both cosines become ranker features.</w:t>
+        <w:t xml:space="preserve"> metadata embedding, whose different pretraining recovers gold tracks the two-tower misses; both cosines become ranker features.</w:t>
       </w:r>
     </w:p>
     <w:p>
       <w:pPr>
-        <w:pStyle w:val="Head2"/>
-      </w:pPr>
-      <w:r>
-        <w:t>3.3 Neighborhood expansion (sources 3, 7)</w:t>
-      </w:r>
-    </w:p>
-    <w:p>
-      <w:pPr>
         <w:pStyle w:val="Para"/>
       </w:pPr>
-      <w:r>
-        <w:t xml:space="preserve">Dense retrieval on the </w:t>
-      </w:r>
       <w:r>
         <w:rPr>
           <w:i/>
         </w:rPr>
-        <w:t>query</w:t>
-      </w:r>
-      <w:r>
-        <w:t xml:space="preserve"> is complemented by dense expansion around the </w:t>
-      </w:r>
+        <w:t>Neighborhood (sources 3, 7).</w:t>
+      </w:r>
+      <w:r>
+        <w:t xml:space="preserve"> Query-side retrieval is complemented by expansion around the history: the nearest neighbors of the last two played tracks (source 3) and of the mean two-tower embedding of the session's history, the taste centroid (source 7). Both are cheap matmuls against the same matrix; rejected history tracks are filtered from these seeds first (Section 3.3).</w:t>
+      </w:r>
+    </w:p>
+    <w:p>
+      <w:pPr>
+        <w:pStyle w:val="Para"/>
+      </w:pPr>
       <w:r>
         <w:rPr>
           <w:i/>
         </w:rPr>
-        <w:t>history</w:t>
-      </w:r>
-      <w:r>
-        <w:t>. Source 3 takes the last two played tracks and adds each track's 100 nearest neighbors in two-tower space. Source 7 computes the mean two-tower embedding of the session's history tracks (the session taste centroid) and adds its 100 nearest neighbors. Both are cheap matmuls against the same track matrix as source 2. When history contains user-rejected tracks these seeds are filtered first (Section 4.3).</w:t>
-      </w:r>
-    </w:p>
-    <w:p>
-      <w:pPr>
-        <w:pStyle w:val="Head2"/>
-      </w:pPr>
-      <w:r>
-        <w:t>3.4 Catalog-structure expansion (sources 4, 8, 9)</w:t>
-      </w:r>
-    </w:p>
-    <w:p>
-      <w:pPr>
-        <w:pStyle w:val="Para"/>
-      </w:pPr>
-      <w:r>
-        <w:t>These sources exploit structure in the catalog and in training sessions rather than the query text.</w:t>
+        <w:t>Catalog structure (sources 4, 8, 9).</w:t>
+      </w:r>
+      <w:r>
+        <w:t xml:space="preserve"> Artist expansion (source 4) is a dictionary lookup that adds the full, popularity-capped discography of every retrieved or mentioned artist; it is the cheapest high-recall source and matters because sessions are often artist deep-dives. Co-occurrence (source 8) is a count table of tracks that most often followed the last one/two/three history tracks in training sessions. Semantic-bucket expansion (source 9) is an optional auxiliary: an RQ-VAE assigns each track a semantic ID and a small SASRec predicts the next bucket, but next-bucket prediction has a low ceiling (hit@3 = 42.1%), so an eight-source configuration without it reaches parity.</w:t>
       </w:r>
     </w:p>
     <w:p>
@@ -1203,24 +1037,18 @@
         <w:rPr>
           <w:i/>
         </w:rPr>
-        <w:t>Artist expansion (source 4)</w:t>
-      </w:r>
-      <w:r>
-        <w:t xml:space="preserve"> is a dictionary lookup: for every artist retrieved by another source or named in the dialogue, add that artist's full discography (capped by popularity). It is the cheapest high-recall source in the system (no model), and it matters because TalkPlay sessions are frequently artist deep-dives.</w:t>
+        <w:t>Collaborative (source 6).</w:t>
+      </w:r>
+      <w:r>
+        <w:t xml:space="preserve"> A BPR matrix-factorization model adds each warm user's top-200 tracks; cold sessions simply receive nothing from this source and the pipeline degrades gracefully.</w:t>
       </w:r>
     </w:p>
     <w:p>
       <w:pPr>
-        <w:pStyle w:val="Para"/>
-      </w:pPr>
-      <w:r>
-        <w:rPr>
-          <w:i/>
-        </w:rPr>
-        <w:t>Co-occurrence (source 8)</w:t>
-      </w:r>
-      <w:r>
-        <w:t xml:space="preserve"> is a count table built from training sessions: for the last one, two, and three history tracks it adds the tracks that most often followed them (top 300/150/50). One subtlety is leakage: an early version built this table on sessions that also appeared in the ranker's training dump, which inflated the co-occurrence feature (gold tracks were hit in 81.9% of those turns versus 28.1% of clean turns) and would have collapsed on unseen data. Rebuilding the table with all 6,000 dump sessions excluded removes the leak.</w:t>
+        <w:pStyle w:val="Head1"/>
+      </w:pPr>
+      <w:r>
+        <w:t>3 Dialogue-Aware Retriever</w:t>
       </w:r>
     </w:p>
     <w:p>
@@ -1228,13 +1056,7 @@
         <w:pStyle w:val="Para"/>
       </w:pPr>
       <w:r>
-        <w:rPr>
-          <w:i/>
-        </w:rPr>
-        <w:t>Semantic-bucket expansion (source 9)</w:t>
-      </w:r>
-      <w:r>
-        <w:t xml:space="preserve"> is optional. A two-level RQ-VAE (64 codes/level) over track attribute embeddings assigns each track a semantic ID; a small SASRec model predicts the next bucket from the session's bucket sequence, and members of the top-3 predicted buckets join the pool. Because next-bucket prediction has a low ceiling (hit@3 = 42.1%), this source is a capped auxiliary only, and an eight-source configuration without it reaches parity.</w:t>
+        <w:t>Off-the-shelf dense retrieval failed here: conversational queries do not embed near track-metadata text in general-purpose spaces, so dense recall requires fine-tuning on (dialogue, gold-track) pairs.</w:t>
       </w:r>
     </w:p>
     <w:p>
@@ -1242,39 +1064,7 @@
         <w:pStyle w:val="Head2"/>
       </w:pPr>
       <w:r>
-        <w:t>3.5 Collaborative signal (source 6)</w:t>
-      </w:r>
-    </w:p>
-    <w:p>
-      <w:pPr>
-        <w:pStyle w:val="Para"/>
-      </w:pPr>
-      <w:r>
-        <w:t>Source 6 is a Bayesian Personalized Ranking (BPR-MF) model over user-track interactions, restricted to warm users; it adds each user's top-200 tracks. Cold sessions simply receive no candidates from this source and the pipeline degrades gracefully.</w:t>
-      </w:r>
-    </w:p>
-    <w:p>
-      <w:pPr>
-        <w:pStyle w:val="Head1"/>
-      </w:pPr>
-      <w:r>
-        <w:t>4 Dialogue-Aware Retriever: A LoRA-Adapted E5 Encoder</w:t>
-      </w:r>
-    </w:p>
-    <w:p>
-      <w:pPr>
-        <w:pStyle w:val="Para"/>
-      </w:pPr>
-      <w:r>
-        <w:t>Off-the-shelf dense retrieval failed on this task: conversational queries do not embed near track-metadata text in general-purpose spaces. Dense retrieval here requires fine-tuning on (dialogue, gold-track) pairs. The remaining problem is context length and label quality.</w:t>
-      </w:r>
-    </w:p>
-    <w:p>
-      <w:pPr>
-        <w:pStyle w:val="Head2"/>
-      </w:pPr>
-      <w:r>
-        <w:t>4.1 Model and anchor construction</w:t>
+        <w:t>3.1 Model and anchor</w:t>
       </w:r>
     </w:p>
     <w:p>
@@ -1291,15 +1081,7 @@
         <w:t>intfloat/multilingual-e5-base</w:t>
       </w:r>
       <w:r>
-        <w:t xml:space="preserve"> (XLM-RoBERTa, 12 layers, 768-dim, 512-token window, 279M parameters), chosen for its 512-token context (an earlier 256-token model truncated the user's request on 81% of anchors). We fine-tune with LoRA (rank 32, alpha 64, dropout 0.05) on the query/key/value projections: 1.8M trainable parameters, 0.64% of the model. Full fine-tuning does not fit in 16 GB of unified memory; LoRA plus gradient checkpointing does.</w:t>
-      </w:r>
-    </w:p>
-    <w:p>
-      <w:pPr>
-        <w:pStyle w:val="Para"/>
-      </w:pPr>
-      <w:r>
-        <w:t xml:space="preserve">The query anchor is </w:t>
+        <w:t xml:space="preserve"> (XLM-RoBERTa, 768-dim, 512-token window, 279M parameters), chosen for its context length (an earlier 256-token model truncated the user's request on 81% of anchors). We fine-tune with LoRA (rank 32, alpha 64) on the query/key/value projections: 1.8M trainable parameters, 0.64% of the model; full fine-tuning does not fit in 16 GB, LoRA plus gradient checkpointing does. The query anchor is </w:t>
       </w:r>
       <w:r>
         <w:rPr>
@@ -1308,7 +1090,7 @@
         <w:t>role-tagged</w:t>
       </w:r>
       <w:r>
-        <w:t xml:space="preserve"> so the encoder sees explicit dialogue structure:</w:t>
+        <w:t xml:space="preserve"> so the encoder sees dialogue structure:</w:t>
       </w:r>
     </w:p>
     <w:p>
@@ -1320,7 +1102,7 @@
           <w:rFonts w:ascii="Courier New" w:hAnsi="Courier New"/>
           <w:sz w:val="18"/>
         </w:rPr>
-        <w:t>query: [PROFILE] {age} . {country} . {gender} . {culture} . {language}</w:t>
+        <w:t>query: [PROFILE] {age}.{country}.{gender}.{culture} [GOAL] {goal}</w:t>
       </w:r>
     </w:p>
     <w:p>
@@ -1332,7 +1114,7 @@
           <w:rFonts w:ascii="Courier New" w:hAnsi="Courier New"/>
           <w:sz w:val="18"/>
         </w:rPr>
-        <w:t>[GOAL] {listener_goal} ({specificity})</w:t>
+        <w:t>[T1] USER:{q1} | REC:{track-artist} | ASST:{r1} | REACTION:liked/rejected</w:t>
       </w:r>
     </w:p>
     <w:p>
@@ -1344,39 +1126,15 @@
           <w:rFonts w:ascii="Courier New" w:hAnsi="Courier New"/>
           <w:sz w:val="18"/>
         </w:rPr>
-        <w:t>[T1] USER: {q1} | REC: {track - artist} | ASST: {r1} | REACTION: liked/rejected</w:t>
+        <w:t>... [NOW] USER:{current request}</w:t>
       </w:r>
     </w:p>
     <w:p>
       <w:pPr>
-        <w:pStyle w:val="programCodedisplay"/>
-      </w:pPr>
-      <w:r>
-        <w:rPr>
-          <w:rFonts w:ascii="Courier New" w:hAnsi="Courier New"/>
-          <w:sz w:val="18"/>
-        </w:rPr>
-        <w:t>...</w:t>
-      </w:r>
-    </w:p>
-    <w:p>
-      <w:pPr>
-        <w:pStyle w:val="programCodedisplay"/>
-      </w:pPr>
-      <w:r>
-        <w:rPr>
-          <w:rFonts w:ascii="Courier New" w:hAnsi="Courier New"/>
-          <w:sz w:val="18"/>
-        </w:rPr>
-        <w:t>[NOW] USER: {current request}</w:t>
-      </w:r>
-    </w:p>
-    <w:p>
-      <w:pPr>
         <w:pStyle w:val="Para"/>
       </w:pPr>
       <w:r>
-        <w:t xml:space="preserve">A tokenizer-aware greedy builder always includes a fixed core (profile, goal, latest request) and then inserts history turns most-recent-first, each only if it fits a 510-token budget, with per-turn fallbacks (full -&gt; short -&gt; minimal). The user's current request can never be truncated; only ~5% of anchors reach the budget. Documents use the symmetric form </w:t>
+        <w:t xml:space="preserve">A tokenizer-aware greedy builder always keeps a fixed core (profile, goal, latest request) and inserts history turns most-recent-first within a 510-token budget; the current request can never be truncated. Documents use the symmetric form </w:t>
       </w:r>
       <w:r>
         <w:rPr>
@@ -1385,7 +1143,7 @@
         <w:t>passage: {name} by {artist} | Album: {album} | Tags: {tags} | {year}</w:t>
       </w:r>
       <w:r>
-        <w:t xml:space="preserve">. The </w:t>
+        <w:t xml:space="preserve">, with the E5 </w:t>
       </w:r>
       <w:r>
         <w:rPr>
@@ -1403,7 +1161,7 @@
         <w:t>passage:</w:t>
       </w:r>
       <w:r>
-        <w:t xml:space="preserve"> prefixes match E5 pretraining and must be identical across training, index build, and inference.</w:t>
+        <w:t xml:space="preserve"> prefixes identical across training, index build, and inference.</w:t>
       </w:r>
     </w:p>
     <w:p>
@@ -1411,7 +1169,7 @@
         <w:pStyle w:val="Head2"/>
       </w:pPr>
       <w:r>
-        <w:t>4.2 Training and use</w:t>
+        <w:t>3.2 Training and serving</w:t>
       </w:r>
     </w:p>
     <w:p>
@@ -1419,40 +1177,23 @@
         <w:pStyle w:val="Para"/>
       </w:pPr>
       <w:r>
-        <w:t>We train with MultipleNegativesRankingLoss (InfoNCE with in-batch negatives) plus two to three explicit hard negatives per row (Section 4.3), for 3 epochs at effective batch 32 (batch 8, gradient accumulation 4), learning rate 1e-4, 200 warmup steps, with gradient checkpointing. Training data is ~74K anchor/positive pairs drawn from the 15,199 training sessions, excluding the 6,000 sessions reserved for the ranker's feature dump.</w:t>
+        <w:t>We train with MultipleNegativesRankingLoss (InfoNCE with in-batch negatives) plus two to three explicit hard negatives per row (Section 3.3): 3 epochs, effective batch 32, learning rate 1e-4. Training uses ~74K anchor/positive pairs, excluding the 6,000 sessions reserved for the ranker's feature dump. At serving time we ship a 7 MB LoRA adapter applied to the cached base encoder, and query a one-pass 47,071 x 768 track index by brute-force matmul.</w:t>
       </w:r>
     </w:p>
     <w:p>
       <w:pPr>
-        <w:pStyle w:val="Para"/>
-      </w:pPr>
-      <w:r>
-        <w:t xml:space="preserve">At serving time we ship the LoRA adapter (a 7 MB </w:t>
-      </w:r>
-      <w:r>
-        <w:rPr>
-          <w:rFonts w:ascii="Courier New" w:hAnsi="Courier New"/>
-        </w:rPr>
-        <w:t>safetensors</w:t>
-      </w:r>
-      <w:r>
-        <w:t xml:space="preserve"> file, 24 MB with its tokenizer) and apply it to the base encoder loaded from cache; the adapter can optionally be merged into a standalone encoder. The track index is one forward pass over the catalog, stored as a 47,071 x 768 float32 matrix (146.5 MB) and queried by brute-force matmul.</w:t>
+        <w:pStyle w:val="Head2"/>
+      </w:pPr>
+      <w:r>
+        <w:t>3.3 Using the goal-progress feedback signal</w:t>
       </w:r>
     </w:p>
     <w:p>
       <w:pPr>
-        <w:pStyle w:val="Head2"/>
-      </w:pPr>
-      <w:r>
-        <w:t>4.3 Using the goal-progress feedback signal</w:t>
-      </w:r>
-    </w:p>
-    <w:p>
-      <w:pPr>
         <w:pStyle w:val="Para"/>
       </w:pPr>
       <w:r>
-        <w:t xml:space="preserve">Each turn in the training data carries a </w:t>
+        <w:t xml:space="preserve">Each training turn carries a </w:t>
       </w:r>
       <w:r>
         <w:rPr>
@@ -1461,7 +1202,16 @@
         <w:t>goal_progress_assessment</w:t>
       </w:r>
       <w:r>
-        <w:t xml:space="preserve"> (GPA): a label recording whether the previous recommendation moved the listener toward their goal. In effect it is a per-recommendation accept/reject signal, and it is the richest preference feedback the dataset offers. It is also the trickiest part of the system, for two reasons: the raw label cannot be used as-is, and it is removed entirely from the blind test set. We handle these in turn.</w:t>
+        <w:t xml:space="preserve"> (GPA): a label recording whether the </w:t>
+      </w:r>
+      <w:r>
+        <w:rPr>
+          <w:i/>
+        </w:rPr>
+        <w:t>previous</w:t>
+      </w:r>
+      <w:r>
+        <w:t xml:space="preserve"> recommendation moved the listener toward their goal, i.e. a per-recommendation accept/reject signal. It is the richest preference feedback in the dataset and the trickiest part of the system, because the raw label cannot be used as-is and it is removed entirely from the blind set.</w:t>
       </w:r>
     </w:p>
     <w:p>
@@ -1472,10 +1222,10 @@
         <w:rPr>
           <w:b/>
         </w:rPr>
-        <w:t>First, align the label in time.</w:t>
-      </w:r>
-      <w:r>
-        <w:t xml:space="preserve"> The GPA recorded at turn </w:t>
+        <w:t>First, align it in time.</w:t>
+      </w:r>
+      <w:r>
+        <w:t xml:space="preserve"> The GPA at turn </w:t>
       </w:r>
       <w:r>
         <w:rPr>
@@ -1484,7 +1234,7 @@
         <w:t>T</w:t>
       </w:r>
       <w:r>
-        <w:t xml:space="preserve"> is the user's reaction to the track recommended at turn </w:t>
+        <w:t xml:space="preserve"> is the reaction to the track recommended at turn </w:t>
       </w:r>
       <w:r>
         <w:rPr>
@@ -1493,7 +1243,7 @@
         <w:t>T-1</w:t>
       </w:r>
       <w:r>
-        <w:t xml:space="preserve">: the system acts at one turn and the user responds at the next. A naive reading attaches each reaction to the wrong track. We therefore shift every GPA back by one turn (indexing </w:t>
+        <w:t>: the system acts at one turn and the user responds at the next. A naive reading attaches each reaction to the wrong track, so we shift every GPA back one turn (</w:t>
       </w:r>
       <w:r>
         <w:rPr>
@@ -1502,7 +1252,7 @@
         <w:t>turn_number - 1</w:t>
       </w:r>
       <w:r>
-        <w:t>) so that each track is paired with the reaction it actually caused. This one-line alignment is a prerequisite for everything below.</w:t>
+        <w:t>). This alignment is a prerequisite for everything below.</w:t>
       </w:r>
     </w:p>
     <w:p>
@@ -1513,10 +1263,10 @@
         <w:rPr>
           <w:b/>
         </w:rPr>
-        <w:t>Second, stop training on rejected tracks as if they were positives.</w:t>
-      </w:r>
-      <w:r>
-        <w:t xml:space="preserve"> After alignment, 43.2% of turns turn out to carry a gold track that the user </w:t>
+        <w:t>Second, stop treating rejected tracks as positives.</w:t>
+      </w:r>
+      <w:r>
+        <w:t xml:space="preserve"> After alignment, 43.2% of turns carry a gold track the user </w:t>
       </w:r>
       <w:r>
         <w:rPr>
@@ -1534,35 +1284,16 @@
         <w:t>DOES_NOT_MOVE_TOWARD_GOAL</w:t>
       </w:r>
       <w:r>
-        <w:t>): the logged system played it, and the listener said it missed. Treating these as positive examples teaches both models to rank rejected tracks highly. We use them differently in each model:</w:t>
-      </w:r>
-    </w:p>
-    <w:p>
-      <w:pPr>
-        <w:pStyle w:val="ListParagraph"/>
-      </w:pPr>
+        <w:t xml:space="preserve">). Training these as positives teaches both models to rank rejected tracks highly. We use them differently: the ranker </w:t>
+      </w:r>
       <w:r>
         <w:rPr>
           <w:i/>
         </w:rPr>
-        <w:t>Ranker:</w:t>
-      </w:r>
-      <w:r>
-        <w:t xml:space="preserve"> we drop these turns from training. A rejected track is not a valid positive, and the turn provides no usable positive label.</w:t>
-      </w:r>
-    </w:p>
-    <w:p>
-      <w:pPr>
-        <w:pStyle w:val="ListParagraph"/>
-      </w:pPr>
-      <w:r>
-        <w:rPr>
-          <w:i/>
-        </w:rPr>
-        <w:t>Retriever:</w:t>
-      </w:r>
-      <w:r>
-        <w:t xml:space="preserve"> we drop the rejected track from the positive pairs, but keep it as a </w:t>
+        <w:t>drops</w:t>
+      </w:r>
+      <w:r>
+        <w:t xml:space="preserve"> such turns (a rejected track is not a valid positive), while the retriever keeps the rejected track as a </w:t>
       </w:r>
       <w:r>
         <w:rPr>
@@ -1571,7 +1302,21 @@
         <w:t>hard negative</w:t>
       </w:r>
       <w:r>
-        <w:t xml:space="preserve"> for that session. It shares the same intent context as the request yet was explicitly refused, so it is exactly the kind of near-miss the encoder should learn to push away. Per anchor we prioritize confirmed session rejections, then BM25 near-misses, then same-artist distractors, then ordinary in-batch negatives, and we never sample a track the user </w:t>
+        <w:t xml:space="preserve"> for that session, exactly the near-miss the encoder should learn to push away. We prioritize confirmed session rejections, then BM25 near-misses, then same-artist distractors, then in-batch negatives, and never sample an accepted track as a negative.</w:t>
+      </w:r>
+    </w:p>
+    <w:p>
+      <w:pPr>
+        <w:pStyle w:val="Para"/>
+      </w:pPr>
+      <w:r>
+        <w:rPr>
+          <w:b/>
+        </w:rPr>
+        <w:t>Third, act on the feedback at inference.</w:t>
+      </w:r>
+      <w:r>
+        <w:t xml:space="preserve"> The aligned GPA drives three behaviors: the history-based retrievers (sources 3, 7 and the BM25 query) are seeded only from </w:t>
       </w:r>
       <w:r>
         <w:rPr>
@@ -1580,7 +1325,7 @@
         <w:t>accepted</w:t>
       </w:r>
       <w:r>
-        <w:t xml:space="preserve"> as a negative.</w:t>
+        <w:t xml:space="preserve"> tracks, so a streak of rejections does not fill the pool with neighbors of refused tracks; the ranker receives features contrasting a candidate against the accepted- and rejected-history centroids (Section 4); and the anchor's goal slot is replaced by the most recently accepted track ("more like the last thing that worked").</w:t>
       </w:r>
     </w:p>
     <w:p>
@@ -1591,75 +1336,10 @@
         <w:rPr>
           <w:b/>
         </w:rPr>
-        <w:t>Third, act on the feedback at inference, not just in training.</w:t>
-      </w:r>
-      <w:r>
-        <w:t xml:space="preserve"> Knowing which past tracks were accepted or rejected changes what the system should retrieve and how it should rank. We use the aligned GPA three ways at inference:</w:t>
-      </w:r>
-    </w:p>
-    <w:p>
-      <w:pPr>
-        <w:pStyle w:val="ListParagraph"/>
-      </w:pPr>
-      <w:r>
-        <w:rPr>
-          <w:i/>
-        </w:rPr>
-        <w:t>Seed filtering:</w:t>
-      </w:r>
-      <w:r>
-        <w:t xml:space="preserve"> the history-based retrievers (last-track NN, session-mean NN, and the BM25 query) are seeded only from </w:t>
-      </w:r>
-      <w:r>
-        <w:rPr>
-          <w:i/>
-        </w:rPr>
-        <w:t>accepted</w:t>
-      </w:r>
-      <w:r>
-        <w:t xml:space="preserve"> history tracks, so a streak of rejections does not fill the pool with neighbors of tracks the user just refused.</w:t>
-      </w:r>
-    </w:p>
-    <w:p>
-      <w:pPr>
-        <w:pStyle w:val="ListParagraph"/>
-      </w:pPr>
-      <w:r>
-        <w:rPr>
-          <w:i/>
-        </w:rPr>
-        <w:t>Session-state features:</w:t>
-      </w:r>
-      <w:r>
-        <w:t xml:space="preserve"> the ranker receives features summarizing the accepted versus rejected history (Section 5, group D), such as a candidate's similarity to the accepted-history centroid versus the rejected-history centroid.</w:t>
-      </w:r>
-    </w:p>
-    <w:p>
-      <w:pPr>
-        <w:pStyle w:val="ListParagraph"/>
-      </w:pPr>
-      <w:r>
-        <w:rPr>
-          <w:i/>
-        </w:rPr>
-        <w:t>Goal substitution:</w:t>
-      </w:r>
-      <w:r>
-        <w:t xml:space="preserve"> the anchor's goal slot is replaced by the most recently accepted track, expressing "more like the last thing that worked."</w:t>
-      </w:r>
-    </w:p>
-    <w:p>
-      <w:pPr>
-        <w:pStyle w:val="Para"/>
-      </w:pPr>
-      <w:r>
-        <w:rPr>
-          <w:b/>
-        </w:rPr>
-        <w:t>Finally, reconstruct the signal when it is missing.</w:t>
-      </w:r>
-      <w:r>
-        <w:t xml:space="preserve"> The blind test set removes GPA, so at test time we infer it from the dialogue itself. A lightweight rule-based classifier reads each user follow-up and labels it accept or reject using two small keyword banks (accept: "love it", "perfect", "more like this"; reject: "not what", "something different", "too slow"). The inferred label fills the anchor's </w:t>
+        <w:t>Finally, reconstruct it when missing.</w:t>
+      </w:r>
+      <w:r>
+        <w:t xml:space="preserve"> The blind set removes GPA, so we infer it from the dialogue: a rule-based classifier labels each user follow-up accept or reject from keyword banks (accept: "love it", "more like this"; reject: "not what", "something different"). The inferred label fills the anchor's </w:t>
       </w:r>
       <w:r>
         <w:rPr>
@@ -1668,7 +1348,7 @@
         <w:t>REACTION</w:t>
       </w:r>
       <w:r>
-        <w:t xml:space="preserve"> slot and drives the same seed filtering and session-state features described above. This proxy is noisier than the true label, but on the blind-simulated holdout the system scores as well with the inferred signal as with the real one, which is what makes the approach viable on the blind set.</w:t>
+        <w:t xml:space="preserve"> slot and drives the same seed filtering and features. On the blind-simulated holdout the system scores as well with this proxy as with the true label, which is what makes it viable.</w:t>
       </w:r>
     </w:p>
     <w:p>
@@ -1676,7 +1356,7 @@
         <w:pStyle w:val="Head1"/>
       </w:pPr>
       <w:r>
-        <w:t>5 Learning-to-Rank Rescoring</w:t>
+        <w:t>4 Learning-to-Rank Rescoring</w:t>
       </w:r>
     </w:p>
     <w:p>
@@ -1684,16 +1364,7 @@
         <w:pStyle w:val="Para"/>
       </w:pPr>
       <w:r>
-        <w:t>The rescorer is a LightGBM LambdaMART model (</w:t>
-      </w:r>
-      <w:r>
-        <w:rPr>
-          <w:rFonts w:ascii="Courier New" w:hAnsi="Courier New"/>
-        </w:rPr>
-        <w:t>lambdarank</w:t>
-      </w:r>
-      <w:r>
-        <w:t xml:space="preserve"> objective, nDCG@20) that scores every pooled candidate and returns the top 20. It replaces hand-tuned linear fusion and is the pivotal architectural choice: it </w:t>
+        <w:t xml:space="preserve">The rescorer is a LightGBM LambdaMART model (nDCG@20 objective) that scores every pooled candidate and returns the top 20. It replaces hand-tuned linear fusion and is the pivotal choice: it </w:t>
       </w:r>
       <w:r>
         <w:rPr>
@@ -1702,505 +1373,15 @@
         <w:t>decouples recall from precision</w:t>
       </w:r>
       <w:r>
-        <w:t>, absorbs heterogeneous feature types (cosines, reciprocal ranks, count tables, metadata, session counters), and handles extreme class imbalance natively (one positive per ~3,100 candidates) because LambdaMART forms pairwise gradients within each turn's group.</w:t>
+        <w:t>, absorbs heterogeneous features (cosines, ranks, count tables, metadata, session counters), and handles extreme imbalance natively (one positive per ~3,100 candidates) via pairwise gradients within each turn's group. Training runs the full retrieval in dump mode on 6,000 held-out sessions, yielding 24,718 groups and 77.7M rows (positive rate 0.00035); the model has 67 features (5-fold session CV nDCG@20 = 0.3144) and is a 0.6 MB file. The features fall into six groups (Table 2). Group B dominates: multi-source agreement accounts for roughly 57% of total model gain and is the feature that transfers best when goal and GPA are withheld on the blind set.</w:t>
       </w:r>
     </w:p>
     <w:p>
       <w:pPr>
-        <w:pStyle w:val="Para"/>
-      </w:pPr>
-      <w:r>
-        <w:rPr>
-          <w:b/>
-        </w:rPr>
-        <w:t>Training data.</w:t>
-      </w:r>
-      <w:r>
-        <w:t xml:space="preserve"> The full nine-source retrieval is run in dump mode on 6,000 held-out training sessions, writing one row per (turn, candidate): 24,718 groups, 77.7M rows, positive rate 0.00035. Splits are at the session level, and the same 6,000 sessions are excluded from two-tower training and the co-occurrence table.</w:t>
-      </w:r>
-    </w:p>
-    <w:p>
-      <w:pPr>
-        <w:pStyle w:val="Para"/>
-      </w:pPr>
-      <w:r>
-        <w:rPr>
-          <w:b/>
-        </w:rPr>
-        <w:t>Hyperparameters.</w:t>
-      </w:r>
-      <w:r>
-        <w:t xml:space="preserve"> 31 leaves, learning rate 0.08, L2 0.1, minimum sum Hessian 0.1, path smoothing 1.0, feature and bagging fraction 0.8, truncation level 30, 5-fold session-level cross-validation with early stopping (75 rounds). The production model has 67 features (cross-validated nDCG@20 = 0.3144) and is a 0.6 MB text file.</w:t>
-      </w:r>
-    </w:p>
-    <w:p>
-      <w:pPr>
-        <w:pStyle w:val="Para"/>
-      </w:pPr>
-      <w:r>
-        <w:t>The 67 features fall into six groups (Table 2).</w:t>
-      </w:r>
-    </w:p>
-    <w:p>
-      <w:pPr>
         <w:pStyle w:val="TableCaption"/>
       </w:pPr>
       <w:r>
-        <w:t>Table 2: Rescorer feature groups.</w:t>
-      </w:r>
-    </w:p>
-    <w:tbl>
-      <w:tblPr>
-        <w:tblStyle w:val="TableGrid"/>
-        <w:tblW w:type="auto" w:w="0"/>
-        <w:tblLook w:firstColumn="1" w:firstRow="1" w:lastColumn="0" w:lastRow="0" w:noHBand="0" w:noVBand="1" w:val="04A0"/>
-      </w:tblPr>
-      <w:tblGrid>
-        <w:gridCol w:w="3360"/>
-        <w:gridCol w:w="3360"/>
-        <w:gridCol w:w="3360"/>
-      </w:tblGrid>
-      <w:tr>
-        <w:tc>
-          <w:tcPr>
-            <w:tcW w:type="dxa" w:w="3360"/>
-          </w:tcPr>
-          <w:p>
-            <w:r/>
-            <w:r>
-              <w:rPr>
-                <w:b/>
-                <w:sz w:val="18"/>
-              </w:rPr>
-              <w:t>Group</w:t>
-            </w:r>
-          </w:p>
-        </w:tc>
-        <w:tc>
-          <w:tcPr>
-            <w:tcW w:type="dxa" w:w="3360"/>
-          </w:tcPr>
-          <w:p>
-            <w:r/>
-            <w:r>
-              <w:rPr>
-                <w:b/>
-                <w:sz w:val="18"/>
-              </w:rPr>
-              <w:t>Features</w:t>
-            </w:r>
-          </w:p>
-        </w:tc>
-        <w:tc>
-          <w:tcPr>
-            <w:tcW w:type="dxa" w:w="3360"/>
-          </w:tcPr>
-          <w:p>
-            <w:r/>
-            <w:r>
-              <w:rPr>
-                <w:b/>
-                <w:sz w:val="18"/>
-              </w:rPr>
-              <w:t>Construction</w:t>
-            </w:r>
-          </w:p>
-        </w:tc>
-      </w:tr>
-      <w:tr>
-        <w:tc>
-          <w:tcPr>
-            <w:tcW w:type="dxa" w:w="3360"/>
-          </w:tcPr>
-          <w:p>
-            <w:r>
-              <w:rPr>
-                <w:sz w:val="18"/>
-              </w:rPr>
-            </w:r>
-            <w:r>
-              <w:rPr>
-                <w:sz w:val="18"/>
-              </w:rPr>
-              <w:t>A. Retrieval scores</w:t>
-            </w:r>
-          </w:p>
-        </w:tc>
-        <w:tc>
-          <w:tcPr>
-            <w:tcW w:type="dxa" w:w="3360"/>
-          </w:tcPr>
-          <w:p>
-            <w:r>
-              <w:rPr>
-                <w:sz w:val="18"/>
-              </w:rPr>
-            </w:r>
-            <w:r>
-              <w:rPr>
-                <w:sz w:val="18"/>
-              </w:rPr>
-              <w:t>two-tower cosine and a rank sigmoid; Qwen3 metadata and lyrics cosines; CLAP audio cosine; CF cosine; BM25 reciprocal rank; co-occurrence rank signal</w:t>
-            </w:r>
-          </w:p>
-        </w:tc>
-        <w:tc>
-          <w:tcPr>
-            <w:tcW w:type="dxa" w:w="3360"/>
-          </w:tcPr>
-          <w:p>
-            <w:r>
-              <w:rPr>
-                <w:sz w:val="18"/>
-              </w:rPr>
-            </w:r>
-            <w:r>
-              <w:rPr>
-                <w:sz w:val="18"/>
-              </w:rPr>
-              <w:t>the raw per-source votes, read directly from each retriever's output for the candidate</w:t>
-            </w:r>
-          </w:p>
-        </w:tc>
-      </w:tr>
-      <w:tr>
-        <w:tc>
-          <w:tcPr>
-            <w:tcW w:type="dxa" w:w="3360"/>
-          </w:tcPr>
-          <w:p>
-            <w:r>
-              <w:rPr>
-                <w:sz w:val="18"/>
-              </w:rPr>
-            </w:r>
-            <w:r>
-              <w:rPr>
-                <w:sz w:val="18"/>
-              </w:rPr>
-              <w:t>B. Multi-source agreement</w:t>
-            </w:r>
-          </w:p>
-        </w:tc>
-        <w:tc>
-          <w:tcPr>
-            <w:tcW w:type="dxa" w:w="3360"/>
-          </w:tcPr>
-          <w:p>
-            <w:r>
-              <w:rPr>
-                <w:sz w:val="18"/>
-              </w:rPr>
-            </w:r>
-            <w:r>
-              <w:rPr>
-                <w:rFonts w:ascii="Courier New" w:hAnsi="Courier New"/>
-                <w:sz w:val="18"/>
-              </w:rPr>
-              <w:t>n_sources</w:t>
-            </w:r>
-            <w:r>
-              <w:rPr>
-                <w:sz w:val="18"/>
-              </w:rPr>
-              <w:t xml:space="preserve">, </w:t>
-            </w:r>
-            <w:r>
-              <w:rPr>
-                <w:rFonts w:ascii="Courier New" w:hAnsi="Courier New"/>
-                <w:sz w:val="18"/>
-              </w:rPr>
-              <w:t>log1p(n_sources)</w:t>
-            </w:r>
-            <w:r>
-              <w:rPr>
-                <w:sz w:val="18"/>
-              </w:rPr>
-              <w:t xml:space="preserve">, </w:t>
-            </w:r>
-            <w:r>
-              <w:rPr>
-                <w:rFonts w:ascii="Courier New" w:hAnsi="Courier New"/>
-                <w:sz w:val="18"/>
-              </w:rPr>
-              <w:t>n_sources/7</w:t>
-            </w:r>
-          </w:p>
-        </w:tc>
-        <w:tc>
-          <w:tcPr>
-            <w:tcW w:type="dxa" w:w="3360"/>
-          </w:tcPr>
-          <w:p>
-            <w:r>
-              <w:rPr>
-                <w:sz w:val="18"/>
-              </w:rPr>
-            </w:r>
-            <w:r>
-              <w:rPr>
-                <w:sz w:val="18"/>
-              </w:rPr>
-              <w:t>count of independent sources that returned the candidate; a de-facto ensemble vote</w:t>
-            </w:r>
-          </w:p>
-        </w:tc>
-      </w:tr>
-      <w:tr>
-        <w:tc>
-          <w:tcPr>
-            <w:tcW w:type="dxa" w:w="3360"/>
-          </w:tcPr>
-          <w:p>
-            <w:r>
-              <w:rPr>
-                <w:sz w:val="18"/>
-              </w:rPr>
-            </w:r>
-            <w:r>
-              <w:rPr>
-                <w:sz w:val="18"/>
-              </w:rPr>
-              <w:t>C. Track metadata</w:t>
-            </w:r>
-          </w:p>
-        </w:tc>
-        <w:tc>
-          <w:tcPr>
-            <w:tcW w:type="dxa" w:w="3360"/>
-          </w:tcPr>
-          <w:p>
-            <w:r>
-              <w:rPr>
-                <w:sz w:val="18"/>
-              </w:rPr>
-            </w:r>
-            <w:r>
-              <w:rPr>
-                <w:sz w:val="18"/>
-              </w:rPr>
-              <w:t>popularity percentile; years since release; tag overlap with the request</w:t>
-            </w:r>
-          </w:p>
-        </w:tc>
-        <w:tc>
-          <w:tcPr>
-            <w:tcW w:type="dxa" w:w="3360"/>
-          </w:tcPr>
-          <w:p>
-            <w:r>
-              <w:rPr>
-                <w:sz w:val="18"/>
-              </w:rPr>
-            </w:r>
-            <w:r>
-              <w:rPr>
-                <w:sz w:val="18"/>
-              </w:rPr>
-              <w:t>from static catalog metadata and a set intersection of request tokens with track tags</w:t>
-            </w:r>
-          </w:p>
-        </w:tc>
-      </w:tr>
-      <w:tr>
-        <w:tc>
-          <w:tcPr>
-            <w:tcW w:type="dxa" w:w="3360"/>
-          </w:tcPr>
-          <w:p>
-            <w:r>
-              <w:rPr>
-                <w:sz w:val="18"/>
-              </w:rPr>
-            </w:r>
-            <w:r>
-              <w:rPr>
-                <w:sz w:val="18"/>
-              </w:rPr>
-              <w:t>D. Session state (from GPA/H2)</w:t>
-            </w:r>
-          </w:p>
-        </w:tc>
-        <w:tc>
-          <w:tcPr>
-            <w:tcW w:type="dxa" w:w="3360"/>
-          </w:tcPr>
-          <w:p>
-            <w:r>
-              <w:rPr>
-                <w:sz w:val="18"/>
-              </w:rPr>
-            </w:r>
-            <w:r>
-              <w:rPr>
-                <w:sz w:val="18"/>
-              </w:rPr>
-              <w:t>cosine to the mean embedding of accepted history; cosine to the mean embedding of rejected history; artist-in-rejected-set flag; counts of accepted and rejected turns; consecutive-rejection counter; CF distance to last and mean history</w:t>
-            </w:r>
-          </w:p>
-        </w:tc>
-        <w:tc>
-          <w:tcPr>
-            <w:tcW w:type="dxa" w:w="3360"/>
-          </w:tcPr>
-          <w:p>
-            <w:r>
-              <w:rPr>
-                <w:sz w:val="18"/>
-              </w:rPr>
-            </w:r>
-            <w:r>
-              <w:rPr>
-                <w:sz w:val="18"/>
-              </w:rPr>
-              <w:t>computed per candidate against the accepted/rejected partitions of the session history</w:t>
-            </w:r>
-          </w:p>
-        </w:tc>
-      </w:tr>
-      <w:tr>
-        <w:tc>
-          <w:tcPr>
-            <w:tcW w:type="dxa" w:w="3360"/>
-          </w:tcPr>
-          <w:p>
-            <w:r>
-              <w:rPr>
-                <w:sz w:val="18"/>
-              </w:rPr>
-            </w:r>
-            <w:r>
-              <w:rPr>
-                <w:sz w:val="18"/>
-              </w:rPr>
-              <w:t>E. Intent extraction (Tier 1)</w:t>
-            </w:r>
-          </w:p>
-        </w:tc>
-        <w:tc>
-          <w:tcPr>
-            <w:tcW w:type="dxa" w:w="3360"/>
-          </w:tcPr>
-          <w:p>
-            <w:r>
-              <w:rPr>
-                <w:sz w:val="18"/>
-              </w:rPr>
-            </w:r>
-            <w:r>
-              <w:rPr>
-                <w:sz w:val="18"/>
-              </w:rPr>
-              <w:t>era/genre/mood/instrument keywords parsed from the request; candidate era and genre match; album continuity (same album as last track, album seen in recent window); within-artist popularity and transition ranks; semantic-bucket match counts</w:t>
-            </w:r>
-          </w:p>
-        </w:tc>
-        <w:tc>
-          <w:tcPr>
-            <w:tcW w:type="dxa" w:w="3360"/>
-          </w:tcPr>
-          <w:p>
-            <w:r>
-              <w:rPr>
-                <w:sz w:val="18"/>
-              </w:rPr>
-            </w:r>
-            <w:r>
-              <w:rPr>
-                <w:sz w:val="18"/>
-              </w:rPr>
-              <w:t>keyword extraction over the request text matched against candidate tags and release year, plus per-artist ranking statistics</w:t>
-            </w:r>
-          </w:p>
-        </w:tc>
-      </w:tr>
-      <w:tr>
-        <w:tc>
-          <w:tcPr>
-            <w:tcW w:type="dxa" w:w="3360"/>
-          </w:tcPr>
-          <w:p>
-            <w:r>
-              <w:rPr>
-                <w:sz w:val="18"/>
-              </w:rPr>
-            </w:r>
-            <w:r>
-              <w:rPr>
-                <w:sz w:val="18"/>
-              </w:rPr>
-              <w:t>F. Sequential-ID (optional)</w:t>
-            </w:r>
-          </w:p>
-        </w:tc>
-        <w:tc>
-          <w:tcPr>
-            <w:tcW w:type="dxa" w:w="3360"/>
-          </w:tcPr>
-          <w:p>
-            <w:r>
-              <w:rPr>
-                <w:sz w:val="18"/>
-              </w:rPr>
-            </w:r>
-            <w:r>
-              <w:rPr>
-                <w:sz w:val="18"/>
-              </w:rPr>
-              <w:t>SASRec bucket-origin and bucket-rank features</w:t>
-            </w:r>
-          </w:p>
-        </w:tc>
-        <w:tc>
-          <w:tcPr>
-            <w:tcW w:type="dxa" w:w="3360"/>
-          </w:tcPr>
-          <w:p>
-            <w:r>
-              <w:rPr>
-                <w:sz w:val="18"/>
-              </w:rPr>
-            </w:r>
-            <w:r>
-              <w:rPr>
-                <w:sz w:val="18"/>
-              </w:rPr>
-              <w:t>present only in the nine-source configuration</w:t>
-            </w:r>
-          </w:p>
-        </w:tc>
-      </w:tr>
-    </w:tbl>
-    <w:p>
-      <w:pPr>
-        <w:pStyle w:val="Para"/>
-      </w:pPr>
-      <w:r>
-        <w:t>Group B is by far the most important: multi-source agreement accounts for roughly 57% of total model gain. It is also the feature that transfers best across distributions, which is why the system is robust when goal and GPA are withheld on the blind set.</w:t>
-      </w:r>
-    </w:p>
-    <w:p>
-      <w:pPr>
-        <w:pStyle w:val="Head1"/>
-      </w:pPr>
-      <w:r>
-        <w:t>6 Iterative Improvements</w:t>
-      </w:r>
-    </w:p>
-    <w:p>
-      <w:pPr>
-        <w:pStyle w:val="Para"/>
-      </w:pPr>
-      <w:r>
-        <w:t>Rather than a full narrative, Table 3 lists only the changes that moved the metric, with the resulting development nDCG@20 (1,000 sessions).</w:t>
-      </w:r>
-    </w:p>
-    <w:p>
-      <w:pPr>
-        <w:pStyle w:val="TableCaption"/>
-      </w:pPr>
-      <w:r>
-        <w:t>Table 3: Development nDCG@20 after each load-bearing change.</w:t>
+        <w:t>Table 2: Rescorer feature groups (67 features).</w:t>
       </w:r>
     </w:p>
     <w:tbl>
@@ -2225,7 +1406,7 @@
                 <w:b/>
                 <w:sz w:val="18"/>
               </w:rPr>
-              <w:t>Change</w:t>
+              <w:t>Group</w:t>
             </w:r>
           </w:p>
         </w:tc>
@@ -2240,7 +1421,7 @@
                 <w:b/>
                 <w:sz w:val="18"/>
               </w:rPr>
-              <w:t>nDCG@20</w:t>
+              <w:t>Features</w:t>
             </w:r>
           </w:p>
         </w:tc>
@@ -2260,7 +1441,7 @@
               <w:rPr>
                 <w:sz w:val="18"/>
               </w:rPr>
-              <w:t>BM25 over name + artist + album</w:t>
+              <w:t>A. Retrieval scores</w:t>
             </w:r>
           </w:p>
         </w:tc>
@@ -2278,7 +1459,7 @@
               <w:rPr>
                 <w:sz w:val="18"/>
               </w:rPr>
-              <w:t>0.0861</w:t>
+              <w:t>two-tower cosine and rank; Qwen3 metadata and lyrics cosines; CLAP audio cosine; CF cosine; BM25 reciprocal rank; co-occurrence rank</w:t>
             </w:r>
           </w:p>
         </w:tc>
@@ -2298,7 +1479,7 @@
               <w:rPr>
                 <w:sz w:val="18"/>
               </w:rPr>
-              <w:t>+ index the tag list</w:t>
+              <w:t>B. Source agreement</w:t>
             </w:r>
           </w:p>
         </w:tc>
@@ -2314,9 +1495,16 @@
             </w:r>
             <w:r>
               <w:rPr>
-                <w:sz w:val="18"/>
-              </w:rPr>
-              <w:t>0.0960</w:t>
+                <w:rFonts w:ascii="Courier New" w:hAnsi="Courier New"/>
+                <w:sz w:val="18"/>
+              </w:rPr>
+              <w:t>n_sources</w:t>
+            </w:r>
+            <w:r>
+              <w:rPr>
+                <w:sz w:val="18"/>
+              </w:rPr>
+              <w:t xml:space="preserve"> and transforms: count of sources returning the candidate; a de-facto ensemble vote</w:t>
             </w:r>
           </w:p>
         </w:tc>
@@ -2336,7 +1524,7 @@
               <w:rPr>
                 <w:sz w:val="18"/>
               </w:rPr>
-              <w:t>+ exclude already-played tracks</w:t>
+              <w:t>C. Track metadata</w:t>
             </w:r>
           </w:p>
         </w:tc>
@@ -2354,7 +1542,7 @@
               <w:rPr>
                 <w:sz w:val="18"/>
               </w:rPr>
-              <w:t>0.1313</w:t>
+              <w:t>popularity percentile; years since release; request-tag overlap</w:t>
             </w:r>
           </w:p>
         </w:tc>
@@ -2374,7 +1562,7 @@
               <w:rPr>
                 <w:sz w:val="18"/>
               </w:rPr>
-              <w:t>+ fine-tuned two-tower, linear fusion</w:t>
+              <w:t>D. Session state (GPA)</w:t>
             </w:r>
           </w:p>
         </w:tc>
@@ -2392,7 +1580,7 @@
               <w:rPr>
                 <w:sz w:val="18"/>
               </w:rPr>
-              <w:t>0.1418</w:t>
+              <w:t>cosine to accepted- and to rejected-history centroids; artist-in-rejected-set; accepted/rejected turn counts; consecutive rejections; CF distance to history</w:t>
             </w:r>
           </w:p>
         </w:tc>
@@ -2412,7 +1600,7 @@
               <w:rPr>
                 <w:sz w:val="18"/>
               </w:rPr>
-              <w:t>+ multi-source pool expansion</w:t>
+              <w:t>E. Intent extraction</w:t>
             </w:r>
           </w:p>
         </w:tc>
@@ -2430,7 +1618,7 @@
               <w:rPr>
                 <w:sz w:val="18"/>
               </w:rPr>
-              <w:t>0.1533</w:t>
+              <w:t>era/genre/mood keywords parsed from the request; candidate era/genre match; album continuity; within-artist popularity and transition ranks; bucket-match counts</w:t>
             </w:r>
           </w:p>
         </w:tc>
@@ -2450,7 +1638,7 @@
               <w:rPr>
                 <w:sz w:val="18"/>
               </w:rPr>
-              <w:t>+ LightGBM LambdaMART replaces linear fusion</w:t>
+              <w:t>F. Sequential ID</w:t>
             </w:r>
           </w:p>
         </w:tc>
@@ -2468,7 +1656,74 @@
               <w:rPr>
                 <w:sz w:val="18"/>
               </w:rPr>
-              <w:t>0.1609</w:t>
+              <w:t>SASRec bucket-origin and rank (optional configuration)</w:t>
+            </w:r>
+          </w:p>
+        </w:tc>
+      </w:tr>
+    </w:tbl>
+    <w:p>
+      <w:pPr>
+        <w:pStyle w:val="Head1"/>
+      </w:pPr>
+      <w:r>
+        <w:t>5 Results</w:t>
+      </w:r>
+    </w:p>
+    <w:p>
+      <w:pPr>
+        <w:pStyle w:val="Para"/>
+      </w:pPr>
+      <w:r>
+        <w:t>Table 3 lists only the changes that moved the development nDCG@20 (1,000 sessions). The two largest single jumps are non-model changes: excluding already-played tracks from BM25 (+0.035), and replacing linear fusion with a learned ranker, which unlocked every later feature. The goal-progress fixes of Section 3.3 account for the final step to 0.1864. On the blind sets the same system scores nDCG@20 = 0.3997 (Blind A) and composite 0.49 (Blind B). Two negative results shaped the design: post-hoc editing of the ranker's top-20 to "clean up obvious mistakes" regressed nDCG in every trial, because logged next-tracks often lie inside the same artist cluster a curator would prune; and zero-shot cross-encoder and LLM rerankers underperformed the feature-based LambdaMART while costing orders of magnitude more compute.</w:t>
+      </w:r>
+    </w:p>
+    <w:p>
+      <w:pPr>
+        <w:pStyle w:val="TableCaption"/>
+      </w:pPr>
+      <w:r>
+        <w:t>Table 3: Development nDCG@20 after each load-bearing change.</w:t>
+      </w:r>
+    </w:p>
+    <w:tbl>
+      <w:tblPr>
+        <w:tblStyle w:val="TableGrid"/>
+        <w:tblW w:type="auto" w:w="0"/>
+        <w:tblLook w:firstColumn="1" w:firstRow="1" w:lastColumn="0" w:lastRow="0" w:noHBand="0" w:noVBand="1" w:val="04A0"/>
+      </w:tblPr>
+      <w:tblGrid>
+        <w:gridCol w:w="5040"/>
+        <w:gridCol w:w="5040"/>
+      </w:tblGrid>
+      <w:tr>
+        <w:tc>
+          <w:tcPr>
+            <w:tcW w:type="dxa" w:w="5040"/>
+          </w:tcPr>
+          <w:p>
+            <w:r/>
+            <w:r>
+              <w:rPr>
+                <w:b/>
+                <w:sz w:val="18"/>
+              </w:rPr>
+              <w:t>Change</w:t>
+            </w:r>
+          </w:p>
+        </w:tc>
+        <w:tc>
+          <w:tcPr>
+            <w:tcW w:type="dxa" w:w="5040"/>
+          </w:tcPr>
+          <w:p>
+            <w:r/>
+            <w:r>
+              <w:rPr>
+                <w:b/>
+                <w:sz w:val="18"/>
+              </w:rPr>
+              <w:t>nDCG@20</w:t>
             </w:r>
           </w:p>
         </w:tc>
@@ -2488,7 +1743,7 @@
               <w:rPr>
                 <w:sz w:val="18"/>
               </w:rPr>
-              <w:t>+ feature engineering, larger two-tower pool</w:t>
+              <w:t>BM25 over name + artist + album</w:t>
             </w:r>
           </w:p>
         </w:tc>
@@ -2506,7 +1761,7 @@
               <w:rPr>
                 <w:sz w:val="18"/>
               </w:rPr>
-              <w:t>0.1684</w:t>
+              <w:t>0.0861</w:t>
             </w:r>
           </w:p>
         </w:tc>
@@ -2526,7 +1781,7 @@
               <w:rPr>
                 <w:sz w:val="18"/>
               </w:rPr>
-              <w:t>+ E5 role-tagged dialogue anchor</w:t>
+              <w:t>+ index the tag list</w:t>
             </w:r>
           </w:p>
         </w:tc>
@@ -2544,7 +1799,7 @@
               <w:rPr>
                 <w:sz w:val="18"/>
               </w:rPr>
-              <w:t>0.1748</w:t>
+              <w:t>0.0960</w:t>
             </w:r>
           </w:p>
         </w:tc>
@@ -2564,7 +1819,7 @@
               <w:rPr>
                 <w:sz w:val="18"/>
               </w:rPr>
-              <w:t>+ GPA-aware inference and intent features</w:t>
+              <w:t>+ exclude already-played tracks</w:t>
             </w:r>
           </w:p>
         </w:tc>
@@ -2582,6 +1837,234 @@
               <w:rPr>
                 <w:sz w:val="18"/>
               </w:rPr>
+              <w:t>0.1313</w:t>
+            </w:r>
+          </w:p>
+        </w:tc>
+      </w:tr>
+      <w:tr>
+        <w:tc>
+          <w:tcPr>
+            <w:tcW w:type="dxa" w:w="5040"/>
+          </w:tcPr>
+          <w:p>
+            <w:r>
+              <w:rPr>
+                <w:sz w:val="18"/>
+              </w:rPr>
+            </w:r>
+            <w:r>
+              <w:rPr>
+                <w:sz w:val="18"/>
+              </w:rPr>
+              <w:t>+ fine-tuned two-tower, linear fusion</w:t>
+            </w:r>
+          </w:p>
+        </w:tc>
+        <w:tc>
+          <w:tcPr>
+            <w:tcW w:type="dxa" w:w="5040"/>
+          </w:tcPr>
+          <w:p>
+            <w:r>
+              <w:rPr>
+                <w:sz w:val="18"/>
+              </w:rPr>
+            </w:r>
+            <w:r>
+              <w:rPr>
+                <w:sz w:val="18"/>
+              </w:rPr>
+              <w:t>0.1418</w:t>
+            </w:r>
+          </w:p>
+        </w:tc>
+      </w:tr>
+      <w:tr>
+        <w:tc>
+          <w:tcPr>
+            <w:tcW w:type="dxa" w:w="5040"/>
+          </w:tcPr>
+          <w:p>
+            <w:r>
+              <w:rPr>
+                <w:sz w:val="18"/>
+              </w:rPr>
+            </w:r>
+            <w:r>
+              <w:rPr>
+                <w:sz w:val="18"/>
+              </w:rPr>
+              <w:t>+ multi-source pool expansion</w:t>
+            </w:r>
+          </w:p>
+        </w:tc>
+        <w:tc>
+          <w:tcPr>
+            <w:tcW w:type="dxa" w:w="5040"/>
+          </w:tcPr>
+          <w:p>
+            <w:r>
+              <w:rPr>
+                <w:sz w:val="18"/>
+              </w:rPr>
+            </w:r>
+            <w:r>
+              <w:rPr>
+                <w:sz w:val="18"/>
+              </w:rPr>
+              <w:t>0.1533</w:t>
+            </w:r>
+          </w:p>
+        </w:tc>
+      </w:tr>
+      <w:tr>
+        <w:tc>
+          <w:tcPr>
+            <w:tcW w:type="dxa" w:w="5040"/>
+          </w:tcPr>
+          <w:p>
+            <w:r>
+              <w:rPr>
+                <w:sz w:val="18"/>
+              </w:rPr>
+            </w:r>
+            <w:r>
+              <w:rPr>
+                <w:sz w:val="18"/>
+              </w:rPr>
+              <w:t>+ LightGBM LambdaMART replaces linear fusion</w:t>
+            </w:r>
+          </w:p>
+        </w:tc>
+        <w:tc>
+          <w:tcPr>
+            <w:tcW w:type="dxa" w:w="5040"/>
+          </w:tcPr>
+          <w:p>
+            <w:r>
+              <w:rPr>
+                <w:sz w:val="18"/>
+              </w:rPr>
+            </w:r>
+            <w:r>
+              <w:rPr>
+                <w:sz w:val="18"/>
+              </w:rPr>
+              <w:t>0.1609</w:t>
+            </w:r>
+          </w:p>
+        </w:tc>
+      </w:tr>
+      <w:tr>
+        <w:tc>
+          <w:tcPr>
+            <w:tcW w:type="dxa" w:w="5040"/>
+          </w:tcPr>
+          <w:p>
+            <w:r>
+              <w:rPr>
+                <w:sz w:val="18"/>
+              </w:rPr>
+            </w:r>
+            <w:r>
+              <w:rPr>
+                <w:sz w:val="18"/>
+              </w:rPr>
+              <w:t>+ feature engineering, larger two-tower pool</w:t>
+            </w:r>
+          </w:p>
+        </w:tc>
+        <w:tc>
+          <w:tcPr>
+            <w:tcW w:type="dxa" w:w="5040"/>
+          </w:tcPr>
+          <w:p>
+            <w:r>
+              <w:rPr>
+                <w:sz w:val="18"/>
+              </w:rPr>
+            </w:r>
+            <w:r>
+              <w:rPr>
+                <w:sz w:val="18"/>
+              </w:rPr>
+              <w:t>0.1684</w:t>
+            </w:r>
+          </w:p>
+        </w:tc>
+      </w:tr>
+      <w:tr>
+        <w:tc>
+          <w:tcPr>
+            <w:tcW w:type="dxa" w:w="5040"/>
+          </w:tcPr>
+          <w:p>
+            <w:r>
+              <w:rPr>
+                <w:sz w:val="18"/>
+              </w:rPr>
+            </w:r>
+            <w:r>
+              <w:rPr>
+                <w:sz w:val="18"/>
+              </w:rPr>
+              <w:t>+ E5 role-tagged dialogue anchor</w:t>
+            </w:r>
+          </w:p>
+        </w:tc>
+        <w:tc>
+          <w:tcPr>
+            <w:tcW w:type="dxa" w:w="5040"/>
+          </w:tcPr>
+          <w:p>
+            <w:r>
+              <w:rPr>
+                <w:sz w:val="18"/>
+              </w:rPr>
+            </w:r>
+            <w:r>
+              <w:rPr>
+                <w:sz w:val="18"/>
+              </w:rPr>
+              <w:t>0.1748</w:t>
+            </w:r>
+          </w:p>
+        </w:tc>
+      </w:tr>
+      <w:tr>
+        <w:tc>
+          <w:tcPr>
+            <w:tcW w:type="dxa" w:w="5040"/>
+          </w:tcPr>
+          <w:p>
+            <w:r>
+              <w:rPr>
+                <w:sz w:val="18"/>
+              </w:rPr>
+            </w:r>
+            <w:r>
+              <w:rPr>
+                <w:sz w:val="18"/>
+              </w:rPr>
+              <w:t>+ GPA-aware inference and intent features</w:t>
+            </w:r>
+          </w:p>
+        </w:tc>
+        <w:tc>
+          <w:tcPr>
+            <w:tcW w:type="dxa" w:w="5040"/>
+          </w:tcPr>
+          <w:p>
+            <w:r>
+              <w:rPr>
+                <w:sz w:val="18"/>
+              </w:rPr>
+            </w:r>
+            <w:r>
+              <w:rPr>
+                <w:sz w:val="18"/>
+              </w:rPr>
               <w:t>0.1864</w:t>
             </w:r>
           </w:p>
@@ -2590,66 +2073,383 @@
     </w:tbl>
     <w:p>
       <w:pPr>
-        <w:pStyle w:val="Para"/>
-      </w:pPr>
-      <w:r>
-        <w:t>The two largest single jumps are non-model changes: excluding already-played tracks (+0.035) and replacing linear fusion with a learned ranker (that unlocked every later feature). The GPA fixes of Section 4.3 account for the final step to 0.1864. On the blind sets the same system scores nDCG@20 = 0.3997 (Blind A) and composite 0.49 (Blind B).</w:t>
+        <w:pStyle w:val="Head1"/>
+      </w:pPr>
+      <w:r>
+        <w:t>6 Efficiency and Scalability</w:t>
       </w:r>
     </w:p>
     <w:p>
       <w:pPr>
-        <w:pStyle w:val="Head1"/>
-      </w:pPr>
-      <w:r>
-        <w:t>7 Efficiency</w:t>
+        <w:pStyle w:val="Para"/>
+      </w:pPr>
+      <w:r>
+        <w:t>Every stage is CPU-native; Table 4 reports measured latencies on the M4 with all neural components forced to CPU. Exact brute-force similarity over the 47,071 x 768 matrix is a single matmul, so no approximate index is needed at this catalog scale, and every stage except the encoder forward passes is single-digit milliseconds. Per-turn cost is dominated by the two query encoders; the frozen Qwen3-0.6B is by far the most expensive and can be dropped in the eight-source configuration, taking per-turn neural work below 100 ms. The trained artifact is a 24 MB LoRA adapter and the full serving process fits in under ~2 GB of RAM, so the entire train/evaluate/iterate loop, including the one LoRA fine-tune, runs on a single 16 GB desktop, which is what made rapid iteration practical.</w:t>
       </w:r>
     </w:p>
     <w:p>
       <w:pPr>
-        <w:pStyle w:val="Para"/>
-      </w:pPr>
-      <w:r>
-        <w:t>Every stage is CPU-native. Exact brute-force similarity over the 47,071 x 768 matrix is one matmul (median 2.2 ms), so no approximate index is needed at this catalog scale. Per-turn neural cost is dominated by the two encoder forward passes; the classical stages are single-digit milliseconds (BM25 0.5 ms, ranking 3,100 candidates 3.4 ms). The trained artifact is a 24 MB LoRA adapter; the full serving process fits under ~2 GB of RAM. The complete train/evaluate/iterate loop, including the one LoRA fine-tune, runs on a single 16 GB consumer machine, which is what made rapid iteration feasible.</w:t>
+        <w:pStyle w:val="TableCaption"/>
+      </w:pPr>
+      <w:r>
+        <w:t>Table 4: Measured CPU latency and footprint (median over 20 runs).</w:t>
+      </w:r>
+    </w:p>
+    <w:tbl>
+      <w:tblPr>
+        <w:tblStyle w:val="TableGrid"/>
+        <w:tblW w:type="auto" w:w="0"/>
+        <w:tblLook w:firstColumn="1" w:firstRow="1" w:lastColumn="0" w:lastRow="0" w:noHBand="0" w:noVBand="1" w:val="04A0"/>
+      </w:tblPr>
+      <w:tblGrid>
+        <w:gridCol w:w="5040"/>
+        <w:gridCol w:w="5040"/>
+      </w:tblGrid>
+      <w:tr>
+        <w:tc>
+          <w:tcPr>
+            <w:tcW w:type="dxa" w:w="5040"/>
+          </w:tcPr>
+          <w:p>
+            <w:r/>
+            <w:r>
+              <w:rPr>
+                <w:b/>
+                <w:sz w:val="18"/>
+              </w:rPr>
+              <w:t>Operation</w:t>
+            </w:r>
+          </w:p>
+        </w:tc>
+        <w:tc>
+          <w:tcPr>
+            <w:tcW w:type="dxa" w:w="5040"/>
+          </w:tcPr>
+          <w:p>
+            <w:r/>
+            <w:r>
+              <w:rPr>
+                <w:b/>
+                <w:sz w:val="18"/>
+              </w:rPr>
+              <w:t>Cost</w:t>
+            </w:r>
+          </w:p>
+        </w:tc>
+      </w:tr>
+      <w:tr>
+        <w:tc>
+          <w:tcPr>
+            <w:tcW w:type="dxa" w:w="5040"/>
+          </w:tcPr>
+          <w:p>
+            <w:r>
+              <w:rPr>
+                <w:sz w:val="18"/>
+              </w:rPr>
+            </w:r>
+            <w:r>
+              <w:rPr>
+                <w:sz w:val="18"/>
+              </w:rPr>
+              <w:t>Two-tower query encode (e5-base)</w:t>
+            </w:r>
+          </w:p>
+        </w:tc>
+        <w:tc>
+          <w:tcPr>
+            <w:tcW w:type="dxa" w:w="5040"/>
+          </w:tcPr>
+          <w:p>
+            <w:r>
+              <w:rPr>
+                <w:sz w:val="18"/>
+              </w:rPr>
+            </w:r>
+            <w:r>
+              <w:rPr>
+                <w:sz w:val="18"/>
+              </w:rPr>
+              <w:t>47 ms</w:t>
+            </w:r>
+          </w:p>
+        </w:tc>
+      </w:tr>
+      <w:tr>
+        <w:tc>
+          <w:tcPr>
+            <w:tcW w:type="dxa" w:w="5040"/>
+          </w:tcPr>
+          <w:p>
+            <w:r>
+              <w:rPr>
+                <w:sz w:val="18"/>
+              </w:rPr>
+            </w:r>
+            <w:r>
+              <w:rPr>
+                <w:sz w:val="18"/>
+              </w:rPr>
+              <w:t>Exact ANN, 47,071 x 768, top-2000</w:t>
+            </w:r>
+          </w:p>
+        </w:tc>
+        <w:tc>
+          <w:tcPr>
+            <w:tcW w:type="dxa" w:w="5040"/>
+          </w:tcPr>
+          <w:p>
+            <w:r>
+              <w:rPr>
+                <w:sz w:val="18"/>
+              </w:rPr>
+            </w:r>
+            <w:r>
+              <w:rPr>
+                <w:sz w:val="18"/>
+              </w:rPr>
+              <w:t>2.2 ms</w:t>
+            </w:r>
+          </w:p>
+        </w:tc>
+      </w:tr>
+      <w:tr>
+        <w:tc>
+          <w:tcPr>
+            <w:tcW w:type="dxa" w:w="5040"/>
+          </w:tcPr>
+          <w:p>
+            <w:r>
+              <w:rPr>
+                <w:sz w:val="18"/>
+              </w:rPr>
+            </w:r>
+            <w:r>
+              <w:rPr>
+                <w:sz w:val="18"/>
+              </w:rPr>
+              <w:t>Qwen3-0.6B query encode</w:t>
+            </w:r>
+          </w:p>
+        </w:tc>
+        <w:tc>
+          <w:tcPr>
+            <w:tcW w:type="dxa" w:w="5040"/>
+          </w:tcPr>
+          <w:p>
+            <w:r>
+              <w:rPr>
+                <w:sz w:val="18"/>
+              </w:rPr>
+            </w:r>
+            <w:r>
+              <w:rPr>
+                <w:sz w:val="18"/>
+              </w:rPr>
+              <w:t>601 ms</w:t>
+            </w:r>
+          </w:p>
+        </w:tc>
+      </w:tr>
+      <w:tr>
+        <w:tc>
+          <w:tcPr>
+            <w:tcW w:type="dxa" w:w="5040"/>
+          </w:tcPr>
+          <w:p>
+            <w:r>
+              <w:rPr>
+                <w:sz w:val="18"/>
+              </w:rPr>
+            </w:r>
+            <w:r>
+              <w:rPr>
+                <w:sz w:val="18"/>
+              </w:rPr>
+              <w:t>BM25 retrieve, top-500</w:t>
+            </w:r>
+          </w:p>
+        </w:tc>
+        <w:tc>
+          <w:tcPr>
+            <w:tcW w:type="dxa" w:w="5040"/>
+          </w:tcPr>
+          <w:p>
+            <w:r>
+              <w:rPr>
+                <w:sz w:val="18"/>
+              </w:rPr>
+            </w:r>
+            <w:r>
+              <w:rPr>
+                <w:sz w:val="18"/>
+              </w:rPr>
+              <w:t>0.5 ms</w:t>
+            </w:r>
+          </w:p>
+        </w:tc>
+      </w:tr>
+      <w:tr>
+        <w:tc>
+          <w:tcPr>
+            <w:tcW w:type="dxa" w:w="5040"/>
+          </w:tcPr>
+          <w:p>
+            <w:r>
+              <w:rPr>
+                <w:sz w:val="18"/>
+              </w:rPr>
+            </w:r>
+            <w:r>
+              <w:rPr>
+                <w:sz w:val="18"/>
+              </w:rPr>
+              <w:t>LambdaMART score, 3,100 x 67 features</w:t>
+            </w:r>
+          </w:p>
+        </w:tc>
+        <w:tc>
+          <w:tcPr>
+            <w:tcW w:type="dxa" w:w="5040"/>
+          </w:tcPr>
+          <w:p>
+            <w:r>
+              <w:rPr>
+                <w:sz w:val="18"/>
+              </w:rPr>
+            </w:r>
+            <w:r>
+              <w:rPr>
+                <w:sz w:val="18"/>
+              </w:rPr>
+              <w:t>3.4 ms</w:t>
+            </w:r>
+          </w:p>
+        </w:tc>
+      </w:tr>
+      <w:tr>
+        <w:tc>
+          <w:tcPr>
+            <w:tcW w:type="dxa" w:w="5040"/>
+          </w:tcPr>
+          <w:p>
+            <w:r>
+              <w:rPr>
+                <w:sz w:val="18"/>
+              </w:rPr>
+            </w:r>
+            <w:r>
+              <w:rPr>
+                <w:sz w:val="18"/>
+              </w:rPr>
+              <w:t>Serving memory, all components loaded</w:t>
+            </w:r>
+          </w:p>
+        </w:tc>
+        <w:tc>
+          <w:tcPr>
+            <w:tcW w:type="dxa" w:w="5040"/>
+          </w:tcPr>
+          <w:p>
+            <w:r>
+              <w:rPr>
+                <w:sz w:val="18"/>
+              </w:rPr>
+            </w:r>
+            <w:r>
+              <w:rPr>
+                <w:sz w:val="18"/>
+              </w:rPr>
+              <w:t>1.85 GB</w:t>
+            </w:r>
+          </w:p>
+        </w:tc>
+      </w:tr>
+      <w:tr>
+        <w:tc>
+          <w:tcPr>
+            <w:tcW w:type="dxa" w:w="5040"/>
+          </w:tcPr>
+          <w:p>
+            <w:r>
+              <w:rPr>
+                <w:sz w:val="18"/>
+              </w:rPr>
+            </w:r>
+            <w:r>
+              <w:rPr>
+                <w:sz w:val="18"/>
+              </w:rPr>
+              <w:t>Trained artifact (LoRA adapter)</w:t>
+            </w:r>
+          </w:p>
+        </w:tc>
+        <w:tc>
+          <w:tcPr>
+            <w:tcW w:type="dxa" w:w="5040"/>
+          </w:tcPr>
+          <w:p>
+            <w:r>
+              <w:rPr>
+                <w:sz w:val="18"/>
+              </w:rPr>
+            </w:r>
+            <w:r>
+              <w:rPr>
+                <w:sz w:val="18"/>
+              </w:rPr>
+              <w:t>24 MB</w:t>
+            </w:r>
+          </w:p>
+        </w:tc>
+      </w:tr>
+    </w:tbl>
+    <w:p>
+      <w:pPr>
+        <w:pStyle w:val="Head1"/>
+      </w:pPr>
+      <w:r>
+        <w:t>7 Conclusion</w:t>
       </w:r>
     </w:p>
     <w:p>
       <w:pPr>
-        <w:pStyle w:val="Head1"/>
-      </w:pPr>
-      <w:r>
-        <w:t>8 Conclusion</w:t>
+        <w:pStyle w:val="Para"/>
+      </w:pPr>
+      <w:r>
+        <w:t>A conversational music recommender need not use a GPU cluster or a per-candidate neural reranker to be competitive. Fusing many inexpensive retrievers, letting a gradient-boosted ranker arbitrate them, and adding a single LoRA-adapted dialogue encoder reaches composite 0.49 on the blind set while training and serving on one desktop. The largest gains came from data hygiene rather than model capacity, and in particular from correctly handling a goal-progress feedback signal that is off-by-one in time, contaminated with rejected tracks, and absent at test time.</w:t>
       </w:r>
     </w:p>
     <w:p>
       <w:pPr>
-        <w:pStyle w:val="Para"/>
-      </w:pPr>
-      <w:r>
-        <w:t>A conversational music recommender does not require a GPU cluster or a per-candidate neural reranker to be competitive. Fusing many inexpensive retrievers and letting a gradient-boosted ranker arbitrate them, with a single LoRA-adapted dialogue encoder for dense recall, reaches a composite of 0.49 on the blind generalization set while training and serving on one desktop. The largest gains came not from model capacity but from data hygiene: excluding seen tracks, learning the fusion instead of tuning it, and correctly handling a goal-progress feedback signal that is off-by-one in time, contaminated with rejected tracks, and absent at test time.</w:t>
+        <w:pStyle w:val="AckHead"/>
+      </w:pPr>
+      <w:r>
+        <w:t>ACKNOWLEDGMENTS</w:t>
       </w:r>
     </w:p>
     <w:p>
       <w:pPr>
-        <w:pStyle w:val="AckHead"/>
-      </w:pPr>
-      <w:r>
-        <w:t>ACKNOWLEDGMENTS</w:t>
+        <w:pStyle w:val="AckPara"/>
+      </w:pPr>
+      <w:r>
+        <w:t>Insert acknowledgments here.</w:t>
       </w:r>
     </w:p>
     <w:p>
       <w:pPr>
-        <w:pStyle w:val="AckPara"/>
-      </w:pPr>
-      <w:r>
-        <w:t>Insert acknowledgments here.</w:t>
+        <w:pStyle w:val="ReferenceHead"/>
+      </w:pPr>
+      <w:r>
+        <w:t>REFERENCES</w:t>
       </w:r>
     </w:p>
     <w:p>
       <w:pPr>
-        <w:pStyle w:val="ReferenceHead"/>
-      </w:pPr>
-      <w:r>
-        <w:t>REFERENCES</w:t>
+        <w:pStyle w:val="Bibentry"/>
+      </w:pPr>
+      <w:r>
+        <w:t>[1] Wang, L. et al. 2024. Multilingual E5 Text Embeddings: A Technical Report. arXiv:2402.05672.</w:t>
       </w:r>
     </w:p>
     <w:p>
@@ -2657,16 +2457,7 @@
         <w:pStyle w:val="Bibentry"/>
       </w:pPr>
       <w:r>
-        <w:t>[1] Wang, L. et al. Multilingual E5 Text Embeddings. (</w:t>
-      </w:r>
-      <w:r>
-        <w:rPr>
-          <w:rFonts w:ascii="Courier New" w:hAnsi="Courier New"/>
-        </w:rPr>
-        <w:t>intfloat/multilingual-e5-base</w:t>
-      </w:r>
-      <w:r>
-        <w:t>).</w:t>
+        <w:t>[2] Ke, G. et al. 2017. LightGBM: A Highly Efficient Gradient Boosting Decision Tree. In NeurIPS.</w:t>
       </w:r>
     </w:p>
     <w:p>
@@ -2674,7 +2465,7 @@
         <w:pStyle w:val="Bibentry"/>
       </w:pPr>
       <w:r>
-        <w:t>[2] Ke, G. et al. 2017. LightGBM: A Highly Efficient Gradient Boosting Decision Tree. In NeurIPS.</w:t>
+        <w:t>[3] Burges, C. J. C. 2010. From RankNet to LambdaRank to LambdaMART: An Overview. Microsoft Research Technical Report MSR-TR-2010-82.</w:t>
       </w:r>
     </w:p>
     <w:p>
@@ -2682,7 +2473,7 @@
         <w:pStyle w:val="Bibentry"/>
       </w:pPr>
       <w:r>
-        <w:t>[3] Burges, C. J. C. 2010. From RankNet to LambdaRank to LambdaMART: An Overview. Microsoft Research Technical Report.</w:t>
+        <w:t>[4] Hu, E. J. et al. 2022. LoRA: Low-Rank Adaptation of Large Language Models. In ICLR.</w:t>
       </w:r>
     </w:p>
     <w:p>
@@ -2690,7 +2481,7 @@
         <w:pStyle w:val="Bibentry"/>
       </w:pPr>
       <w:r>
-        <w:t>[4] Hu, E. J. et al. 2022. LoRA: Low-Rank Adaptation of Large Language Models. In ICLR.</w:t>
+        <w:t>[5] Rendle, S. et al. 2009. BPR: Bayesian Personalized Ranking from Implicit Feedback. In UAI.</w:t>
       </w:r>
     </w:p>
     <w:p>
@@ -2698,7 +2489,7 @@
         <w:pStyle w:val="Bibentry"/>
       </w:pPr>
       <w:r>
-        <w:t>[5] Rendle, S. et al. 2009. BPR: Bayesian Personalized Ranking from Implicit Feedback. In UAI.</w:t>
+        <w:t>[6] Kang, W.-C. and McAuley, J. 2018. Self-Attentive Sequential Recommendation. In ICDM.</w:t>
       </w:r>
     </w:p>
     <w:p>
@@ -2706,15 +2497,7 @@
         <w:pStyle w:val="Bibentry"/>
       </w:pPr>
       <w:r>
-        <w:t>[6] Kang, W.-C. and McAuley, J. 2018. Self-Attentive Sequential Recommendation (SASRec). In ICDM.</w:t>
-      </w:r>
-    </w:p>
-    <w:p>
-      <w:pPr>
-        <w:pStyle w:val="Bibentry"/>
-      </w:pPr>
-      <w:r>
-        <w:t>[7] Robertson, S. and Zaragoza, H. 2009. The Probabilistic Relevance Framework: BM25 and Beyond. Foundations and Trends in Information Retrieval.</w:t>
+        <w:t>[7] Robertson, S. and Zaragoza, H. 2009. The Probabilistic Relevance Framework: BM25 and Beyond. Foundations and Trends in Information Retrieval 3, 4.</w:t>
       </w:r>
     </w:p>
     <w:sectPr>

</xml_diff>

<commit_message>
docs: add recall/rescore/end-to-end latencies to Section 6
Table 4 now reports stage latencies alongside the CPU-forced component rows:
recall stage ~0.26 s/turn, rescore stage 3.4 ms/turn, and end-to-end recall+
rescore 2.17 s/session (~0.27 s/turn, golden-200 set). Prose notes rescore is
~1% of turn latency so recall dominates, and that a CPU-only turn stays under 1 s.

Co-Authored-By: Claude Opus 4.8 <noreply@anthropic.com>
</commit_message>
<xml_diff>
--- a/paper_wikis/paper.docx
+++ b/paper_wikis/paper.docx
@@ -2084,15 +2084,27 @@
         <w:pStyle w:val="Para"/>
       </w:pPr>
       <w:r>
-        <w:t>Every stage is CPU-native; Table 4 reports measured latencies on the M4 with all neural components forced to CPU. Exact brute-force similarity over the 47,071 x 768 matrix is a single matmul, so no approximate index is needed at this catalog scale, and every stage except the encoder forward passes is single-digit milliseconds. Per-turn cost is dominated by the two query encoders; the frozen Qwen3-0.6B is by far the most expensive and can be dropped in the eight-source configuration, taking per-turn neural work below 100 ms. The trained artifact is a 24 MB LoRA adapter and the full serving process fits in under ~2 GB of RAM, so the entire train/evaluate/iterate loop, including the one LoRA fine-tune, runs on a single 16 GB desktop, which is what made rapid iteration practical.</w:t>
+        <w:t xml:space="preserve">Every stage is CPU-native; Table 4 (top) reports per-component latencies with all neural blocks forced to CPU. Exact brute-force similarity over the 47,071 x 768 matrix is a single matmul, so no approximate index is needed at this catalog scale, and every stage except the encoder passes is single-digit milliseconds. Measured end-to-end over the 200-session evaluation set, the full recall-plus- rescore pipeline runs at </w:t>
+      </w:r>
+      <w:r>
+        <w:rPr>
+          <w:b/>
+        </w:rPr>
+        <w:t>2.17 s per session, about 0.27 s per turn</w:t>
+      </w:r>
+      <w:r>
+        <w:t xml:space="preserve"> (Table 4, bottom). Of this, the rescore stage is negligible: scoring the ~3,100-candidate pool with LambdaMART takes 3.4 ms, roughly 1% of turn latency, so recall (the nine sources and their two query-encoder passes) accounts for essentially all of it. Even with every neural block pinned to the CPU (Table 4, top), a full turn stays under one second; dropping the frozen Qwen3-0.6B encoder in the eight-source configuration removes the single largest cost. The trained artifact is a 24 MB LoRA adapter and the serving process fits in under ~2 GB of RAM, so the entire train/evaluate/iterate loop, including the one LoRA fine-tune, runs on a single 16 GB desktop, which is what made rapid iteration practical.</w:t>
       </w:r>
     </w:p>
     <w:p>
       <w:pPr>
-        <w:pStyle w:val="TableCaption"/>
-      </w:pPr>
-      <w:r>
-        <w:t>Table 4: Measured CPU latency and footprint (median over 20 runs).</w:t>
+        <w:pStyle w:val="Para"/>
+      </w:pPr>
+      <w:r>
+        <w:rPr>
+          <w:b/>
+        </w:rPr>
+        <w:t>Table 4: Measured latency and footprint. Top: per component, all neural blocks forced to CPU (worst case), median over 20 runs. Bottom: end-to-end recall + rescore over the 200-session set, encoders on the Metal backend.</w:t>
       </w:r>
     </w:p>
     <w:tbl>
@@ -2304,7 +2316,7 @@
               <w:rPr>
                 <w:sz w:val="18"/>
               </w:rPr>
-              <w:t>LambdaMART score, 3,100 x 67 features</w:t>
+              <w:t>Rescore: LambdaMART, 3,100 x 67 features</w:t>
             </w:r>
           </w:p>
         </w:tc>
@@ -2399,6 +2411,120 @@
                 <w:sz w:val="18"/>
               </w:rPr>
               <w:t>24 MB</w:t>
+            </w:r>
+          </w:p>
+        </w:tc>
+      </w:tr>
+      <w:tr>
+        <w:tc>
+          <w:tcPr>
+            <w:tcW w:type="dxa" w:w="5040"/>
+          </w:tcPr>
+          <w:p>
+            <w:r>
+              <w:rPr>
+                <w:sz w:val="18"/>
+              </w:rPr>
+            </w:r>
+            <w:r>
+              <w:rPr>
+                <w:sz w:val="18"/>
+              </w:rPr>
+              <w:t>Recall stage, per turn (nine sources)</w:t>
+            </w:r>
+          </w:p>
+        </w:tc>
+        <w:tc>
+          <w:tcPr>
+            <w:tcW w:type="dxa" w:w="5040"/>
+          </w:tcPr>
+          <w:p>
+            <w:r>
+              <w:rPr>
+                <w:sz w:val="18"/>
+              </w:rPr>
+            </w:r>
+            <w:r>
+              <w:rPr>
+                <w:sz w:val="18"/>
+              </w:rPr>
+              <w:t>~0.26 s</w:t>
+            </w:r>
+          </w:p>
+        </w:tc>
+      </w:tr>
+      <w:tr>
+        <w:tc>
+          <w:tcPr>
+            <w:tcW w:type="dxa" w:w="5040"/>
+          </w:tcPr>
+          <w:p>
+            <w:r>
+              <w:rPr>
+                <w:sz w:val="18"/>
+              </w:rPr>
+            </w:r>
+            <w:r>
+              <w:rPr>
+                <w:sz w:val="18"/>
+              </w:rPr>
+              <w:t>Rescore stage, per turn</w:t>
+            </w:r>
+          </w:p>
+        </w:tc>
+        <w:tc>
+          <w:tcPr>
+            <w:tcW w:type="dxa" w:w="5040"/>
+          </w:tcPr>
+          <w:p>
+            <w:r>
+              <w:rPr>
+                <w:sz w:val="18"/>
+              </w:rPr>
+            </w:r>
+            <w:r>
+              <w:rPr>
+                <w:sz w:val="18"/>
+              </w:rPr>
+              <w:t>3.4 ms</w:t>
+            </w:r>
+          </w:p>
+        </w:tc>
+      </w:tr>
+      <w:tr>
+        <w:tc>
+          <w:tcPr>
+            <w:tcW w:type="dxa" w:w="5040"/>
+          </w:tcPr>
+          <w:p>
+            <w:r>
+              <w:rPr>
+                <w:sz w:val="18"/>
+              </w:rPr>
+            </w:r>
+            <w:r>
+              <w:rPr>
+                <w:sz w:val="18"/>
+              </w:rPr>
+              <w:t>End-to-end, per session (per turn)</w:t>
+            </w:r>
+          </w:p>
+        </w:tc>
+        <w:tc>
+          <w:tcPr>
+            <w:tcW w:type="dxa" w:w="5040"/>
+          </w:tcPr>
+          <w:p>
+            <w:r>
+              <w:rPr>
+                <w:sz w:val="18"/>
+              </w:rPr>
+            </w:r>
+            <w:r>
+              <w:rPr>
+                <w:sz w:val="18"/>
+              </w:rPr>
+              <w:t>2.17 s (0.27 s)</w:t>
             </w:r>
           </w:p>
         </w:tc>

</xml_diff>

<commit_message>
chore: cut main down to the replicable Blind B v2 (0.49) system
Archives everything not on the v2 dependency path (cross-encoder era,
semantic-ID LLM reranking, v3/v4b/v5 submission variants, old fusion
scripts, Kaggle notebooks, BM25 v2 index builder never read by the
shipped pipeline) into scripts/archive/v5_pre_submission/. No
behavioral code changes anywhere.

Fixes the paper/writeup to match verified code behavior: rejected-gold
retriever weighting, actual pair/dump counts, hard-negative counts, and
query construction wording (paper_draft.md, CURRENT_BEST_ITERATION.md,
PAPER_SYSTEM_ACCOUNT.md, paper.docx regenerated).

Adds a full replication guide to README.md: environment, artifact
build order, the exact Blind B v1 command, and the no-third_party
fallback. third_party/semantic-ids-llm (the SASRec/RQ-VAE dependency,
pinned to eugeneyan/semantic-ids-llm @ b730d48) is gitignored and
documented rather than vendored.

Co-Authored-By: Claude Opus 4.8 <noreply@anthropic.com>
</commit_message>
<xml_diff>
--- a/paper_wikis/paper.docx
+++ b/paper_wikis/paper.docx
@@ -128,7 +128,7 @@
         <w:t>Recall</w:t>
       </w:r>
       <w:r>
-        <w:t xml:space="preserve"> runs nine retrievers per turn and merges their outputs into one deduplicated pool (mean ~3,100 candidates); no single source exceeds ~59% gold recall at 500 candidates, but the fused pool reaches ~89% on the blind-simulated holdout. </w:t>
+        <w:t xml:space="preserve"> runs nine retrievers per turn and merges their outputs into one deduplicated pool (mean ~3,300 candidates); no single source exceeds ~59% gold recall at 500 candidates, but the fused pool reaches ~89% on the blind-simulated holdout. </w:t>
       </w:r>
       <w:r>
         <w:rPr>
@@ -975,7 +975,7 @@
         <w:t>bm25s</w:t>
       </w:r>
       <w:r>
-        <w:t>) indexes each track's name, artist, album, and tag list; indexing the tags matters because conversational requests use genre/mood/era vocabulary that only tags carry. The query is the latest user message plus the goal, culture, last four played tracks, and last four turns; older turns are excluded because they dilute the current request's IDF mass.</w:t>
+        <w:t>) indexes each track's name, artist, album, and tag list; indexing the tags matters because conversational requests use genre/mood/era vocabulary that only tags carry. The query concatenates the goal, culture, the last four played tracks, and the last four dialogue turns (the current request among them); older turns are excluded because they dilute the current request's IDF mass.</w:t>
       </w:r>
     </w:p>
     <w:p>
@@ -1012,7 +1012,7 @@
         <w:t>Neighborhood (sources 3, 7).</w:t>
       </w:r>
       <w:r>
-        <w:t xml:space="preserve"> Query-side retrieval is complemented by expansion around the history: the nearest neighbors of the last two played tracks (source 3) and of the mean two-tower embedding of the session's history, the taste centroid (source 7). Both are cheap matmuls against the same matrix; rejected history tracks are filtered from these seeds first (Section 3.3).</w:t>
+        <w:t xml:space="preserve"> Query-side retrieval is complemented by expansion around the history: the nearest neighbors of the last two played tracks (source 3) and of the mean two-tower embedding of the last four history tracks, a recent taste centroid (source 7). Both are cheap matmuls against the same matrix; rejected history tracks are filtered from these seeds first (Section 3.3).</w:t>
       </w:r>
     </w:p>
     <w:p>
@@ -1040,7 +1040,7 @@
         <w:t>Collaborative (source 6).</w:t>
       </w:r>
       <w:r>
-        <w:t xml:space="preserve"> A BPR matrix-factorization model adds each warm user's top-200 tracks; cold sessions simply receive nothing from this source and the pipeline degrades gracefully.</w:t>
+        <w:t xml:space="preserve"> The competition-provided BPR matrix-factorization embeddings add each warm user's top-200 tracks; cold sessions simply receive nothing from this source and the pipeline degrades gracefully.</w:t>
       </w:r>
     </w:p>
     <w:p>
@@ -1177,7 +1177,7 @@
         <w:pStyle w:val="Para"/>
       </w:pPr>
       <w:r>
-        <w:t>We train with MultipleNegativesRankingLoss (InfoNCE with in-batch negatives) plus two to three explicit hard negatives per row (Section 3.3): 3 epochs, effective batch 32, learning rate 1e-4. Training uses ~74K anchor/positive pairs, excluding the 6,000 sessions reserved for the ranker's feature dump. At serving time we ship a 7 MB LoRA adapter applied to the cached base encoder, and query a one-pass 47,071 x 768 track index by brute-force matmul.</w:t>
+        <w:t>We train with MultipleNegativesRankingLoss (InfoNCE with in-batch negatives) plus two explicit hard negatives per row (Section 3.3): 3 epochs, effective batch 32, learning rate 1e-4. Training uses ~46K anchor/positive pairs (plus a 7K-pair validation split), excluding the 6,000 sessions reserved for the ranker's feature dump. At serving time we ship a 7 MB LoRA adapter applied to the cached base encoder, and query a one-pass 47,071 x 768 track index by brute-force matmul.</w:t>
       </w:r>
     </w:p>
     <w:p>
@@ -1263,7 +1263,7 @@
         <w:rPr>
           <w:b/>
         </w:rPr>
-        <w:t>Second, stop treating rejected tracks as positives.</w:t>
+        <w:t>Second, stop rewarding rejected tracks.</w:t>
       </w:r>
       <w:r>
         <w:t xml:space="preserve"> After alignment, 43.2% of turns carry a gold track the user </w:t>
@@ -1284,7 +1284,7 @@
         <w:t>DOES_NOT_MOVE_TOWARD_GOAL</w:t>
       </w:r>
       <w:r>
-        <w:t xml:space="preserve">). Training these as positives teaches both models to rank rejected tracks highly. We use them differently: the ranker </w:t>
+        <w:t xml:space="preserve">). Training these as ordinary positives teaches the models to rank rejected tracks highly. The ranker </w:t>
       </w:r>
       <w:r>
         <w:rPr>
@@ -1293,7 +1293,7 @@
         <w:t>drops</w:t>
       </w:r>
       <w:r>
-        <w:t xml:space="preserve"> such turns (a rejected track is not a valid positive), while the retriever keeps the rejected track as a </w:t>
+        <w:t xml:space="preserve"> such turns entirely (a rejected track is not a valid positive). The retriever additionally recycles every rejected track as a </w:t>
       </w:r>
       <w:r>
         <w:rPr>
@@ -1302,7 +1302,7 @@
         <w:t>hard negative</w:t>
       </w:r>
       <w:r>
-        <w:t xml:space="preserve"> for that session, exactly the near-miss the encoder should learn to push away. We prioritize confirmed session rejections, then BM25 near-misses, then same-artist distractors, then in-batch negatives, and never sample an accepted track as a negative.</w:t>
+        <w:t xml:space="preserve"> for the rest of that session, exactly the near-miss the encoder should learn to push away: negatives are drawn in priority order from confirmed session rejections, then BM25 near-misses, then same-artist distractors, then in-batch negatives, and an accepted track is never sampled as a negative.</w:t>
       </w:r>
     </w:p>
     <w:p>
@@ -1373,7 +1373,7 @@
         <w:t>decouples recall from precision</w:t>
       </w:r>
       <w:r>
-        <w:t>, absorbs heterogeneous features (cosines, ranks, count tables, metadata, session counters), and handles extreme imbalance natively (one positive per ~3,100 candidates) via pairwise gradients within each turn's group. Training runs the full retrieval in dump mode on 6,000 held-out sessions, yielding 24,718 groups and 77.7M rows (positive rate 0.00035); the model has 67 features (5-fold session CV nDCG@20 = 0.3144) and is a 0.6 MB file. The features fall into six groups (Table 2). Group B dominates: multi-source agreement accounts for roughly 57% of total model gain and is the feature that transfers best when goal and GPA are withheld on the blind set.</w:t>
+        <w:t>, absorbs heterogeneous features (cosines, ranks, count tables, metadata, session counters), and handles extreme imbalance natively (one positive per ~3,300 candidates) via pairwise gradients within each turn's group. Training runs the full retrieval in dump mode on 6,000 held-out sessions, yielding 27,166 groups and 89.7M rows; the 8.2% of groups whose gold track the pool missed carry no positive and are dropped, leaving 24,951 training groups. The model has 67 features (5-fold session CV nDCG@20 = 0.3144) and is a 0.6 MB file. The features fall into six groups (Table 2). Group B dominates: multi-source agreement accounts for roughly 57% of total model gain and is the feature that transfers best when goal and GPA are withheld on the blind set.</w:t>
       </w:r>
     </w:p>
     <w:p>
@@ -2093,7 +2093,7 @@
         <w:t>2.17 s per session, about 0.27 s per turn</w:t>
       </w:r>
       <w:r>
-        <w:t xml:space="preserve"> (Table 4, bottom). Of this, the rescore stage is negligible: scoring the ~3,100-candidate pool with LambdaMART takes 3.4 ms, roughly 1% of turn latency, so recall (the nine sources and their two query-encoder passes) accounts for essentially all of it. Even with every neural block pinned to the CPU (Table 4, top), a full turn stays under one second; dropping the frozen Qwen3-0.6B encoder in the eight-source configuration removes the single largest cost. The trained artifact is a 24 MB LoRA adapter and the serving process fits in under ~2 GB of RAM, so the entire train/evaluate/iterate loop, including the one LoRA fine-tune, runs on a single 16 GB desktop, which is what made rapid iteration practical.</w:t>
+        <w:t xml:space="preserve"> (Table 4, bottom). Of this, the rescore stage is negligible: scoring the ~3,300-candidate pool with LambdaMART takes ~3.4 ms, roughly 1% of turn latency, so recall (the nine sources and their two query-encoder passes) accounts for essentially all of it. Even with every neural block pinned to the CPU (Table 4, top), a full turn stays under one second; dropping the frozen Qwen3-0.6B encoder in the eight-source configuration removes the single largest cost. The trained artifact is a 24 MB LoRA adapter and the serving process fits in under ~2 GB of RAM, so the entire train/evaluate/iterate loop, including the one LoRA fine-tune, runs on a single 16 GB desktop, which is what made rapid iteration practical.</w:t>
       </w:r>
     </w:p>
     <w:p>

</xml_diff>

<commit_message>
docs: competitor systems writeup + ACM sigconf paper.tex
Document volart and niwatori competitor architectures against our own
recall-fusion/LTR/dialogue-encoder system in wiki/COMPETITOR_SYSTEMS.md.

Add paper_wikis/paper.tex as a full ACM sigconf translation of
paper_draft.md (author/affiliation and rights-block placeholders remain
open pending submission details).

Reframe abstract and conclusion so the goal-progress feedback signal fix
is presented alongside the other contributions (recall fusion, LoRA
dialogue encoder, LTR rescoring) rather than as the paper's single
headline finding.

Co-Authored-By: Claude Opus 4.8 <noreply@anthropic.com>
</commit_message>
<xml_diff>
--- a/paper_wikis/paper.docx
+++ b/paper_wikis/paper.docx
@@ -39,7 +39,7 @@
         <w:pStyle w:val="Abstract"/>
       </w:pPr>
       <w:r>
-        <w:t>We present a conversational music recommender for the TalkPlayData Challenge (ACM RecSys 2026) that, at each dialogue turn, ranks tracks from a 47,071-track catalog and generates the assistant response, and that trains and serves entirely on a single consumer desktop with no discrete GPU. Retrieval is a union of nine inexpensive sources whose candidates are arbitrated by a gradient-boosted learning-to-rank model over 67 features; the strongest feature is simply how many sources agree on a candidate. The only trained neural component is a LoRA adaptation of a 279M-parameter multilingual encoder over a role-tagged dialogue anchor. Our central finding is that the dataset's goal-progress feedback signal is both misaligned in time and contaminated with user-rejected tracks, that fixing it is the highest-value step in the project, and that the same signal can be reconstructed from raw dialogue when it is withheld at test time. The system reaches a composite score of 0.49 on the blind generalization set.</w:t>
+        <w:t>We present a conversational music recommender for the TalkPlayData Challenge (ACM RecSys 2026) that, at each dialogue turn, ranks tracks from a 47,071-track catalog and generates the assistant response, and that trains and serves entirely on a single consumer desktop with no discrete GPU. Retrieval is a union of nine inexpensive sources whose candidates are arbitrated by a gradient-boosted learning-to-rank model over 67 features; the strongest feature is simply how many sources agree on a candidate. The only trained neural component is a LoRA adaptation of a 279M-parameter multilingual encoder over a role-tagged dialogue anchor that encodes prior turns, recommendations, and per-turn user reactions. We further identify and correct a timing misalignment and rejected-track contamination in the dataset's goal-progress feedback signal, and show the same signal can be reconstructed from raw dialogue when it is withheld at test time. The system reaches a composite score of 0.49 on the blind generalization set.</w:t>
       </w:r>
     </w:p>
     <w:p>
@@ -2543,7 +2543,7 @@
         <w:pStyle w:val="Para"/>
       </w:pPr>
       <w:r>
-        <w:t>A conversational music recommender need not use a GPU cluster or a per-candidate neural reranker to be competitive. Fusing many inexpensive retrievers, letting a gradient-boosted ranker arbitrate them, and adding a single LoRA-adapted dialogue encoder reaches composite 0.49 on the blind set while training and serving on one desktop. The largest gains came from data hygiene rather than model capacity, and in particular from correctly handling a goal-progress feedback signal that is off-by-one in time, contaminated with rejected tracks, and absent at test time.</w:t>
+        <w:t>A conversational music recommender need not use a GPU cluster or a per-candidate neural reranker to be competitive. Fusing many inexpensive retrievers, letting a gradient-boosted ranker arbitrate them, adding a single LoRA-adapted dialogue encoder, and correctly handling a goal-progress feedback signal that is off-by-one in time, contaminated with rejected tracks, and absent at test time together reach composite 0.49 on the blind set while training and serving on one desktop.</w:t>
       </w:r>
     </w:p>
     <w:p>

</xml_diff>

<commit_message>
docs: pivot paper to preference-elicitation framing, add failure/category analysis, fix table formatting
Reframe title/abstract/keywords/contributions/conclusion toward RecSys 2026's
multi-turn preference elicitation topic (no-GPU detail kept as supporting
material, not the headline). Add Section 5.1 (reranking failures, hard-negative
regression, dev-vs-blind divergence) and 5.2 (goal-category behavior with real
dev-set examples) as secondary dissection material. Fix leaked LaTeX macros in
the markdown source and give the docx builder real table styling: per-table
column widths, numeric-column alignment, shaded headers, booktabs-style rules.
</commit_message>
<xml_diff>
--- a/paper_wikis/paper.docx
+++ b/paper_wikis/paper.docx
@@ -7,7 +7,7 @@
         <w:pStyle w:val="Titledocument"/>
       </w:pPr>
       <w:r>
-        <w:t>A CPU-Scale Conversational Music Recommender: Fused Retrieval and Learned Ranking for the TalkPlayData Challenge</w:t>
+        <w:t>Multi-Turn Preference Elicitation in Dialogue-Aware Music Recommendation: Fused Retrieval and Learned Ranking for the TalkPlayData Challenge</w:t>
       </w:r>
     </w:p>
     <w:p>
@@ -39,7 +39,7 @@
         <w:pStyle w:val="Abstract"/>
       </w:pPr>
       <w:r>
-        <w:t>We present a conversational music recommender for the TalkPlayData Challenge (ACM RecSys 2026) that, at each dialogue turn, ranks tracks from a 47,071-track catalog and generates the assistant response, and that trains and serves entirely on a single consumer desktop with no discrete GPU. Retrieval is a union of nine inexpensive sources whose candidates are arbitrated by a gradient-boosted learning-to-rank model over 67 features; the strongest feature is simply how many sources agree on a candidate. The only trained neural component is a LoRA adaptation of a 279M-parameter multilingual encoder over a role-tagged dialogue anchor that encodes prior turns, recommendations, and per-turn user reactions. We further identify and correct a timing misalignment and rejected-track contamination in the dataset's goal-progress feedback signal, and show the same signal can be reconstructed from raw dialogue when it is withheld at test time. The system reaches a composite score of 0.49 on the blind generalization set.</w:t>
+        <w:t>We present a conversational music recommender for the TalkPlayData Challenge (ACM RecSys 2026) that treats each dialogue turn's user reactions as a preference- elicitation signal for both retrieval and ranking. The dataset's goal-progress feedback is delayed by one turn and includes rejected tracks logged as if they were positives; we align the signal in time, remove rejected-track contamination from training, and reconstruct it from raw dialogue when it is withheld at test time. This signal drives a role-tagged dialogue anchor -- encoding prior turns, recommendations, and per-turn reactions -- behind a LoRA fine-tune of a 279M-parameter multilingual encoder, the system's only trained neural component. Retrieval around this anchor is a union of nine inexpensive sources arbitrated by a gradient-boosted learning-to-rank model over 67 features, with multi-source agreement the strongest single feature. The full pipeline trains and serves on a single consumer desktop with no discrete GPU, and reaches a composite score of 0.49 on the blind generalization set.</w:t>
       </w:r>
     </w:p>
     <w:p>
@@ -71,7 +71,7 @@
         <w:pStyle w:val="KeyWords"/>
       </w:pPr>
       <w:r>
-        <w:t>conversational recommendation, music recommendation, learning to rank, dense retrieval, LoRA fine-tuning, preference elicitation, CPU-scale systems</w:t>
+        <w:t>multi-turn preference elicitation, dialogue-aware recommendation, conversational recommendation, music recommendation, learning to rank, dense retrieval, LoRA fine-tuning, CPU-only inference</w:t>
       </w:r>
     </w:p>
     <w:p>
@@ -160,7 +160,16 @@
         <w:t>Contributions.</w:t>
       </w:r>
       <w:r>
-        <w:t xml:space="preserve"> (1) A recall design that treats retrieval as </w:t>
+        <w:t xml:space="preserve"> (1) A treatment of the goal-progress feedback signal that is off-by-one in time and contaminated with rejected tracks: we align it, decontaminate it, and reconstruct it from raw dialogue when it is withheld at test time. (2) A structured, role-tagged dialogue anchor that encodes prior turns, recommendations, and per-turn reactions as explicit fields, paired with a priority-ordered hard-negative recipe that recycles confirmed session rejections as training negatives. (3) A dialogue-aware retriever: a LoRA fine-tune of </w:t>
+      </w:r>
+      <w:r>
+        <w:rPr>
+          <w:rFonts w:ascii="Courier New" w:hAnsi="Courier New"/>
+        </w:rPr>
+        <w:t>multilingual-e5-base</w:t>
+      </w:r>
+      <w:r>
+        <w:t xml:space="preserve"> over that anchor, combining (1) and (2) into a single trained artifact. (4) A recall design that treats retrieval as </w:t>
       </w:r>
       <w:r>
         <w:rPr>
@@ -169,16 +178,7 @@
         <w:t>set union, not weighted fusion</w:t>
       </w:r>
       <w:r>
-        <w:t xml:space="preserve">: each source contributes candidates and per-source features, and a learned ranker decides how far to trust each; multi-source agreement is the single strongest feature. (2) A dialogue-aware retriever: a LoRA fine-tune of </w:t>
-      </w:r>
-      <w:r>
-        <w:rPr>
-          <w:rFonts w:ascii="Courier New" w:hAnsi="Courier New"/>
-        </w:rPr>
-        <w:t>multilingual-e5-base</w:t>
-      </w:r>
-      <w:r>
-        <w:t xml:space="preserve"> over a role-tagged anchor encoding prior turns, recommendations, and per-turn reactions. (3) A treatment of the goal-progress feedback signal that is off-by-one in time and contaminated with rejected tracks, plus a test-time reconstruction of that signal from raw dialogue.</w:t>
+        <w:t>: each source contributes candidates and per-source features, and a learned ranker decides how far to trust each; multi-source agreement is the single strongest feature.</w:t>
       </w:r>
     </w:p>
     <w:p>
@@ -216,22 +216,40 @@
     </w:p>
     <w:tbl>
       <w:tblPr>
-        <w:tblStyle w:val="TableGrid"/>
         <w:tblW w:type="auto" w:w="0"/>
         <w:tblLook w:firstColumn="1" w:firstRow="1" w:lastColumn="0" w:lastRow="0" w:noHBand="0" w:noVBand="1" w:val="04A0"/>
+        <w:tblCellMar>
+          <w:top w:w="40" w:type="dxa"/>
+          <w:left w:w="100" w:type="dxa"/>
+          <w:bottom w:w="40" w:type="dxa"/>
+          <w:right w:w="100" w:type="dxa"/>
+        </w:tblCellMar>
+        <w:jc w:val="center"/>
+        <w:tblLayout w:type="fixed"/>
       </w:tblPr>
       <w:tblGrid>
-        <w:gridCol w:w="2520"/>
-        <w:gridCol w:w="2520"/>
-        <w:gridCol w:w="2520"/>
-        <w:gridCol w:w="2520"/>
+        <w:gridCol w:w="720"/>
+        <w:gridCol w:w="2304"/>
+        <w:gridCol w:w="1872"/>
+        <w:gridCol w:w="5184"/>
       </w:tblGrid>
       <w:tr>
-        <w:tc>
-          <w:tcPr>
-            <w:tcW w:type="dxa" w:w="2520"/>
-          </w:tcPr>
-          <w:p>
+        <w:trPr>
+          <w:tblHeader w:val="true"/>
+        </w:trPr>
+        <w:tc>
+          <w:tcPr>
+            <w:tcW w:type="dxa" w:w="720"/>
+            <w:shd w:val="clear" w:color="auto" w:fill="E7E7E7"/>
+            <w:tcBorders>
+              <w:top w:val="single" w:sz="12" w:space="0" w:color="000000"/>
+              <w:bottom w:val="single" w:sz="4" w:space="0" w:color="000000"/>
+            </w:tcBorders>
+          </w:tcPr>
+          <w:p>
+            <w:pPr>
+              <w:jc w:val="center"/>
+            </w:pPr>
             <w:r/>
             <w:r>
               <w:rPr>
@@ -244,9 +262,17 @@
         </w:tc>
         <w:tc>
           <w:tcPr>
-            <w:tcW w:type="dxa" w:w="2520"/>
-          </w:tcPr>
-          <w:p>
+            <w:tcW w:type="dxa" w:w="2304"/>
+            <w:shd w:val="clear" w:color="auto" w:fill="E7E7E7"/>
+            <w:tcBorders>
+              <w:top w:val="single" w:sz="12" w:space="0" w:color="000000"/>
+              <w:bottom w:val="single" w:sz="4" w:space="0" w:color="000000"/>
+            </w:tcBorders>
+          </w:tcPr>
+          <w:p>
+            <w:pPr>
+              <w:jc w:val="left"/>
+            </w:pPr>
             <w:r/>
             <w:r>
               <w:rPr>
@@ -259,9 +285,17 @@
         </w:tc>
         <w:tc>
           <w:tcPr>
-            <w:tcW w:type="dxa" w:w="2520"/>
-          </w:tcPr>
-          <w:p>
+            <w:tcW w:type="dxa" w:w="1872"/>
+            <w:shd w:val="clear" w:color="auto" w:fill="E7E7E7"/>
+            <w:tcBorders>
+              <w:top w:val="single" w:sz="12" w:space="0" w:color="000000"/>
+              <w:bottom w:val="single" w:sz="4" w:space="0" w:color="000000"/>
+            </w:tcBorders>
+          </w:tcPr>
+          <w:p>
+            <w:pPr>
+              <w:jc w:val="center"/>
+            </w:pPr>
             <w:r/>
             <w:r>
               <w:rPr>
@@ -274,9 +308,17 @@
         </w:tc>
         <w:tc>
           <w:tcPr>
-            <w:tcW w:type="dxa" w:w="2520"/>
-          </w:tcPr>
-          <w:p>
+            <w:tcW w:type="dxa" w:w="5184"/>
+            <w:shd w:val="clear" w:color="auto" w:fill="E7E7E7"/>
+            <w:tcBorders>
+              <w:top w:val="single" w:sz="12" w:space="0" w:color="000000"/>
+              <w:bottom w:val="single" w:sz="4" w:space="0" w:color="000000"/>
+            </w:tcBorders>
+          </w:tcPr>
+          <w:p>
+            <w:pPr>
+              <w:jc w:val="left"/>
+            </w:pPr>
             <w:r/>
             <w:r>
               <w:rPr>
@@ -291,9 +333,12 @@
       <w:tr>
         <w:tc>
           <w:tcPr>
-            <w:tcW w:type="dxa" w:w="2520"/>
-          </w:tcPr>
-          <w:p>
+            <w:tcW w:type="dxa" w:w="720"/>
+          </w:tcPr>
+          <w:p>
+            <w:pPr>
+              <w:jc w:val="center"/>
+            </w:pPr>
             <w:r>
               <w:rPr>
                 <w:sz w:val="18"/>
@@ -309,9 +354,12 @@
         </w:tc>
         <w:tc>
           <w:tcPr>
-            <w:tcW w:type="dxa" w:w="2520"/>
-          </w:tcPr>
-          <w:p>
+            <w:tcW w:type="dxa" w:w="2304"/>
+          </w:tcPr>
+          <w:p>
+            <w:pPr>
+              <w:jc w:val="left"/>
+            </w:pPr>
             <w:r>
               <w:rPr>
                 <w:sz w:val="18"/>
@@ -327,9 +375,12 @@
         </w:tc>
         <w:tc>
           <w:tcPr>
-            <w:tcW w:type="dxa" w:w="2520"/>
-          </w:tcPr>
-          <w:p>
+            <w:tcW w:type="dxa" w:w="1872"/>
+          </w:tcPr>
+          <w:p>
+            <w:pPr>
+              <w:jc w:val="center"/>
+            </w:pPr>
             <w:r>
               <w:rPr>
                 <w:sz w:val="18"/>
@@ -345,9 +396,12 @@
         </w:tc>
         <w:tc>
           <w:tcPr>
-            <w:tcW w:type="dxa" w:w="2520"/>
-          </w:tcPr>
-          <w:p>
+            <w:tcW w:type="dxa" w:w="5184"/>
+          </w:tcPr>
+          <w:p>
+            <w:pPr>
+              <w:jc w:val="left"/>
+            </w:pPr>
             <w:r>
               <w:rPr>
                 <w:sz w:val="18"/>
@@ -365,9 +419,12 @@
       <w:tr>
         <w:tc>
           <w:tcPr>
-            <w:tcW w:type="dxa" w:w="2520"/>
-          </w:tcPr>
-          <w:p>
+            <w:tcW w:type="dxa" w:w="720"/>
+          </w:tcPr>
+          <w:p>
+            <w:pPr>
+              <w:jc w:val="center"/>
+            </w:pPr>
             <w:r>
               <w:rPr>
                 <w:sz w:val="18"/>
@@ -383,9 +440,12 @@
         </w:tc>
         <w:tc>
           <w:tcPr>
-            <w:tcW w:type="dxa" w:w="2520"/>
-          </w:tcPr>
-          <w:p>
+            <w:tcW w:type="dxa" w:w="2304"/>
+          </w:tcPr>
+          <w:p>
+            <w:pPr>
+              <w:jc w:val="left"/>
+            </w:pPr>
             <w:r>
               <w:rPr>
                 <w:sz w:val="18"/>
@@ -401,9 +461,12 @@
         </w:tc>
         <w:tc>
           <w:tcPr>
-            <w:tcW w:type="dxa" w:w="2520"/>
-          </w:tcPr>
-          <w:p>
+            <w:tcW w:type="dxa" w:w="1872"/>
+          </w:tcPr>
+          <w:p>
+            <w:pPr>
+              <w:jc w:val="center"/>
+            </w:pPr>
             <w:r>
               <w:rPr>
                 <w:sz w:val="18"/>
@@ -419,9 +482,12 @@
         </w:tc>
         <w:tc>
           <w:tcPr>
-            <w:tcW w:type="dxa" w:w="2520"/>
-          </w:tcPr>
-          <w:p>
+            <w:tcW w:type="dxa" w:w="5184"/>
+          </w:tcPr>
+          <w:p>
+            <w:pPr>
+              <w:jc w:val="left"/>
+            </w:pPr>
             <w:r>
               <w:rPr>
                 <w:sz w:val="18"/>
@@ -439,9 +505,12 @@
       <w:tr>
         <w:tc>
           <w:tcPr>
-            <w:tcW w:type="dxa" w:w="2520"/>
-          </w:tcPr>
-          <w:p>
+            <w:tcW w:type="dxa" w:w="720"/>
+          </w:tcPr>
+          <w:p>
+            <w:pPr>
+              <w:jc w:val="center"/>
+            </w:pPr>
             <w:r>
               <w:rPr>
                 <w:sz w:val="18"/>
@@ -457,9 +526,12 @@
         </w:tc>
         <w:tc>
           <w:tcPr>
-            <w:tcW w:type="dxa" w:w="2520"/>
-          </w:tcPr>
-          <w:p>
+            <w:tcW w:type="dxa" w:w="2304"/>
+          </w:tcPr>
+          <w:p>
+            <w:pPr>
+              <w:jc w:val="left"/>
+            </w:pPr>
             <w:r>
               <w:rPr>
                 <w:sz w:val="18"/>
@@ -475,9 +547,12 @@
         </w:tc>
         <w:tc>
           <w:tcPr>
-            <w:tcW w:type="dxa" w:w="2520"/>
-          </w:tcPr>
-          <w:p>
+            <w:tcW w:type="dxa" w:w="1872"/>
+          </w:tcPr>
+          <w:p>
+            <w:pPr>
+              <w:jc w:val="center"/>
+            </w:pPr>
             <w:r>
               <w:rPr>
                 <w:sz w:val="18"/>
@@ -493,9 +568,12 @@
         </w:tc>
         <w:tc>
           <w:tcPr>
-            <w:tcW w:type="dxa" w:w="2520"/>
-          </w:tcPr>
-          <w:p>
+            <w:tcW w:type="dxa" w:w="5184"/>
+          </w:tcPr>
+          <w:p>
+            <w:pPr>
+              <w:jc w:val="left"/>
+            </w:pPr>
             <w:r>
               <w:rPr>
                 <w:sz w:val="18"/>
@@ -513,9 +591,12 @@
       <w:tr>
         <w:tc>
           <w:tcPr>
-            <w:tcW w:type="dxa" w:w="2520"/>
-          </w:tcPr>
-          <w:p>
+            <w:tcW w:type="dxa" w:w="720"/>
+          </w:tcPr>
+          <w:p>
+            <w:pPr>
+              <w:jc w:val="center"/>
+            </w:pPr>
             <w:r>
               <w:rPr>
                 <w:sz w:val="18"/>
@@ -531,9 +612,12 @@
         </w:tc>
         <w:tc>
           <w:tcPr>
-            <w:tcW w:type="dxa" w:w="2520"/>
-          </w:tcPr>
-          <w:p>
+            <w:tcW w:type="dxa" w:w="2304"/>
+          </w:tcPr>
+          <w:p>
+            <w:pPr>
+              <w:jc w:val="left"/>
+            </w:pPr>
             <w:r>
               <w:rPr>
                 <w:sz w:val="18"/>
@@ -549,9 +633,12 @@
         </w:tc>
         <w:tc>
           <w:tcPr>
-            <w:tcW w:type="dxa" w:w="2520"/>
-          </w:tcPr>
-          <w:p>
+            <w:tcW w:type="dxa" w:w="1872"/>
+          </w:tcPr>
+          <w:p>
+            <w:pPr>
+              <w:jc w:val="center"/>
+            </w:pPr>
             <w:r>
               <w:rPr>
                 <w:sz w:val="18"/>
@@ -567,9 +654,12 @@
         </w:tc>
         <w:tc>
           <w:tcPr>
-            <w:tcW w:type="dxa" w:w="2520"/>
-          </w:tcPr>
-          <w:p>
+            <w:tcW w:type="dxa" w:w="5184"/>
+          </w:tcPr>
+          <w:p>
+            <w:pPr>
+              <w:jc w:val="left"/>
+            </w:pPr>
             <w:r>
               <w:rPr>
                 <w:sz w:val="18"/>
@@ -587,9 +677,12 @@
       <w:tr>
         <w:tc>
           <w:tcPr>
-            <w:tcW w:type="dxa" w:w="2520"/>
-          </w:tcPr>
-          <w:p>
+            <w:tcW w:type="dxa" w:w="720"/>
+          </w:tcPr>
+          <w:p>
+            <w:pPr>
+              <w:jc w:val="center"/>
+            </w:pPr>
             <w:r>
               <w:rPr>
                 <w:sz w:val="18"/>
@@ -605,9 +698,12 @@
         </w:tc>
         <w:tc>
           <w:tcPr>
-            <w:tcW w:type="dxa" w:w="2520"/>
-          </w:tcPr>
-          <w:p>
+            <w:tcW w:type="dxa" w:w="2304"/>
+          </w:tcPr>
+          <w:p>
+            <w:pPr>
+              <w:jc w:val="left"/>
+            </w:pPr>
             <w:r>
               <w:rPr>
                 <w:sz w:val="18"/>
@@ -623,9 +719,12 @@
         </w:tc>
         <w:tc>
           <w:tcPr>
-            <w:tcW w:type="dxa" w:w="2520"/>
-          </w:tcPr>
-          <w:p>
+            <w:tcW w:type="dxa" w:w="1872"/>
+          </w:tcPr>
+          <w:p>
+            <w:pPr>
+              <w:jc w:val="center"/>
+            </w:pPr>
             <w:r>
               <w:rPr>
                 <w:sz w:val="18"/>
@@ -641,9 +740,12 @@
         </w:tc>
         <w:tc>
           <w:tcPr>
-            <w:tcW w:type="dxa" w:w="2520"/>
-          </w:tcPr>
-          <w:p>
+            <w:tcW w:type="dxa" w:w="5184"/>
+          </w:tcPr>
+          <w:p>
+            <w:pPr>
+              <w:jc w:val="left"/>
+            </w:pPr>
             <w:r>
               <w:rPr>
                 <w:sz w:val="18"/>
@@ -661,9 +763,12 @@
       <w:tr>
         <w:tc>
           <w:tcPr>
-            <w:tcW w:type="dxa" w:w="2520"/>
-          </w:tcPr>
-          <w:p>
+            <w:tcW w:type="dxa" w:w="720"/>
+          </w:tcPr>
+          <w:p>
+            <w:pPr>
+              <w:jc w:val="center"/>
+            </w:pPr>
             <w:r>
               <w:rPr>
                 <w:sz w:val="18"/>
@@ -679,9 +784,12 @@
         </w:tc>
         <w:tc>
           <w:tcPr>
-            <w:tcW w:type="dxa" w:w="2520"/>
-          </w:tcPr>
-          <w:p>
+            <w:tcW w:type="dxa" w:w="2304"/>
+          </w:tcPr>
+          <w:p>
+            <w:pPr>
+              <w:jc w:val="left"/>
+            </w:pPr>
             <w:r>
               <w:rPr>
                 <w:sz w:val="18"/>
@@ -697,9 +805,12 @@
         </w:tc>
         <w:tc>
           <w:tcPr>
-            <w:tcW w:type="dxa" w:w="2520"/>
-          </w:tcPr>
-          <w:p>
+            <w:tcW w:type="dxa" w:w="1872"/>
+          </w:tcPr>
+          <w:p>
+            <w:pPr>
+              <w:jc w:val="center"/>
+            </w:pPr>
             <w:r>
               <w:rPr>
                 <w:sz w:val="18"/>
@@ -715,9 +826,12 @@
         </w:tc>
         <w:tc>
           <w:tcPr>
-            <w:tcW w:type="dxa" w:w="2520"/>
-          </w:tcPr>
-          <w:p>
+            <w:tcW w:type="dxa" w:w="5184"/>
+          </w:tcPr>
+          <w:p>
+            <w:pPr>
+              <w:jc w:val="left"/>
+            </w:pPr>
             <w:r>
               <w:rPr>
                 <w:sz w:val="18"/>
@@ -735,9 +849,12 @@
       <w:tr>
         <w:tc>
           <w:tcPr>
-            <w:tcW w:type="dxa" w:w="2520"/>
-          </w:tcPr>
-          <w:p>
+            <w:tcW w:type="dxa" w:w="720"/>
+          </w:tcPr>
+          <w:p>
+            <w:pPr>
+              <w:jc w:val="center"/>
+            </w:pPr>
             <w:r>
               <w:rPr>
                 <w:sz w:val="18"/>
@@ -753,9 +870,12 @@
         </w:tc>
         <w:tc>
           <w:tcPr>
-            <w:tcW w:type="dxa" w:w="2520"/>
-          </w:tcPr>
-          <w:p>
+            <w:tcW w:type="dxa" w:w="2304"/>
+          </w:tcPr>
+          <w:p>
+            <w:pPr>
+              <w:jc w:val="left"/>
+            </w:pPr>
             <w:r>
               <w:rPr>
                 <w:sz w:val="18"/>
@@ -771,9 +891,12 @@
         </w:tc>
         <w:tc>
           <w:tcPr>
-            <w:tcW w:type="dxa" w:w="2520"/>
-          </w:tcPr>
-          <w:p>
+            <w:tcW w:type="dxa" w:w="1872"/>
+          </w:tcPr>
+          <w:p>
+            <w:pPr>
+              <w:jc w:val="center"/>
+            </w:pPr>
             <w:r>
               <w:rPr>
                 <w:sz w:val="18"/>
@@ -789,9 +912,12 @@
         </w:tc>
         <w:tc>
           <w:tcPr>
-            <w:tcW w:type="dxa" w:w="2520"/>
-          </w:tcPr>
-          <w:p>
+            <w:tcW w:type="dxa" w:w="5184"/>
+          </w:tcPr>
+          <w:p>
+            <w:pPr>
+              <w:jc w:val="left"/>
+            </w:pPr>
             <w:r>
               <w:rPr>
                 <w:sz w:val="18"/>
@@ -809,9 +935,12 @@
       <w:tr>
         <w:tc>
           <w:tcPr>
-            <w:tcW w:type="dxa" w:w="2520"/>
-          </w:tcPr>
-          <w:p>
+            <w:tcW w:type="dxa" w:w="720"/>
+          </w:tcPr>
+          <w:p>
+            <w:pPr>
+              <w:jc w:val="center"/>
+            </w:pPr>
             <w:r>
               <w:rPr>
                 <w:sz w:val="18"/>
@@ -827,9 +956,12 @@
         </w:tc>
         <w:tc>
           <w:tcPr>
-            <w:tcW w:type="dxa" w:w="2520"/>
-          </w:tcPr>
-          <w:p>
+            <w:tcW w:type="dxa" w:w="2304"/>
+          </w:tcPr>
+          <w:p>
+            <w:pPr>
+              <w:jc w:val="left"/>
+            </w:pPr>
             <w:r>
               <w:rPr>
                 <w:sz w:val="18"/>
@@ -845,9 +977,12 @@
         </w:tc>
         <w:tc>
           <w:tcPr>
-            <w:tcW w:type="dxa" w:w="2520"/>
-          </w:tcPr>
-          <w:p>
+            <w:tcW w:type="dxa" w:w="1872"/>
+          </w:tcPr>
+          <w:p>
+            <w:pPr>
+              <w:jc w:val="center"/>
+            </w:pPr>
             <w:r>
               <w:rPr>
                 <w:sz w:val="18"/>
@@ -863,9 +998,12 @@
         </w:tc>
         <w:tc>
           <w:tcPr>
-            <w:tcW w:type="dxa" w:w="2520"/>
-          </w:tcPr>
-          <w:p>
+            <w:tcW w:type="dxa" w:w="5184"/>
+          </w:tcPr>
+          <w:p>
+            <w:pPr>
+              <w:jc w:val="left"/>
+            </w:pPr>
             <w:r>
               <w:rPr>
                 <w:sz w:val="18"/>
@@ -883,9 +1021,15 @@
       <w:tr>
         <w:tc>
           <w:tcPr>
-            <w:tcW w:type="dxa" w:w="2520"/>
-          </w:tcPr>
-          <w:p>
+            <w:tcW w:type="dxa" w:w="720"/>
+            <w:tcBorders>
+              <w:bottom w:val="single" w:sz="12" w:space="0" w:color="000000"/>
+            </w:tcBorders>
+          </w:tcPr>
+          <w:p>
+            <w:pPr>
+              <w:jc w:val="center"/>
+            </w:pPr>
             <w:r>
               <w:rPr>
                 <w:sz w:val="18"/>
@@ -901,9 +1045,15 @@
         </w:tc>
         <w:tc>
           <w:tcPr>
-            <w:tcW w:type="dxa" w:w="2520"/>
-          </w:tcPr>
-          <w:p>
+            <w:tcW w:type="dxa" w:w="2304"/>
+            <w:tcBorders>
+              <w:bottom w:val="single" w:sz="12" w:space="0" w:color="000000"/>
+            </w:tcBorders>
+          </w:tcPr>
+          <w:p>
+            <w:pPr>
+              <w:jc w:val="left"/>
+            </w:pPr>
             <w:r>
               <w:rPr>
                 <w:sz w:val="18"/>
@@ -919,9 +1069,15 @@
         </w:tc>
         <w:tc>
           <w:tcPr>
-            <w:tcW w:type="dxa" w:w="2520"/>
-          </w:tcPr>
-          <w:p>
+            <w:tcW w:type="dxa" w:w="1872"/>
+            <w:tcBorders>
+              <w:bottom w:val="single" w:sz="12" w:space="0" w:color="000000"/>
+            </w:tcBorders>
+          </w:tcPr>
+          <w:p>
+            <w:pPr>
+              <w:jc w:val="center"/>
+            </w:pPr>
             <w:r>
               <w:rPr>
                 <w:sz w:val="18"/>
@@ -937,9 +1093,15 @@
         </w:tc>
         <w:tc>
           <w:tcPr>
-            <w:tcW w:type="dxa" w:w="2520"/>
-          </w:tcPr>
-          <w:p>
+            <w:tcW w:type="dxa" w:w="5184"/>
+            <w:tcBorders>
+              <w:bottom w:val="single" w:sz="12" w:space="0" w:color="000000"/>
+            </w:tcBorders>
+          </w:tcPr>
+          <w:p>
+            <w:pPr>
+              <w:jc w:val="left"/>
+            </w:pPr>
             <w:r>
               <w:rPr>
                 <w:sz w:val="18"/>
@@ -1386,42 +1548,2254 @@
     </w:p>
     <w:tbl>
       <w:tblPr>
-        <w:tblStyle w:val="TableGrid"/>
         <w:tblW w:type="auto" w:w="0"/>
         <w:tblLook w:firstColumn="1" w:firstRow="1" w:lastColumn="0" w:lastRow="0" w:noHBand="0" w:noVBand="1" w:val="04A0"/>
+        <w:tblCellMar>
+          <w:top w:w="40" w:type="dxa"/>
+          <w:left w:w="100" w:type="dxa"/>
+          <w:bottom w:w="40" w:type="dxa"/>
+          <w:right w:w="100" w:type="dxa"/>
+        </w:tblCellMar>
+        <w:jc w:val="center"/>
+        <w:tblLayout w:type="fixed"/>
+      </w:tblPr>
+      <w:tblGrid>
+        <w:gridCol w:w="2160"/>
+        <w:gridCol w:w="7920"/>
+      </w:tblGrid>
+      <w:tr>
+        <w:trPr>
+          <w:tblHeader w:val="true"/>
+        </w:trPr>
+        <w:tc>
+          <w:tcPr>
+            <w:tcW w:type="dxa" w:w="2160"/>
+            <w:shd w:val="clear" w:color="auto" w:fill="E7E7E7"/>
+            <w:tcBorders>
+              <w:top w:val="single" w:sz="12" w:space="0" w:color="000000"/>
+              <w:bottom w:val="single" w:sz="4" w:space="0" w:color="000000"/>
+            </w:tcBorders>
+          </w:tcPr>
+          <w:p>
+            <w:pPr>
+              <w:jc w:val="left"/>
+            </w:pPr>
+            <w:r/>
+            <w:r>
+              <w:rPr>
+                <w:b/>
+                <w:sz w:val="18"/>
+              </w:rPr>
+              <w:t>Group</w:t>
+            </w:r>
+          </w:p>
+        </w:tc>
+        <w:tc>
+          <w:tcPr>
+            <w:tcW w:type="dxa" w:w="7920"/>
+            <w:shd w:val="clear" w:color="auto" w:fill="E7E7E7"/>
+            <w:tcBorders>
+              <w:top w:val="single" w:sz="12" w:space="0" w:color="000000"/>
+              <w:bottom w:val="single" w:sz="4" w:space="0" w:color="000000"/>
+            </w:tcBorders>
+          </w:tcPr>
+          <w:p>
+            <w:pPr>
+              <w:jc w:val="left"/>
+            </w:pPr>
+            <w:r/>
+            <w:r>
+              <w:rPr>
+                <w:b/>
+                <w:sz w:val="18"/>
+              </w:rPr>
+              <w:t>Features</w:t>
+            </w:r>
+          </w:p>
+        </w:tc>
+      </w:tr>
+      <w:tr>
+        <w:tc>
+          <w:tcPr>
+            <w:tcW w:type="dxa" w:w="2160"/>
+          </w:tcPr>
+          <w:p>
+            <w:pPr>
+              <w:jc w:val="left"/>
+            </w:pPr>
+            <w:r>
+              <w:rPr>
+                <w:sz w:val="18"/>
+              </w:rPr>
+            </w:r>
+            <w:r>
+              <w:rPr>
+                <w:sz w:val="18"/>
+              </w:rPr>
+              <w:t>A. Retrieval scores</w:t>
+            </w:r>
+          </w:p>
+        </w:tc>
+        <w:tc>
+          <w:tcPr>
+            <w:tcW w:type="dxa" w:w="7920"/>
+          </w:tcPr>
+          <w:p>
+            <w:pPr>
+              <w:jc w:val="left"/>
+            </w:pPr>
+            <w:r>
+              <w:rPr>
+                <w:sz w:val="18"/>
+              </w:rPr>
+            </w:r>
+            <w:r>
+              <w:rPr>
+                <w:sz w:val="18"/>
+              </w:rPr>
+              <w:t>two-tower cosine and rank; Qwen3 metadata and lyrics cosines; CLAP audio cosine; CF cosine; BM25 reciprocal rank; co-occurrence rank</w:t>
+            </w:r>
+          </w:p>
+        </w:tc>
+      </w:tr>
+      <w:tr>
+        <w:tc>
+          <w:tcPr>
+            <w:tcW w:type="dxa" w:w="2160"/>
+          </w:tcPr>
+          <w:p>
+            <w:pPr>
+              <w:jc w:val="left"/>
+            </w:pPr>
+            <w:r>
+              <w:rPr>
+                <w:sz w:val="18"/>
+              </w:rPr>
+            </w:r>
+            <w:r>
+              <w:rPr>
+                <w:sz w:val="18"/>
+              </w:rPr>
+              <w:t>B. Source agreement</w:t>
+            </w:r>
+          </w:p>
+        </w:tc>
+        <w:tc>
+          <w:tcPr>
+            <w:tcW w:type="dxa" w:w="7920"/>
+          </w:tcPr>
+          <w:p>
+            <w:pPr>
+              <w:jc w:val="left"/>
+            </w:pPr>
+            <w:r>
+              <w:rPr>
+                <w:sz w:val="18"/>
+              </w:rPr>
+            </w:r>
+            <w:r>
+              <w:rPr>
+                <w:rFonts w:ascii="Courier New" w:hAnsi="Courier New"/>
+                <w:sz w:val="18"/>
+              </w:rPr>
+              <w:t>n_sources</w:t>
+            </w:r>
+            <w:r>
+              <w:rPr>
+                <w:sz w:val="18"/>
+              </w:rPr>
+              <w:t xml:space="preserve"> and transforms: count of sources returning the candidate; a de-facto ensemble vote</w:t>
+            </w:r>
+          </w:p>
+        </w:tc>
+      </w:tr>
+      <w:tr>
+        <w:tc>
+          <w:tcPr>
+            <w:tcW w:type="dxa" w:w="2160"/>
+          </w:tcPr>
+          <w:p>
+            <w:pPr>
+              <w:jc w:val="left"/>
+            </w:pPr>
+            <w:r>
+              <w:rPr>
+                <w:sz w:val="18"/>
+              </w:rPr>
+            </w:r>
+            <w:r>
+              <w:rPr>
+                <w:sz w:val="18"/>
+              </w:rPr>
+              <w:t>C. Track metadata</w:t>
+            </w:r>
+          </w:p>
+        </w:tc>
+        <w:tc>
+          <w:tcPr>
+            <w:tcW w:type="dxa" w:w="7920"/>
+          </w:tcPr>
+          <w:p>
+            <w:pPr>
+              <w:jc w:val="left"/>
+            </w:pPr>
+            <w:r>
+              <w:rPr>
+                <w:sz w:val="18"/>
+              </w:rPr>
+            </w:r>
+            <w:r>
+              <w:rPr>
+                <w:sz w:val="18"/>
+              </w:rPr>
+              <w:t>popularity percentile; years since release; request-tag overlap</w:t>
+            </w:r>
+          </w:p>
+        </w:tc>
+      </w:tr>
+      <w:tr>
+        <w:tc>
+          <w:tcPr>
+            <w:tcW w:type="dxa" w:w="2160"/>
+          </w:tcPr>
+          <w:p>
+            <w:pPr>
+              <w:jc w:val="left"/>
+            </w:pPr>
+            <w:r>
+              <w:rPr>
+                <w:sz w:val="18"/>
+              </w:rPr>
+            </w:r>
+            <w:r>
+              <w:rPr>
+                <w:sz w:val="18"/>
+              </w:rPr>
+              <w:t>D. Session state (GPA)</w:t>
+            </w:r>
+          </w:p>
+        </w:tc>
+        <w:tc>
+          <w:tcPr>
+            <w:tcW w:type="dxa" w:w="7920"/>
+          </w:tcPr>
+          <w:p>
+            <w:pPr>
+              <w:jc w:val="left"/>
+            </w:pPr>
+            <w:r>
+              <w:rPr>
+                <w:sz w:val="18"/>
+              </w:rPr>
+            </w:r>
+            <w:r>
+              <w:rPr>
+                <w:sz w:val="18"/>
+              </w:rPr>
+              <w:t>cosine to accepted- and to rejected-history centroids; artist-in-rejected-set; accepted/rejected turn counts; consecutive rejections; CF distance to history</w:t>
+            </w:r>
+          </w:p>
+        </w:tc>
+      </w:tr>
+      <w:tr>
+        <w:tc>
+          <w:tcPr>
+            <w:tcW w:type="dxa" w:w="2160"/>
+          </w:tcPr>
+          <w:p>
+            <w:pPr>
+              <w:jc w:val="left"/>
+            </w:pPr>
+            <w:r>
+              <w:rPr>
+                <w:sz w:val="18"/>
+              </w:rPr>
+            </w:r>
+            <w:r>
+              <w:rPr>
+                <w:sz w:val="18"/>
+              </w:rPr>
+              <w:t>E. Intent extraction</w:t>
+            </w:r>
+          </w:p>
+        </w:tc>
+        <w:tc>
+          <w:tcPr>
+            <w:tcW w:type="dxa" w:w="7920"/>
+          </w:tcPr>
+          <w:p>
+            <w:pPr>
+              <w:jc w:val="left"/>
+            </w:pPr>
+            <w:r>
+              <w:rPr>
+                <w:sz w:val="18"/>
+              </w:rPr>
+            </w:r>
+            <w:r>
+              <w:rPr>
+                <w:sz w:val="18"/>
+              </w:rPr>
+              <w:t>era/genre/mood keywords parsed from the request; candidate era/genre match; album continuity; within-artist popularity and transition ranks; bucket-match counts</w:t>
+            </w:r>
+          </w:p>
+        </w:tc>
+      </w:tr>
+      <w:tr>
+        <w:tc>
+          <w:tcPr>
+            <w:tcW w:type="dxa" w:w="2160"/>
+            <w:tcBorders>
+              <w:bottom w:val="single" w:sz="12" w:space="0" w:color="000000"/>
+            </w:tcBorders>
+          </w:tcPr>
+          <w:p>
+            <w:pPr>
+              <w:jc w:val="left"/>
+            </w:pPr>
+            <w:r>
+              <w:rPr>
+                <w:sz w:val="18"/>
+              </w:rPr>
+            </w:r>
+            <w:r>
+              <w:rPr>
+                <w:sz w:val="18"/>
+              </w:rPr>
+              <w:t>F. Sequential ID</w:t>
+            </w:r>
+          </w:p>
+        </w:tc>
+        <w:tc>
+          <w:tcPr>
+            <w:tcW w:type="dxa" w:w="7920"/>
+            <w:tcBorders>
+              <w:bottom w:val="single" w:sz="12" w:space="0" w:color="000000"/>
+            </w:tcBorders>
+          </w:tcPr>
+          <w:p>
+            <w:pPr>
+              <w:jc w:val="left"/>
+            </w:pPr>
+            <w:r>
+              <w:rPr>
+                <w:sz w:val="18"/>
+              </w:rPr>
+            </w:r>
+            <w:r>
+              <w:rPr>
+                <w:sz w:val="18"/>
+              </w:rPr>
+              <w:t>SASRec bucket-origin and rank (optional configuration)</w:t>
+            </w:r>
+          </w:p>
+        </w:tc>
+      </w:tr>
+    </w:tbl>
+    <w:p>
+      <w:pPr>
+        <w:pStyle w:val="Head1"/>
+      </w:pPr>
+      <w:r>
+        <w:t>5 Results</w:t>
+      </w:r>
+    </w:p>
+    <w:p>
+      <w:pPr>
+        <w:pStyle w:val="Para"/>
+      </w:pPr>
+      <w:r>
+        <w:t>Table 3 lists only the changes that moved the development nDCG@20 (1,000 sessions). The two largest single jumps are non-model changes: excluding already-played tracks from BM25 (+0.035), and replacing linear fusion with a learned ranker, which unlocked every later feature. The goal-progress fixes of Section 3.3 account for the final step to 0.1864. On the blind sets the same system scores nDCG@20 = 0.3997 (Blind A) and composite 0.49 (Blind B).</w:t>
+      </w:r>
+    </w:p>
+    <w:p>
+      <w:pPr>
+        <w:pStyle w:val="TableCaption"/>
+      </w:pPr>
+      <w:r>
+        <w:t>Table 3: Development nDCG@20 after each load-bearing change.</w:t>
+      </w:r>
+    </w:p>
+    <w:tbl>
+      <w:tblPr>
+        <w:tblW w:type="auto" w:w="0"/>
+        <w:tblLook w:firstColumn="1" w:firstRow="1" w:lastColumn="0" w:lastRow="0" w:noHBand="0" w:noVBand="1" w:val="04A0"/>
+        <w:tblCellMar>
+          <w:top w:w="40" w:type="dxa"/>
+          <w:left w:w="100" w:type="dxa"/>
+          <w:bottom w:w="40" w:type="dxa"/>
+          <w:right w:w="100" w:type="dxa"/>
+        </w:tblCellMar>
+        <w:jc w:val="center"/>
+        <w:tblLayout w:type="fixed"/>
+      </w:tblPr>
+      <w:tblGrid>
+        <w:gridCol w:w="7776"/>
+        <w:gridCol w:w="2304"/>
+      </w:tblGrid>
+      <w:tr>
+        <w:trPr>
+          <w:tblHeader w:val="true"/>
+        </w:trPr>
+        <w:tc>
+          <w:tcPr>
+            <w:tcW w:type="dxa" w:w="7776"/>
+            <w:shd w:val="clear" w:color="auto" w:fill="E7E7E7"/>
+            <w:tcBorders>
+              <w:top w:val="single" w:sz="12" w:space="0" w:color="000000"/>
+              <w:bottom w:val="single" w:sz="4" w:space="0" w:color="000000"/>
+            </w:tcBorders>
+          </w:tcPr>
+          <w:p>
+            <w:pPr>
+              <w:jc w:val="left"/>
+            </w:pPr>
+            <w:r/>
+            <w:r>
+              <w:rPr>
+                <w:b/>
+                <w:sz w:val="18"/>
+              </w:rPr>
+              <w:t>Change</w:t>
+            </w:r>
+          </w:p>
+        </w:tc>
+        <w:tc>
+          <w:tcPr>
+            <w:tcW w:type="dxa" w:w="2304"/>
+            <w:shd w:val="clear" w:color="auto" w:fill="E7E7E7"/>
+            <w:tcBorders>
+              <w:top w:val="single" w:sz="12" w:space="0" w:color="000000"/>
+              <w:bottom w:val="single" w:sz="4" w:space="0" w:color="000000"/>
+            </w:tcBorders>
+          </w:tcPr>
+          <w:p>
+            <w:pPr>
+              <w:jc w:val="right"/>
+            </w:pPr>
+            <w:r/>
+            <w:r>
+              <w:rPr>
+                <w:b/>
+                <w:sz w:val="18"/>
+              </w:rPr>
+              <w:t>nDCG@20</w:t>
+            </w:r>
+          </w:p>
+        </w:tc>
+      </w:tr>
+      <w:tr>
+        <w:tc>
+          <w:tcPr>
+            <w:tcW w:type="dxa" w:w="7776"/>
+          </w:tcPr>
+          <w:p>
+            <w:pPr>
+              <w:jc w:val="left"/>
+            </w:pPr>
+            <w:r>
+              <w:rPr>
+                <w:sz w:val="18"/>
+              </w:rPr>
+            </w:r>
+            <w:r>
+              <w:rPr>
+                <w:sz w:val="18"/>
+              </w:rPr>
+              <w:t>BM25 over name + artist + album</w:t>
+            </w:r>
+          </w:p>
+        </w:tc>
+        <w:tc>
+          <w:tcPr>
+            <w:tcW w:type="dxa" w:w="2304"/>
+          </w:tcPr>
+          <w:p>
+            <w:pPr>
+              <w:jc w:val="right"/>
+            </w:pPr>
+            <w:r>
+              <w:rPr>
+                <w:sz w:val="18"/>
+              </w:rPr>
+            </w:r>
+            <w:r>
+              <w:rPr>
+                <w:sz w:val="18"/>
+              </w:rPr>
+              <w:t>0.0861</w:t>
+            </w:r>
+          </w:p>
+        </w:tc>
+      </w:tr>
+      <w:tr>
+        <w:tc>
+          <w:tcPr>
+            <w:tcW w:type="dxa" w:w="7776"/>
+          </w:tcPr>
+          <w:p>
+            <w:pPr>
+              <w:jc w:val="left"/>
+            </w:pPr>
+            <w:r>
+              <w:rPr>
+                <w:sz w:val="18"/>
+              </w:rPr>
+            </w:r>
+            <w:r>
+              <w:rPr>
+                <w:sz w:val="18"/>
+              </w:rPr>
+              <w:t>+ index the tag list</w:t>
+            </w:r>
+          </w:p>
+        </w:tc>
+        <w:tc>
+          <w:tcPr>
+            <w:tcW w:type="dxa" w:w="2304"/>
+          </w:tcPr>
+          <w:p>
+            <w:pPr>
+              <w:jc w:val="right"/>
+            </w:pPr>
+            <w:r>
+              <w:rPr>
+                <w:sz w:val="18"/>
+              </w:rPr>
+            </w:r>
+            <w:r>
+              <w:rPr>
+                <w:sz w:val="18"/>
+              </w:rPr>
+              <w:t>0.0960</w:t>
+            </w:r>
+          </w:p>
+        </w:tc>
+      </w:tr>
+      <w:tr>
+        <w:tc>
+          <w:tcPr>
+            <w:tcW w:type="dxa" w:w="7776"/>
+          </w:tcPr>
+          <w:p>
+            <w:pPr>
+              <w:jc w:val="left"/>
+            </w:pPr>
+            <w:r>
+              <w:rPr>
+                <w:sz w:val="18"/>
+              </w:rPr>
+            </w:r>
+            <w:r>
+              <w:rPr>
+                <w:sz w:val="18"/>
+              </w:rPr>
+              <w:t>+ exclude already-played tracks</w:t>
+            </w:r>
+          </w:p>
+        </w:tc>
+        <w:tc>
+          <w:tcPr>
+            <w:tcW w:type="dxa" w:w="2304"/>
+          </w:tcPr>
+          <w:p>
+            <w:pPr>
+              <w:jc w:val="right"/>
+            </w:pPr>
+            <w:r>
+              <w:rPr>
+                <w:sz w:val="18"/>
+              </w:rPr>
+            </w:r>
+            <w:r>
+              <w:rPr>
+                <w:sz w:val="18"/>
+              </w:rPr>
+              <w:t>0.1313</w:t>
+            </w:r>
+          </w:p>
+        </w:tc>
+      </w:tr>
+      <w:tr>
+        <w:tc>
+          <w:tcPr>
+            <w:tcW w:type="dxa" w:w="7776"/>
+          </w:tcPr>
+          <w:p>
+            <w:pPr>
+              <w:jc w:val="left"/>
+            </w:pPr>
+            <w:r>
+              <w:rPr>
+                <w:sz w:val="18"/>
+              </w:rPr>
+            </w:r>
+            <w:r>
+              <w:rPr>
+                <w:sz w:val="18"/>
+              </w:rPr>
+              <w:t>+ fine-tuned two-tower, linear fusion</w:t>
+            </w:r>
+          </w:p>
+        </w:tc>
+        <w:tc>
+          <w:tcPr>
+            <w:tcW w:type="dxa" w:w="2304"/>
+          </w:tcPr>
+          <w:p>
+            <w:pPr>
+              <w:jc w:val="right"/>
+            </w:pPr>
+            <w:r>
+              <w:rPr>
+                <w:sz w:val="18"/>
+              </w:rPr>
+            </w:r>
+            <w:r>
+              <w:rPr>
+                <w:sz w:val="18"/>
+              </w:rPr>
+              <w:t>0.1418</w:t>
+            </w:r>
+          </w:p>
+        </w:tc>
+      </w:tr>
+      <w:tr>
+        <w:tc>
+          <w:tcPr>
+            <w:tcW w:type="dxa" w:w="7776"/>
+          </w:tcPr>
+          <w:p>
+            <w:pPr>
+              <w:jc w:val="left"/>
+            </w:pPr>
+            <w:r>
+              <w:rPr>
+                <w:sz w:val="18"/>
+              </w:rPr>
+            </w:r>
+            <w:r>
+              <w:rPr>
+                <w:sz w:val="18"/>
+              </w:rPr>
+              <w:t>+ multi-source pool expansion</w:t>
+            </w:r>
+          </w:p>
+        </w:tc>
+        <w:tc>
+          <w:tcPr>
+            <w:tcW w:type="dxa" w:w="2304"/>
+          </w:tcPr>
+          <w:p>
+            <w:pPr>
+              <w:jc w:val="right"/>
+            </w:pPr>
+            <w:r>
+              <w:rPr>
+                <w:sz w:val="18"/>
+              </w:rPr>
+            </w:r>
+            <w:r>
+              <w:rPr>
+                <w:sz w:val="18"/>
+              </w:rPr>
+              <w:t>0.1533</w:t>
+            </w:r>
+          </w:p>
+        </w:tc>
+      </w:tr>
+      <w:tr>
+        <w:tc>
+          <w:tcPr>
+            <w:tcW w:type="dxa" w:w="7776"/>
+          </w:tcPr>
+          <w:p>
+            <w:pPr>
+              <w:jc w:val="left"/>
+            </w:pPr>
+            <w:r>
+              <w:rPr>
+                <w:sz w:val="18"/>
+              </w:rPr>
+            </w:r>
+            <w:r>
+              <w:rPr>
+                <w:sz w:val="18"/>
+              </w:rPr>
+              <w:t>+ LightGBM LambdaMART replaces linear fusion</w:t>
+            </w:r>
+          </w:p>
+        </w:tc>
+        <w:tc>
+          <w:tcPr>
+            <w:tcW w:type="dxa" w:w="2304"/>
+          </w:tcPr>
+          <w:p>
+            <w:pPr>
+              <w:jc w:val="right"/>
+            </w:pPr>
+            <w:r>
+              <w:rPr>
+                <w:sz w:val="18"/>
+              </w:rPr>
+            </w:r>
+            <w:r>
+              <w:rPr>
+                <w:sz w:val="18"/>
+              </w:rPr>
+              <w:t>0.1609</w:t>
+            </w:r>
+          </w:p>
+        </w:tc>
+      </w:tr>
+      <w:tr>
+        <w:tc>
+          <w:tcPr>
+            <w:tcW w:type="dxa" w:w="7776"/>
+          </w:tcPr>
+          <w:p>
+            <w:pPr>
+              <w:jc w:val="left"/>
+            </w:pPr>
+            <w:r>
+              <w:rPr>
+                <w:sz w:val="18"/>
+              </w:rPr>
+            </w:r>
+            <w:r>
+              <w:rPr>
+                <w:sz w:val="18"/>
+              </w:rPr>
+              <w:t>+ feature engineering, larger two-tower pool</w:t>
+            </w:r>
+          </w:p>
+        </w:tc>
+        <w:tc>
+          <w:tcPr>
+            <w:tcW w:type="dxa" w:w="2304"/>
+          </w:tcPr>
+          <w:p>
+            <w:pPr>
+              <w:jc w:val="right"/>
+            </w:pPr>
+            <w:r>
+              <w:rPr>
+                <w:sz w:val="18"/>
+              </w:rPr>
+            </w:r>
+            <w:r>
+              <w:rPr>
+                <w:sz w:val="18"/>
+              </w:rPr>
+              <w:t>0.1684</w:t>
+            </w:r>
+          </w:p>
+        </w:tc>
+      </w:tr>
+      <w:tr>
+        <w:tc>
+          <w:tcPr>
+            <w:tcW w:type="dxa" w:w="7776"/>
+          </w:tcPr>
+          <w:p>
+            <w:pPr>
+              <w:jc w:val="left"/>
+            </w:pPr>
+            <w:r>
+              <w:rPr>
+                <w:sz w:val="18"/>
+              </w:rPr>
+            </w:r>
+            <w:r>
+              <w:rPr>
+                <w:sz w:val="18"/>
+              </w:rPr>
+              <w:t>+ E5 role-tagged dialogue anchor</w:t>
+            </w:r>
+          </w:p>
+        </w:tc>
+        <w:tc>
+          <w:tcPr>
+            <w:tcW w:type="dxa" w:w="2304"/>
+          </w:tcPr>
+          <w:p>
+            <w:pPr>
+              <w:jc w:val="right"/>
+            </w:pPr>
+            <w:r>
+              <w:rPr>
+                <w:sz w:val="18"/>
+              </w:rPr>
+            </w:r>
+            <w:r>
+              <w:rPr>
+                <w:sz w:val="18"/>
+              </w:rPr>
+              <w:t>0.1748</w:t>
+            </w:r>
+          </w:p>
+        </w:tc>
+      </w:tr>
+      <w:tr>
+        <w:tc>
+          <w:tcPr>
+            <w:tcW w:type="dxa" w:w="7776"/>
+            <w:tcBorders>
+              <w:bottom w:val="single" w:sz="12" w:space="0" w:color="000000"/>
+            </w:tcBorders>
+          </w:tcPr>
+          <w:p>
+            <w:pPr>
+              <w:jc w:val="left"/>
+            </w:pPr>
+            <w:r>
+              <w:rPr>
+                <w:sz w:val="18"/>
+              </w:rPr>
+            </w:r>
+            <w:r>
+              <w:rPr>
+                <w:sz w:val="18"/>
+              </w:rPr>
+              <w:t>+ GPA-aware inference and intent features</w:t>
+            </w:r>
+          </w:p>
+        </w:tc>
+        <w:tc>
+          <w:tcPr>
+            <w:tcW w:type="dxa" w:w="2304"/>
+            <w:tcBorders>
+              <w:bottom w:val="single" w:sz="12" w:space="0" w:color="000000"/>
+            </w:tcBorders>
+          </w:tcPr>
+          <w:p>
+            <w:pPr>
+              <w:jc w:val="right"/>
+            </w:pPr>
+            <w:r>
+              <w:rPr>
+                <w:sz w:val="18"/>
+              </w:rPr>
+            </w:r>
+            <w:r>
+              <w:rPr>
+                <w:sz w:val="18"/>
+              </w:rPr>
+              <w:t>0.1864</w:t>
+            </w:r>
+          </w:p>
+        </w:tc>
+      </w:tr>
+    </w:tbl>
+    <w:p>
+      <w:pPr>
+        <w:pStyle w:val="Head2"/>
+      </w:pPr>
+      <w:r>
+        <w:t>5.1 What We Tried and Why It Didn't Work</w:t>
+      </w:r>
+    </w:p>
+    <w:p>
+      <w:pPr>
+        <w:pStyle w:val="Para"/>
+      </w:pPr>
+      <w:r>
+        <w:t>Several directions that looked promising on paper were dropped after measurement. We report them because the reasons they failed are more informative than the numbers in Table 3 alone.</w:t>
+      </w:r>
+    </w:p>
+    <w:p>
+      <w:pPr>
+        <w:pStyle w:val="Para"/>
+      </w:pPr>
+      <w:r>
+        <w:rPr>
+          <w:b/>
+        </w:rPr>
+        <w:t>Reranking on top of LambdaMART.</w:t>
+      </w:r>
+      <w:r>
+        <w:t xml:space="preserve"> Every attempt to re-rank the LambdaMART output with a second, more "semantic" model underperformed the LambdaMART-only baseline (Table 3a). A pre-trained cross-encoder with no TalkPlay fine-tuning underperformed outright. A fine-tuned cross-encoder (bge-reranker-v2-m3, pool-aware negatives) regressed to dev nDCG@20 = 0.1228, a large drop -- but the cause was not the reranking idea itself, it was trained on a stale </w:t>
+      </w:r>
+      <w:r>
+        <w:rPr>
+          <w:rFonts w:ascii="Courier New" w:hAnsi="Courier New"/>
+        </w:rPr>
+        <w:t>[TURN-N]</w:t>
+      </w:r>
+      <w:r>
+        <w:t xml:space="preserve"> anchor format that no longer matched the shipped anchor once the encoder moved to the v8d format, a data mismatch rather than a modeling failure. A local Gemma-3-12b model doing conservative top-25-to-20 pruning regressed slightly (0.0812 vs. 0.0818 baseline on a 50-session pilot). The clearest case was a zero-shot Qwen3-8B reranker applied to the Blind A submission: nDCG@20 fell from 0.3990 to 0.3310, lexical diversity collapsed from 0.5909 to 0.0125, the judge score fell from 1.90 to 1.15, and composite fell from 0.3291 to 0.1811. The intuition that unifies all four cases: none of these rerankers had access to the structural signal LambdaMART uses instead -- explicit multi-source agreement and GPA-derived session-state features (Table 2, groups B and D) -- so an unfine-tuned or mismatched model instead gravitates toward generically "safe" or near-identical tracks across sessions, a failure mode invisible to nDCG@20 alone but catastrophic for lexical diversity and judge quality. The retained system (LambdaMART only, no added reranker) is the positive case here: its composite score beats every reranked variant we tried.</w:t>
+      </w:r>
+    </w:p>
+    <w:p>
+      <w:pPr>
+        <w:pStyle w:val="Para"/>
+      </w:pPr>
+      <w:r>
+        <w:rPr>
+          <w:b/>
+        </w:rPr>
+        <w:t>Table 3a: Reranking attempts on top of the LambdaMART baseline.</w:t>
+      </w:r>
+    </w:p>
+    <w:tbl>
+      <w:tblPr>
+        <w:tblW w:type="auto" w:w="0"/>
+        <w:tblLook w:firstColumn="1" w:firstRow="1" w:lastColumn="0" w:lastRow="0" w:noHBand="0" w:noVBand="1" w:val="04A0"/>
+        <w:tblCellMar>
+          <w:top w:w="40" w:type="dxa"/>
+          <w:left w:w="100" w:type="dxa"/>
+          <w:bottom w:w="40" w:type="dxa"/>
+          <w:right w:w="100" w:type="dxa"/>
+        </w:tblCellMar>
+        <w:jc w:val="center"/>
+        <w:tblLayout w:type="fixed"/>
+      </w:tblPr>
+      <w:tblGrid>
+        <w:gridCol w:w="3360"/>
+        <w:gridCol w:w="3360"/>
+        <w:gridCol w:w="3360"/>
+      </w:tblGrid>
+      <w:tr>
+        <w:trPr>
+          <w:tblHeader w:val="true"/>
+        </w:trPr>
+        <w:tc>
+          <w:tcPr>
+            <w:tcW w:type="dxa" w:w="3360"/>
+            <w:shd w:val="clear" w:color="auto" w:fill="E7E7E7"/>
+            <w:tcBorders>
+              <w:top w:val="single" w:sz="12" w:space="0" w:color="000000"/>
+              <w:bottom w:val="single" w:sz="4" w:space="0" w:color="000000"/>
+            </w:tcBorders>
+          </w:tcPr>
+          <w:p>
+            <w:pPr>
+              <w:jc w:val="left"/>
+            </w:pPr>
+            <w:r/>
+            <w:r>
+              <w:rPr>
+                <w:b/>
+                <w:sz w:val="18"/>
+              </w:rPr>
+              <w:t>Attempt</w:t>
+            </w:r>
+          </w:p>
+        </w:tc>
+        <w:tc>
+          <w:tcPr>
+            <w:tcW w:type="dxa" w:w="3360"/>
+            <w:shd w:val="clear" w:color="auto" w:fill="E7E7E7"/>
+            <w:tcBorders>
+              <w:top w:val="single" w:sz="12" w:space="0" w:color="000000"/>
+              <w:bottom w:val="single" w:sz="4" w:space="0" w:color="000000"/>
+            </w:tcBorders>
+          </w:tcPr>
+          <w:p>
+            <w:pPr>
+              <w:jc w:val="left"/>
+            </w:pPr>
+            <w:r/>
+            <w:r>
+              <w:rPr>
+                <w:b/>
+                <w:sz w:val="18"/>
+              </w:rPr>
+              <w:t>Result</w:t>
+            </w:r>
+          </w:p>
+        </w:tc>
+        <w:tc>
+          <w:tcPr>
+            <w:tcW w:type="dxa" w:w="3360"/>
+            <w:shd w:val="clear" w:color="auto" w:fill="E7E7E7"/>
+            <w:tcBorders>
+              <w:top w:val="single" w:sz="12" w:space="0" w:color="000000"/>
+              <w:bottom w:val="single" w:sz="4" w:space="0" w:color="000000"/>
+            </w:tcBorders>
+          </w:tcPr>
+          <w:p>
+            <w:pPr>
+              <w:jc w:val="left"/>
+            </w:pPr>
+            <w:r/>
+            <w:r>
+              <w:rPr>
+                <w:b/>
+                <w:sz w:val="18"/>
+              </w:rPr>
+              <w:t>Verdict</w:t>
+            </w:r>
+          </w:p>
+        </w:tc>
+      </w:tr>
+      <w:tr>
+        <w:tc>
+          <w:tcPr>
+            <w:tcW w:type="dxa" w:w="3360"/>
+          </w:tcPr>
+          <w:p>
+            <w:pPr>
+              <w:jc w:val="left"/>
+            </w:pPr>
+            <w:r>
+              <w:rPr>
+                <w:sz w:val="18"/>
+              </w:rPr>
+            </w:r>
+            <w:r>
+              <w:rPr>
+                <w:sz w:val="18"/>
+              </w:rPr>
+              <w:t>Pre-trained cross-encoder (no fine-tune)</w:t>
+            </w:r>
+          </w:p>
+        </w:tc>
+        <w:tc>
+          <w:tcPr>
+            <w:tcW w:type="dxa" w:w="3360"/>
+          </w:tcPr>
+          <w:p>
+            <w:pPr>
+              <w:jc w:val="left"/>
+            </w:pPr>
+            <w:r>
+              <w:rPr>
+                <w:sz w:val="18"/>
+              </w:rPr>
+            </w:r>
+            <w:r>
+              <w:rPr>
+                <w:sz w:val="18"/>
+              </w:rPr>
+              <w:t>underperformed the LambdaMART baseline</w:t>
+            </w:r>
+          </w:p>
+        </w:tc>
+        <w:tc>
+          <w:tcPr>
+            <w:tcW w:type="dxa" w:w="3360"/>
+          </w:tcPr>
+          <w:p>
+            <w:pPr>
+              <w:jc w:val="left"/>
+            </w:pPr>
+            <w:r>
+              <w:rPr>
+                <w:sz w:val="18"/>
+              </w:rPr>
+            </w:r>
+            <w:r>
+              <w:rPr>
+                <w:sz w:val="18"/>
+              </w:rPr>
+              <w:t>no domain adaptation to TalkPlay dialogue/track text</w:t>
+            </w:r>
+          </w:p>
+        </w:tc>
+      </w:tr>
+      <w:tr>
+        <w:tc>
+          <w:tcPr>
+            <w:tcW w:type="dxa" w:w="3360"/>
+          </w:tcPr>
+          <w:p>
+            <w:pPr>
+              <w:jc w:val="left"/>
+            </w:pPr>
+            <w:r>
+              <w:rPr>
+                <w:sz w:val="18"/>
+              </w:rPr>
+            </w:r>
+            <w:r>
+              <w:rPr>
+                <w:sz w:val="18"/>
+              </w:rPr>
+              <w:t>Fine-tuned cross-encoder (bge-reranker-v2-m3)</w:t>
+            </w:r>
+          </w:p>
+        </w:tc>
+        <w:tc>
+          <w:tcPr>
+            <w:tcW w:type="dxa" w:w="3360"/>
+          </w:tcPr>
+          <w:p>
+            <w:pPr>
+              <w:jc w:val="left"/>
+            </w:pPr>
+            <w:r>
+              <w:rPr>
+                <w:sz w:val="18"/>
+              </w:rPr>
+            </w:r>
+            <w:r>
+              <w:rPr>
+                <w:sz w:val="18"/>
+              </w:rPr>
+              <w:t>dev nDCG@20 = 0.1228 (large regression)</w:t>
+            </w:r>
+          </w:p>
+        </w:tc>
+        <w:tc>
+          <w:tcPr>
+            <w:tcW w:type="dxa" w:w="3360"/>
+          </w:tcPr>
+          <w:p>
+            <w:pPr>
+              <w:jc w:val="left"/>
+            </w:pPr>
+            <w:r>
+              <w:rPr>
+                <w:sz w:val="18"/>
+              </w:rPr>
+            </w:r>
+            <w:r>
+              <w:rPr>
+                <w:sz w:val="18"/>
+              </w:rPr>
+              <w:t>trained on a stale anchor format, mismatched with the shipped encoder</w:t>
+            </w:r>
+          </w:p>
+        </w:tc>
+      </w:tr>
+      <w:tr>
+        <w:tc>
+          <w:tcPr>
+            <w:tcW w:type="dxa" w:w="3360"/>
+          </w:tcPr>
+          <w:p>
+            <w:pPr>
+              <w:jc w:val="left"/>
+            </w:pPr>
+            <w:r>
+              <w:rPr>
+                <w:sz w:val="18"/>
+              </w:rPr>
+            </w:r>
+            <w:r>
+              <w:rPr>
+                <w:sz w:val="18"/>
+              </w:rPr>
+              <w:t>Gemma-3-12b conservative pruning (25→20)</w:t>
+            </w:r>
+          </w:p>
+        </w:tc>
+        <w:tc>
+          <w:tcPr>
+            <w:tcW w:type="dxa" w:w="3360"/>
+          </w:tcPr>
+          <w:p>
+            <w:pPr>
+              <w:jc w:val="left"/>
+            </w:pPr>
+            <w:r>
+              <w:rPr>
+                <w:sz w:val="18"/>
+              </w:rPr>
+            </w:r>
+            <w:r>
+              <w:rPr>
+                <w:sz w:val="18"/>
+              </w:rPr>
+              <w:t>0.0812 vs. 0.0818 baseline</w:t>
+            </w:r>
+          </w:p>
+        </w:tc>
+        <w:tc>
+          <w:tcPr>
+            <w:tcW w:type="dxa" w:w="3360"/>
+          </w:tcPr>
+          <w:p>
+            <w:pPr>
+              <w:jc w:val="left"/>
+            </w:pPr>
+            <w:r>
+              <w:rPr>
+                <w:sz w:val="18"/>
+              </w:rPr>
+            </w:r>
+            <w:r>
+              <w:rPr>
+                <w:sz w:val="18"/>
+              </w:rPr>
+              <w:t>regression</w:t>
+            </w:r>
+          </w:p>
+        </w:tc>
+      </w:tr>
+      <w:tr>
+        <w:tc>
+          <w:tcPr>
+            <w:tcW w:type="dxa" w:w="3360"/>
+            <w:tcBorders>
+              <w:bottom w:val="single" w:sz="12" w:space="0" w:color="000000"/>
+            </w:tcBorders>
+          </w:tcPr>
+          <w:p>
+            <w:pPr>
+              <w:jc w:val="left"/>
+            </w:pPr>
+            <w:r>
+              <w:rPr>
+                <w:sz w:val="18"/>
+              </w:rPr>
+            </w:r>
+            <w:r>
+              <w:rPr>
+                <w:sz w:val="18"/>
+              </w:rPr>
+              <w:t>Zero-shot Qwen3-8B reranker</w:t>
+            </w:r>
+          </w:p>
+        </w:tc>
+        <w:tc>
+          <w:tcPr>
+            <w:tcW w:type="dxa" w:w="3360"/>
+            <w:tcBorders>
+              <w:bottom w:val="single" w:sz="12" w:space="0" w:color="000000"/>
+            </w:tcBorders>
+          </w:tcPr>
+          <w:p>
+            <w:pPr>
+              <w:jc w:val="left"/>
+            </w:pPr>
+            <w:r>
+              <w:rPr>
+                <w:sz w:val="18"/>
+              </w:rPr>
+            </w:r>
+            <w:r>
+              <w:rPr>
+                <w:sz w:val="18"/>
+              </w:rPr>
+              <w:t>Blind A nDCG@20 0.3990→0.3310, lex. div. 0.5909→0.0125, judge 1.90→1.15, composite 0.3291→0.1811</w:t>
+            </w:r>
+          </w:p>
+        </w:tc>
+        <w:tc>
+          <w:tcPr>
+            <w:tcW w:type="dxa" w:w="3360"/>
+            <w:tcBorders>
+              <w:bottom w:val="single" w:sz="12" w:space="0" w:color="000000"/>
+            </w:tcBorders>
+          </w:tcPr>
+          <w:p>
+            <w:pPr>
+              <w:jc w:val="left"/>
+            </w:pPr>
+            <w:r>
+              <w:rPr>
+                <w:sz w:val="18"/>
+              </w:rPr>
+            </w:r>
+            <w:r>
+              <w:rPr>
+                <w:sz w:val="18"/>
+              </w:rPr>
+              <w:t>diversity collapse</w:t>
+            </w:r>
+          </w:p>
+        </w:tc>
+      </w:tr>
+    </w:tbl>
+    <w:p>
+      <w:pPr>
+        <w:pStyle w:val="Para"/>
+      </w:pPr>
+      <w:r>
+        <w:rPr>
+          <w:b/>
+        </w:rPr>
+        <w:t>Hard negatives that taught the wrong lesson.</w:t>
+      </w:r>
+      <w:r>
+        <w:t xml:space="preserve"> An earlier two-tower iteration (v4) trained with </w:t>
+      </w:r>
+      <w:r>
+        <w:rPr>
+          <w:rFonts w:ascii="Courier New" w:hAnsi="Courier New"/>
+        </w:rPr>
+        <w:t>MultipleNegativesRankingLoss</w:t>
+      </w:r>
+      <w:r>
+        <w:t xml:space="preserve"> and BM25-top-5 hard negatives regressed dev nDCG@20 to 0.1364, worse than the 0.1418 reached without hard negatives at all. Our reading: BM25-top-5 negatives are lexically close to the positive but not necessarily wrong in intent, so the loss pushed the encoder to separate on superficial lexical features rather than dialogue intent. This result is why the shipped model (Section 3.2) mines hard negatives in a strict priority order -- confirmed session rejections first, then BM25 near-misses, then same-artist distractors, then in-batch negatives -- and never treats a raw BM25 top-K result as a hard negative on its own.</w:t>
+      </w:r>
+    </w:p>
+    <w:p>
+      <w:pPr>
+        <w:pStyle w:val="Para"/>
+      </w:pPr>
+      <w:r>
+        <w:rPr>
+          <w:b/>
+        </w:rPr>
+        <w:t>Development and blind generalization can disagree.</w:t>
+      </w:r>
+      <w:r>
+        <w:t xml:space="preserve"> Adding progress-aware retrieval and ranking (H1/H3, Section 3.3) to an intermediate two-tower model (v8b) dropped dev nDCG@20 from 0.1684 to 0.1615, a regression on the development metric, while Blind A nDCG rose to 0.3701, a gain over the prior no-GPA baseline. Judged on dev alone, this change would have been reverted. We instead adopted two working rules from this case: a feature whose importance swings by more than 50% across the 5 cross-validation folds is flagged as unstable and treated with suspicion, and a regression on the blind set is weighed as costing more than the sum of all dev-set gains, since blind sessions -- with goal, GPA, and thoughts removed -- are the harder, more representative target.</w:t>
+      </w:r>
+    </w:p>
+    <w:p>
+      <w:pPr>
+        <w:pStyle w:val="Head2"/>
+      </w:pPr>
+      <w:r>
+        <w:t>5.2 Behavior Across Goal-Category Types</w:t>
+      </w:r>
+    </w:p>
+    <w:p>
+      <w:pPr>
+        <w:pStyle w:val="Para"/>
+      </w:pPr>
+      <w:r>
+        <w:t>Not everything trains the same behavior. Each session's goal falls into one of 11 categories (Table 3b); dev nDCG@20 for the shipped configuration ranges from 0.1326 (Category I) to 0.1953 (Category F). The weakest four categories (I, C, K, J) are all narrow, exact-match requests; the strongest three (E, F, H) are broad or multi-faceted requests.</w:t>
+      </w:r>
+    </w:p>
+    <w:p>
+      <w:pPr>
+        <w:pStyle w:val="Para"/>
+      </w:pPr>
+      <w:r>
+        <w:rPr>
+          <w:b/>
+        </w:rPr>
+        <w:t>Table 3b: Dev nDCG@20 by goal category.</w:t>
+      </w:r>
+    </w:p>
+    <w:tbl>
+      <w:tblPr>
+        <w:tblW w:type="auto" w:w="0"/>
+        <w:tblLook w:firstColumn="1" w:firstRow="1" w:lastColumn="0" w:lastRow="0" w:noHBand="0" w:noVBand="1" w:val="04A0"/>
+        <w:tblCellMar>
+          <w:top w:w="40" w:type="dxa"/>
+          <w:left w:w="100" w:type="dxa"/>
+          <w:bottom w:w="40" w:type="dxa"/>
+          <w:right w:w="100" w:type="dxa"/>
+        </w:tblCellMar>
+        <w:jc w:val="center"/>
+        <w:tblLayout w:type="fixed"/>
+      </w:tblPr>
+      <w:tblGrid>
+        <w:gridCol w:w="3360"/>
+        <w:gridCol w:w="3360"/>
+        <w:gridCol w:w="3360"/>
+      </w:tblGrid>
+      <w:tr>
+        <w:trPr>
+          <w:tblHeader w:val="true"/>
+        </w:trPr>
+        <w:tc>
+          <w:tcPr>
+            <w:tcW w:type="dxa" w:w="3360"/>
+            <w:shd w:val="clear" w:color="auto" w:fill="E7E7E7"/>
+            <w:tcBorders>
+              <w:top w:val="single" w:sz="12" w:space="0" w:color="000000"/>
+              <w:bottom w:val="single" w:sz="4" w:space="0" w:color="000000"/>
+            </w:tcBorders>
+          </w:tcPr>
+          <w:p>
+            <w:pPr>
+              <w:jc w:val="left"/>
+            </w:pPr>
+            <w:r/>
+            <w:r>
+              <w:rPr>
+                <w:b/>
+                <w:sz w:val="18"/>
+              </w:rPr>
+              <w:t>Cat</w:t>
+            </w:r>
+          </w:p>
+        </w:tc>
+        <w:tc>
+          <w:tcPr>
+            <w:tcW w:type="dxa" w:w="3360"/>
+            <w:shd w:val="clear" w:color="auto" w:fill="E7E7E7"/>
+            <w:tcBorders>
+              <w:top w:val="single" w:sz="12" w:space="0" w:color="000000"/>
+              <w:bottom w:val="single" w:sz="4" w:space="0" w:color="000000"/>
+            </w:tcBorders>
+          </w:tcPr>
+          <w:p>
+            <w:pPr>
+              <w:jc w:val="left"/>
+            </w:pPr>
+            <w:r/>
+            <w:r>
+              <w:rPr>
+                <w:b/>
+                <w:sz w:val="18"/>
+              </w:rPr>
+              <w:t>Type</w:t>
+            </w:r>
+          </w:p>
+        </w:tc>
+        <w:tc>
+          <w:tcPr>
+            <w:tcW w:type="dxa" w:w="3360"/>
+            <w:shd w:val="clear" w:color="auto" w:fill="E7E7E7"/>
+            <w:tcBorders>
+              <w:top w:val="single" w:sz="12" w:space="0" w:color="000000"/>
+              <w:bottom w:val="single" w:sz="4" w:space="0" w:color="000000"/>
+            </w:tcBorders>
+          </w:tcPr>
+          <w:p>
+            <w:pPr>
+              <w:jc w:val="left"/>
+            </w:pPr>
+            <w:r/>
+            <w:r>
+              <w:rPr>
+                <w:b/>
+                <w:sz w:val="18"/>
+              </w:rPr>
+              <w:t>nDCG@20</w:t>
+            </w:r>
+          </w:p>
+        </w:tc>
+      </w:tr>
+      <w:tr>
+        <w:tc>
+          <w:tcPr>
+            <w:tcW w:type="dxa" w:w="3360"/>
+          </w:tcPr>
+          <w:p>
+            <w:pPr>
+              <w:jc w:val="left"/>
+            </w:pPr>
+            <w:r>
+              <w:rPr>
+                <w:sz w:val="18"/>
+              </w:rPr>
+            </w:r>
+            <w:r>
+              <w:rPr>
+                <w:sz w:val="18"/>
+              </w:rPr>
+              <w:t>I</w:t>
+            </w:r>
+          </w:p>
+        </w:tc>
+        <w:tc>
+          <w:tcPr>
+            <w:tcW w:type="dxa" w:w="3360"/>
+          </w:tcPr>
+          <w:p>
+            <w:pPr>
+              <w:jc w:val="left"/>
+            </w:pPr>
+            <w:r>
+              <w:rPr>
+                <w:sz w:val="18"/>
+              </w:rPr>
+            </w:r>
+            <w:r>
+              <w:rPr>
+                <w:sz w:val="18"/>
+              </w:rPr>
+              <w:t>specific globally popular song</w:t>
+            </w:r>
+          </w:p>
+        </w:tc>
+        <w:tc>
+          <w:tcPr>
+            <w:tcW w:type="dxa" w:w="3360"/>
+          </w:tcPr>
+          <w:p>
+            <w:pPr>
+              <w:jc w:val="left"/>
+            </w:pPr>
+            <w:r>
+              <w:rPr>
+                <w:sz w:val="18"/>
+              </w:rPr>
+            </w:r>
+            <w:r>
+              <w:rPr>
+                <w:sz w:val="18"/>
+              </w:rPr>
+              <w:t>0.1326</w:t>
+            </w:r>
+          </w:p>
+        </w:tc>
+      </w:tr>
+      <w:tr>
+        <w:tc>
+          <w:tcPr>
+            <w:tcW w:type="dxa" w:w="3360"/>
+          </w:tcPr>
+          <w:p>
+            <w:pPr>
+              <w:jc w:val="left"/>
+            </w:pPr>
+            <w:r>
+              <w:rPr>
+                <w:sz w:val="18"/>
+              </w:rPr>
+            </w:r>
+            <w:r>
+              <w:rPr>
+                <w:sz w:val="18"/>
+              </w:rPr>
+              <w:t>C</w:t>
+            </w:r>
+          </w:p>
+        </w:tc>
+        <w:tc>
+          <w:tcPr>
+            <w:tcW w:type="dxa" w:w="3360"/>
+          </w:tcPr>
+          <w:p>
+            <w:pPr>
+              <w:jc w:val="left"/>
+            </w:pPr>
+            <w:r>
+              <w:rPr>
+                <w:sz w:val="18"/>
+              </w:rPr>
+            </w:r>
+            <w:r>
+              <w:rPr>
+                <w:sz w:val="18"/>
+              </w:rPr>
+              <w:t>specific album by description</w:t>
+            </w:r>
+          </w:p>
+        </w:tc>
+        <w:tc>
+          <w:tcPr>
+            <w:tcW w:type="dxa" w:w="3360"/>
+          </w:tcPr>
+          <w:p>
+            <w:pPr>
+              <w:jc w:val="left"/>
+            </w:pPr>
+            <w:r>
+              <w:rPr>
+                <w:sz w:val="18"/>
+              </w:rPr>
+            </w:r>
+            <w:r>
+              <w:rPr>
+                <w:sz w:val="18"/>
+              </w:rPr>
+              <w:t>0.1332</w:t>
+            </w:r>
+          </w:p>
+        </w:tc>
+      </w:tr>
+      <w:tr>
+        <w:tc>
+          <w:tcPr>
+            <w:tcW w:type="dxa" w:w="3360"/>
+          </w:tcPr>
+          <w:p>
+            <w:pPr>
+              <w:jc w:val="left"/>
+            </w:pPr>
+            <w:r>
+              <w:rPr>
+                <w:sz w:val="18"/>
+              </w:rPr>
+            </w:r>
+            <w:r>
+              <w:rPr>
+                <w:sz w:val="18"/>
+              </w:rPr>
+              <w:t>K</w:t>
+            </w:r>
+          </w:p>
+        </w:tc>
+        <w:tc>
+          <w:tcPr>
+            <w:tcW w:type="dxa" w:w="3360"/>
+          </w:tcPr>
+          <w:p>
+            <w:pPr>
+              <w:jc w:val="left"/>
+            </w:pPr>
+            <w:r>
+              <w:rPr>
+                <w:sz w:val="18"/>
+              </w:rPr>
+            </w:r>
+            <w:r>
+              <w:rPr>
+                <w:sz w:val="18"/>
+              </w:rPr>
+              <w:t>discover, multi-instrumental, broad era</w:t>
+            </w:r>
+          </w:p>
+        </w:tc>
+        <w:tc>
+          <w:tcPr>
+            <w:tcW w:type="dxa" w:w="3360"/>
+          </w:tcPr>
+          <w:p>
+            <w:pPr>
+              <w:jc w:val="left"/>
+            </w:pPr>
+            <w:r>
+              <w:rPr>
+                <w:sz w:val="18"/>
+              </w:rPr>
+            </w:r>
+            <w:r>
+              <w:rPr>
+                <w:sz w:val="18"/>
+              </w:rPr>
+              <w:t>0.1367</w:t>
+            </w:r>
+          </w:p>
+        </w:tc>
+      </w:tr>
+      <w:tr>
+        <w:tc>
+          <w:tcPr>
+            <w:tcW w:type="dxa" w:w="3360"/>
+          </w:tcPr>
+          <w:p>
+            <w:pPr>
+              <w:jc w:val="left"/>
+            </w:pPr>
+            <w:r>
+              <w:rPr>
+                <w:sz w:val="18"/>
+              </w:rPr>
+            </w:r>
+            <w:r>
+              <w:rPr>
+                <w:sz w:val="18"/>
+              </w:rPr>
+              <w:t>J</w:t>
+            </w:r>
+          </w:p>
+        </w:tc>
+        <w:tc>
+          <w:tcPr>
+            <w:tcW w:type="dxa" w:w="3360"/>
+          </w:tcPr>
+          <w:p>
+            <w:pPr>
+              <w:jc w:val="left"/>
+            </w:pPr>
+            <w:r>
+              <w:rPr>
+                <w:sz w:val="18"/>
+              </w:rPr>
+            </w:r>
+            <w:r>
+              <w:rPr>
+                <w:sz w:val="18"/>
+              </w:rPr>
+              <w:t>specific hit</w:t>
+            </w:r>
+          </w:p>
+        </w:tc>
+        <w:tc>
+          <w:tcPr>
+            <w:tcW w:type="dxa" w:w="3360"/>
+          </w:tcPr>
+          <w:p>
+            <w:pPr>
+              <w:jc w:val="left"/>
+            </w:pPr>
+            <w:r>
+              <w:rPr>
+                <w:sz w:val="18"/>
+              </w:rPr>
+            </w:r>
+            <w:r>
+              <w:rPr>
+                <w:sz w:val="18"/>
+              </w:rPr>
+              <w:t>0.1585</w:t>
+            </w:r>
+          </w:p>
+        </w:tc>
+      </w:tr>
+      <w:tr>
+        <w:tc>
+          <w:tcPr>
+            <w:tcW w:type="dxa" w:w="3360"/>
+          </w:tcPr>
+          <w:p>
+            <w:pPr>
+              <w:jc w:val="left"/>
+            </w:pPr>
+            <w:r>
+              <w:rPr>
+                <w:sz w:val="18"/>
+              </w:rPr>
+            </w:r>
+            <w:r>
+              <w:rPr>
+                <w:sz w:val="18"/>
+              </w:rPr>
+              <w:t>G</w:t>
+            </w:r>
+          </w:p>
+        </w:tc>
+        <w:tc>
+          <w:tcPr>
+            <w:tcW w:type="dxa" w:w="3360"/>
+          </w:tcPr>
+          <w:p>
+            <w:pPr>
+              <w:jc w:val="left"/>
+            </w:pPr>
+            <w:r>
+              <w:rPr>
+                <w:sz w:val="18"/>
+              </w:rPr>
+            </w:r>
+            <w:r>
+              <w:rPr>
+                <w:sz w:val="18"/>
+              </w:rPr>
+              <w:t>multi mood</w:t>
+            </w:r>
+          </w:p>
+        </w:tc>
+        <w:tc>
+          <w:tcPr>
+            <w:tcW w:type="dxa" w:w="3360"/>
+          </w:tcPr>
+          <w:p>
+            <w:pPr>
+              <w:jc w:val="left"/>
+            </w:pPr>
+            <w:r>
+              <w:rPr>
+                <w:sz w:val="18"/>
+              </w:rPr>
+            </w:r>
+            <w:r>
+              <w:rPr>
+                <w:sz w:val="18"/>
+              </w:rPr>
+              <w:t>0.1605</w:t>
+            </w:r>
+          </w:p>
+        </w:tc>
+      </w:tr>
+      <w:tr>
+        <w:tc>
+          <w:tcPr>
+            <w:tcW w:type="dxa" w:w="3360"/>
+          </w:tcPr>
+          <w:p>
+            <w:pPr>
+              <w:jc w:val="left"/>
+            </w:pPr>
+            <w:r>
+              <w:rPr>
+                <w:sz w:val="18"/>
+              </w:rPr>
+            </w:r>
+            <w:r>
+              <w:rPr>
+                <w:sz w:val="18"/>
+              </w:rPr>
+              <w:t>A</w:t>
+            </w:r>
+          </w:p>
+        </w:tc>
+        <w:tc>
+          <w:tcPr>
+            <w:tcW w:type="dxa" w:w="3360"/>
+          </w:tcPr>
+          <w:p>
+            <w:pPr>
+              <w:jc w:val="left"/>
+            </w:pPr>
+            <w:r>
+              <w:rPr>
+                <w:sz w:val="18"/>
+              </w:rPr>
+            </w:r>
+            <w:r>
+              <w:rPr>
+                <w:sz w:val="18"/>
+              </w:rPr>
+              <w:t>specific instrumental (game/movie)</w:t>
+            </w:r>
+          </w:p>
+        </w:tc>
+        <w:tc>
+          <w:tcPr>
+            <w:tcW w:type="dxa" w:w="3360"/>
+          </w:tcPr>
+          <w:p>
+            <w:pPr>
+              <w:jc w:val="left"/>
+            </w:pPr>
+            <w:r>
+              <w:rPr>
+                <w:sz w:val="18"/>
+              </w:rPr>
+            </w:r>
+            <w:r>
+              <w:rPr>
+                <w:sz w:val="18"/>
+              </w:rPr>
+              <w:t>0.1639</w:t>
+            </w:r>
+          </w:p>
+        </w:tc>
+      </w:tr>
+      <w:tr>
+        <w:tc>
+          <w:tcPr>
+            <w:tcW w:type="dxa" w:w="3360"/>
+          </w:tcPr>
+          <w:p>
+            <w:pPr>
+              <w:jc w:val="left"/>
+            </w:pPr>
+            <w:r>
+              <w:rPr>
+                <w:sz w:val="18"/>
+              </w:rPr>
+            </w:r>
+            <w:r>
+              <w:rPr>
+                <w:sz w:val="18"/>
+              </w:rPr>
+              <w:t>D</w:t>
+            </w:r>
+          </w:p>
+        </w:tc>
+        <w:tc>
+          <w:tcPr>
+            <w:tcW w:type="dxa" w:w="3360"/>
+          </w:tcPr>
+          <w:p>
+            <w:pPr>
+              <w:jc w:val="left"/>
+            </w:pPr>
+            <w:r>
+              <w:rPr>
+                <w:sz w:val="18"/>
+              </w:rPr>
+            </w:r>
+            <w:r>
+              <w:rPr>
+                <w:sz w:val="18"/>
+              </w:rPr>
+              <w:t>specific soundtrack</w:t>
+            </w:r>
+          </w:p>
+        </w:tc>
+        <w:tc>
+          <w:tcPr>
+            <w:tcW w:type="dxa" w:w="3360"/>
+          </w:tcPr>
+          <w:p>
+            <w:pPr>
+              <w:jc w:val="left"/>
+            </w:pPr>
+            <w:r>
+              <w:rPr>
+                <w:sz w:val="18"/>
+              </w:rPr>
+            </w:r>
+            <w:r>
+              <w:rPr>
+                <w:sz w:val="18"/>
+              </w:rPr>
+              <w:t>0.1653</w:t>
+            </w:r>
+          </w:p>
+        </w:tc>
+      </w:tr>
+      <w:tr>
+        <w:tc>
+          <w:tcPr>
+            <w:tcW w:type="dxa" w:w="3360"/>
+          </w:tcPr>
+          <w:p>
+            <w:pPr>
+              <w:jc w:val="left"/>
+            </w:pPr>
+            <w:r>
+              <w:rPr>
+                <w:sz w:val="18"/>
+              </w:rPr>
+            </w:r>
+            <w:r>
+              <w:rPr>
+                <w:sz w:val="18"/>
+              </w:rPr>
+              <w:t>B</w:t>
+            </w:r>
+          </w:p>
+        </w:tc>
+        <w:tc>
+          <w:tcPr>
+            <w:tcW w:type="dxa" w:w="3360"/>
+          </w:tcPr>
+          <w:p>
+            <w:pPr>
+              <w:jc w:val="left"/>
+            </w:pPr>
+            <w:r>
+              <w:rPr>
+                <w:sz w:val="18"/>
+              </w:rPr>
+            </w:r>
+            <w:r>
+              <w:rPr>
+                <w:sz w:val="18"/>
+              </w:rPr>
+              <w:t>specific by lyric phrase</w:t>
+            </w:r>
+          </w:p>
+        </w:tc>
+        <w:tc>
+          <w:tcPr>
+            <w:tcW w:type="dxa" w:w="3360"/>
+          </w:tcPr>
+          <w:p>
+            <w:pPr>
+              <w:jc w:val="left"/>
+            </w:pPr>
+            <w:r>
+              <w:rPr>
+                <w:sz w:val="18"/>
+              </w:rPr>
+            </w:r>
+            <w:r>
+              <w:rPr>
+                <w:sz w:val="18"/>
+              </w:rPr>
+              <w:t>0.1807</w:t>
+            </w:r>
+          </w:p>
+        </w:tc>
+      </w:tr>
+      <w:tr>
+        <w:tc>
+          <w:tcPr>
+            <w:tcW w:type="dxa" w:w="3360"/>
+          </w:tcPr>
+          <w:p>
+            <w:pPr>
+              <w:jc w:val="left"/>
+            </w:pPr>
+            <w:r>
+              <w:rPr>
+                <w:sz w:val="18"/>
+              </w:rPr>
+            </w:r>
+            <w:r>
+              <w:rPr>
+                <w:sz w:val="18"/>
+              </w:rPr>
+              <w:t>H</w:t>
+            </w:r>
+          </w:p>
+        </w:tc>
+        <w:tc>
+          <w:tcPr>
+            <w:tcW w:type="dxa" w:w="3360"/>
+          </w:tcPr>
+          <w:p>
+            <w:pPr>
+              <w:jc w:val="left"/>
+            </w:pPr>
+            <w:r>
+              <w:rPr>
+                <w:sz w:val="18"/>
+              </w:rPr>
+            </w:r>
+            <w:r>
+              <w:rPr>
+                <w:sz w:val="18"/>
+              </w:rPr>
+              <w:t>multi artists</w:t>
+            </w:r>
+          </w:p>
+        </w:tc>
+        <w:tc>
+          <w:tcPr>
+            <w:tcW w:type="dxa" w:w="3360"/>
+          </w:tcPr>
+          <w:p>
+            <w:pPr>
+              <w:jc w:val="left"/>
+            </w:pPr>
+            <w:r>
+              <w:rPr>
+                <w:sz w:val="18"/>
+              </w:rPr>
+            </w:r>
+            <w:r>
+              <w:rPr>
+                <w:sz w:val="18"/>
+              </w:rPr>
+              <w:t>0.1884</w:t>
+            </w:r>
+          </w:p>
+        </w:tc>
+      </w:tr>
+      <w:tr>
+        <w:tc>
+          <w:tcPr>
+            <w:tcW w:type="dxa" w:w="3360"/>
+          </w:tcPr>
+          <w:p>
+            <w:pPr>
+              <w:jc w:val="left"/>
+            </w:pPr>
+            <w:r>
+              <w:rPr>
+                <w:sz w:val="18"/>
+              </w:rPr>
+            </w:r>
+            <w:r>
+              <w:rPr>
+                <w:sz w:val="18"/>
+              </w:rPr>
+              <w:t>E</w:t>
+            </w:r>
+          </w:p>
+        </w:tc>
+        <w:tc>
+          <w:tcPr>
+            <w:tcW w:type="dxa" w:w="3360"/>
+          </w:tcPr>
+          <w:p>
+            <w:pPr>
+              <w:jc w:val="left"/>
+            </w:pPr>
+            <w:r>
+              <w:rPr>
+                <w:sz w:val="18"/>
+              </w:rPr>
+            </w:r>
+            <w:r>
+              <w:rPr>
+                <w:sz w:val="18"/>
+              </w:rPr>
+              <w:t>musical journey, multi</w:t>
+            </w:r>
+          </w:p>
+        </w:tc>
+        <w:tc>
+          <w:tcPr>
+            <w:tcW w:type="dxa" w:w="3360"/>
+          </w:tcPr>
+          <w:p>
+            <w:pPr>
+              <w:jc w:val="left"/>
+            </w:pPr>
+            <w:r>
+              <w:rPr>
+                <w:sz w:val="18"/>
+              </w:rPr>
+            </w:r>
+            <w:r>
+              <w:rPr>
+                <w:sz w:val="18"/>
+              </w:rPr>
+              <w:t>0.1945</w:t>
+            </w:r>
+          </w:p>
+        </w:tc>
+      </w:tr>
+      <w:tr>
+        <w:tc>
+          <w:tcPr>
+            <w:tcW w:type="dxa" w:w="3360"/>
+            <w:tcBorders>
+              <w:bottom w:val="single" w:sz="12" w:space="0" w:color="000000"/>
+            </w:tcBorders>
+          </w:tcPr>
+          <w:p>
+            <w:pPr>
+              <w:jc w:val="left"/>
+            </w:pPr>
+            <w:r>
+              <w:rPr>
+                <w:sz w:val="18"/>
+              </w:rPr>
+            </w:r>
+            <w:r>
+              <w:rPr>
+                <w:sz w:val="18"/>
+              </w:rPr>
+              <w:t>F</w:t>
+            </w:r>
+          </w:p>
+        </w:tc>
+        <w:tc>
+          <w:tcPr>
+            <w:tcW w:type="dxa" w:w="3360"/>
+            <w:tcBorders>
+              <w:bottom w:val="single" w:sz="12" w:space="0" w:color="000000"/>
+            </w:tcBorders>
+          </w:tcPr>
+          <w:p>
+            <w:pPr>
+              <w:jc w:val="left"/>
+            </w:pPr>
+            <w:r>
+              <w:rPr>
+                <w:sz w:val="18"/>
+              </w:rPr>
+            </w:r>
+            <w:r>
+              <w:rPr>
+                <w:sz w:val="18"/>
+              </w:rPr>
+              <w:t>multi era/genre</w:t>
+            </w:r>
+          </w:p>
+        </w:tc>
+        <w:tc>
+          <w:tcPr>
+            <w:tcW w:type="dxa" w:w="3360"/>
+            <w:tcBorders>
+              <w:bottom w:val="single" w:sz="12" w:space="0" w:color="000000"/>
+            </w:tcBorders>
+          </w:tcPr>
+          <w:p>
+            <w:pPr>
+              <w:jc w:val="left"/>
+            </w:pPr>
+            <w:r>
+              <w:rPr>
+                <w:sz w:val="18"/>
+              </w:rPr>
+            </w:r>
+            <w:r>
+              <w:rPr>
+                <w:sz w:val="18"/>
+              </w:rPr>
+              <w:t>0.1953</w:t>
+            </w:r>
+          </w:p>
+        </w:tc>
+      </w:tr>
+    </w:tbl>
+    <w:p>
+      <w:pPr>
+        <w:pStyle w:val="Para"/>
+      </w:pPr>
+      <w:r>
+        <w:t>A concrete pair from the dev set shows why. In one Category I session the listener asks for "a catchy, dance-y track that was big in the 2000s, possibly from a non-English speaking country" with no title or artist to anchor retrieval; the system recommends "How Soon Is Now?" by The Smiths, then "Abra Cadaver" by The Hives -- both alternative/punk rock, both rejected ("it's not quite what I'm looking for... definitely had a Latin feel to it"). With no lexical anchor, retrieval falls back to the listener's broader taste profile (alternative rock) instead of the request's actual content (Latin pop, danceable). In a Category F session, by contrast, the listener names the artist directly ("Black Keys songs... from 'Thickfreakness' or 'Rubber Factory'"); the system returns "Thickfreakness" on the first turn, the listener confirms it is "absolutely what I had in mind," and the goal-progress label reads MOVES_TOWARD_GOAL for the rest of the session. The difference is not specificity in the abstract -- both requests are specific -- it is whether the request supplies a lexical anchor, an artist or title, that BM25 and the dialogue anchor can lock onto.</w:t>
+      </w:r>
+    </w:p>
+    <w:p>
+      <w:pPr>
+        <w:pStyle w:val="Para"/>
+      </w:pPr>
+      <w:r>
+        <w:t>This also complicates the multi-source pool-expansion story of Section 2: expansion helps ten of the eleven categories but actively hurts Category I (-0.0039 dev nDCG vs. the simpler two-source baseline), because sources calibrated to mainstream, taste-profile-driven sessions add noise exactly where there is no anchor to filter against. More sources is not uniformly better.</w:t>
+      </w:r>
+    </w:p>
+    <w:p>
+      <w:pPr>
+        <w:pStyle w:val="Head1"/>
+      </w:pPr>
+      <w:r>
+        <w:t>6 Efficiency and Scalability</w:t>
+      </w:r>
+    </w:p>
+    <w:p>
+      <w:pPr>
+        <w:pStyle w:val="Para"/>
+      </w:pPr>
+      <w:r>
+        <w:t xml:space="preserve">Every stage is CPU-native; Table 4 (top) reports per-component latencies with all neural blocks forced to CPU. Exact brute-force similarity over the 47,071 x 768 matrix is a single matmul, so no approximate index is needed at this catalog scale, and every stage except the encoder passes is single-digit milliseconds. Measured end-to-end over the 200-session evaluation set, the full recall-plus- rescore pipeline runs at </w:t>
+      </w:r>
+      <w:r>
+        <w:rPr>
+          <w:b/>
+        </w:rPr>
+        <w:t>2.17 s per session, about 0.27 s per turn</w:t>
+      </w:r>
+      <w:r>
+        <w:t xml:space="preserve"> (Table 4, bottom). Of this, the rescore stage is negligible: scoring the ~3,300-candidate pool with LambdaMART takes ~3.4 ms, roughly 1% of turn latency, so recall (the nine sources and their two query-encoder passes) accounts for essentially all of it. Even with every neural block pinned to the CPU (Table 4, top), a full turn stays under one second; dropping the frozen Qwen3-0.6B encoder in the eight-source configuration removes the single largest cost. The trained artifact is a 24 MB LoRA adapter and the serving process fits in under ~2 GB of RAM, so the entire train/evaluate/iterate loop, including the one LoRA fine-tune, runs on a single 16 GB desktop, which is what made rapid iteration practical.</w:t>
+      </w:r>
+    </w:p>
+    <w:p>
+      <w:pPr>
+        <w:pStyle w:val="Para"/>
+      </w:pPr>
+      <w:r>
+        <w:rPr>
+          <w:b/>
+        </w:rPr>
+        <w:t>Table 4: Measured latency and footprint. Top: per component, all neural blocks forced to CPU (worst case), median over 20 runs. Bottom: end-to-end recall + rescore over the 200-session set, encoders on the Metal backend.</w:t>
+      </w:r>
+    </w:p>
+    <w:tbl>
+      <w:tblPr>
+        <w:tblW w:type="auto" w:w="0"/>
+        <w:tblLook w:firstColumn="1" w:firstRow="1" w:lastColumn="0" w:lastRow="0" w:noHBand="0" w:noVBand="1" w:val="04A0"/>
+        <w:tblCellMar>
+          <w:top w:w="40" w:type="dxa"/>
+          <w:left w:w="100" w:type="dxa"/>
+          <w:bottom w:w="40" w:type="dxa"/>
+          <w:right w:w="100" w:type="dxa"/>
+        </w:tblCellMar>
+        <w:jc w:val="center"/>
+        <w:tblLayout w:type="fixed"/>
       </w:tblPr>
       <w:tblGrid>
         <w:gridCol w:w="5040"/>
         <w:gridCol w:w="5040"/>
       </w:tblGrid>
       <w:tr>
+        <w:trPr>
+          <w:tblHeader w:val="true"/>
+        </w:trPr>
         <w:tc>
           <w:tcPr>
             <w:tcW w:type="dxa" w:w="5040"/>
-          </w:tcPr>
-          <w:p>
+            <w:shd w:val="clear" w:color="auto" w:fill="E7E7E7"/>
+            <w:tcBorders>
+              <w:top w:val="single" w:sz="12" w:space="0" w:color="000000"/>
+              <w:bottom w:val="single" w:sz="4" w:space="0" w:color="000000"/>
+            </w:tcBorders>
+          </w:tcPr>
+          <w:p>
+            <w:pPr>
+              <w:jc w:val="left"/>
+            </w:pPr>
             <w:r/>
             <w:r>
               <w:rPr>
                 <w:b/>
                 <w:sz w:val="18"/>
               </w:rPr>
-              <w:t>Group</w:t>
+              <w:t>Operation</w:t>
             </w:r>
           </w:p>
         </w:tc>
         <w:tc>
           <w:tcPr>
             <w:tcW w:type="dxa" w:w="5040"/>
-          </w:tcPr>
-          <w:p>
+            <w:shd w:val="clear" w:color="auto" w:fill="E7E7E7"/>
+            <w:tcBorders>
+              <w:top w:val="single" w:sz="12" w:space="0" w:color="000000"/>
+              <w:bottom w:val="single" w:sz="4" w:space="0" w:color="000000"/>
+            </w:tcBorders>
+          </w:tcPr>
+          <w:p>
+            <w:pPr>
+              <w:jc w:val="left"/>
+            </w:pPr>
             <w:r/>
             <w:r>
               <w:rPr>
                 <w:b/>
                 <w:sz w:val="18"/>
               </w:rPr>
-              <w:t>Features</w:t>
+              <w:t>Cost</w:t>
             </w:r>
           </w:p>
         </w:tc>
@@ -1432,16 +3806,19 @@
             <w:tcW w:type="dxa" w:w="5040"/>
           </w:tcPr>
           <w:p>
-            <w:r>
-              <w:rPr>
-                <w:sz w:val="18"/>
-              </w:rPr>
-            </w:r>
-            <w:r>
-              <w:rPr>
-                <w:sz w:val="18"/>
-              </w:rPr>
-              <w:t>A. Retrieval scores</w:t>
+            <w:pPr>
+              <w:jc w:val="left"/>
+            </w:pPr>
+            <w:r>
+              <w:rPr>
+                <w:sz w:val="18"/>
+              </w:rPr>
+            </w:r>
+            <w:r>
+              <w:rPr>
+                <w:sz w:val="18"/>
+              </w:rPr>
+              <w:t>Two-tower query encode (e5-base)</w:t>
             </w:r>
           </w:p>
         </w:tc>
@@ -1450,16 +3827,19 @@
             <w:tcW w:type="dxa" w:w="5040"/>
           </w:tcPr>
           <w:p>
-            <w:r>
-              <w:rPr>
-                <w:sz w:val="18"/>
-              </w:rPr>
-            </w:r>
-            <w:r>
-              <w:rPr>
-                <w:sz w:val="18"/>
-              </w:rPr>
-              <w:t>two-tower cosine and rank; Qwen3 metadata and lyrics cosines; CLAP audio cosine; CF cosine; BM25 reciprocal rank; co-occurrence rank</w:t>
+            <w:pPr>
+              <w:jc w:val="left"/>
+            </w:pPr>
+            <w:r>
+              <w:rPr>
+                <w:sz w:val="18"/>
+              </w:rPr>
+            </w:r>
+            <w:r>
+              <w:rPr>
+                <w:sz w:val="18"/>
+              </w:rPr>
+              <w:t>47 ms</w:t>
             </w:r>
           </w:p>
         </w:tc>
@@ -1470,16 +3850,19 @@
             <w:tcW w:type="dxa" w:w="5040"/>
           </w:tcPr>
           <w:p>
-            <w:r>
-              <w:rPr>
-                <w:sz w:val="18"/>
-              </w:rPr>
-            </w:r>
-            <w:r>
-              <w:rPr>
-                <w:sz w:val="18"/>
-              </w:rPr>
-              <w:t>B. Source agreement</w:t>
+            <w:pPr>
+              <w:jc w:val="left"/>
+            </w:pPr>
+            <w:r>
+              <w:rPr>
+                <w:sz w:val="18"/>
+              </w:rPr>
+            </w:r>
+            <w:r>
+              <w:rPr>
+                <w:sz w:val="18"/>
+              </w:rPr>
+              <w:t>Exact ANN, 47,071 x 768, top-2000</w:t>
             </w:r>
           </w:p>
         </w:tc>
@@ -1488,23 +3871,19 @@
             <w:tcW w:type="dxa" w:w="5040"/>
           </w:tcPr>
           <w:p>
-            <w:r>
-              <w:rPr>
-                <w:sz w:val="18"/>
-              </w:rPr>
-            </w:r>
-            <w:r>
-              <w:rPr>
-                <w:rFonts w:ascii="Courier New" w:hAnsi="Courier New"/>
-                <w:sz w:val="18"/>
-              </w:rPr>
-              <w:t>n_sources</w:t>
-            </w:r>
-            <w:r>
-              <w:rPr>
-                <w:sz w:val="18"/>
-              </w:rPr>
-              <w:t xml:space="preserve"> and transforms: count of sources returning the candidate; a de-facto ensemble vote</w:t>
+            <w:pPr>
+              <w:jc w:val="left"/>
+            </w:pPr>
+            <w:r>
+              <w:rPr>
+                <w:sz w:val="18"/>
+              </w:rPr>
+            </w:r>
+            <w:r>
+              <w:rPr>
+                <w:sz w:val="18"/>
+              </w:rPr>
+              <w:t>2.2 ms</w:t>
             </w:r>
           </w:p>
         </w:tc>
@@ -1515,16 +3894,19 @@
             <w:tcW w:type="dxa" w:w="5040"/>
           </w:tcPr>
           <w:p>
-            <w:r>
-              <w:rPr>
-                <w:sz w:val="18"/>
-              </w:rPr>
-            </w:r>
-            <w:r>
-              <w:rPr>
-                <w:sz w:val="18"/>
-              </w:rPr>
-              <w:t>C. Track metadata</w:t>
+            <w:pPr>
+              <w:jc w:val="left"/>
+            </w:pPr>
+            <w:r>
+              <w:rPr>
+                <w:sz w:val="18"/>
+              </w:rPr>
+            </w:r>
+            <w:r>
+              <w:rPr>
+                <w:sz w:val="18"/>
+              </w:rPr>
+              <w:t>Qwen3-0.6B query encode</w:t>
             </w:r>
           </w:p>
         </w:tc>
@@ -1533,16 +3915,19 @@
             <w:tcW w:type="dxa" w:w="5040"/>
           </w:tcPr>
           <w:p>
-            <w:r>
-              <w:rPr>
-                <w:sz w:val="18"/>
-              </w:rPr>
-            </w:r>
-            <w:r>
-              <w:rPr>
-                <w:sz w:val="18"/>
-              </w:rPr>
-              <w:t>popularity percentile; years since release; request-tag overlap</w:t>
+            <w:pPr>
+              <w:jc w:val="left"/>
+            </w:pPr>
+            <w:r>
+              <w:rPr>
+                <w:sz w:val="18"/>
+              </w:rPr>
+            </w:r>
+            <w:r>
+              <w:rPr>
+                <w:sz w:val="18"/>
+              </w:rPr>
+              <w:t>601 ms</w:t>
             </w:r>
           </w:p>
         </w:tc>
@@ -1553,16 +3938,19 @@
             <w:tcW w:type="dxa" w:w="5040"/>
           </w:tcPr>
           <w:p>
-            <w:r>
-              <w:rPr>
-                <w:sz w:val="18"/>
-              </w:rPr>
-            </w:r>
-            <w:r>
-              <w:rPr>
-                <w:sz w:val="18"/>
-              </w:rPr>
-              <w:t>D. Session state (GPA)</w:t>
+            <w:pPr>
+              <w:jc w:val="left"/>
+            </w:pPr>
+            <w:r>
+              <w:rPr>
+                <w:sz w:val="18"/>
+              </w:rPr>
+            </w:r>
+            <w:r>
+              <w:rPr>
+                <w:sz w:val="18"/>
+              </w:rPr>
+              <w:t>BM25 retrieve, top-500</w:t>
             </w:r>
           </w:p>
         </w:tc>
@@ -1571,16 +3959,19 @@
             <w:tcW w:type="dxa" w:w="5040"/>
           </w:tcPr>
           <w:p>
-            <w:r>
-              <w:rPr>
-                <w:sz w:val="18"/>
-              </w:rPr>
-            </w:r>
-            <w:r>
-              <w:rPr>
-                <w:sz w:val="18"/>
-              </w:rPr>
-              <w:t>cosine to accepted- and to rejected-history centroids; artist-in-rejected-set; accepted/rejected turn counts; consecutive rejections; CF distance to history</w:t>
+            <w:pPr>
+              <w:jc w:val="left"/>
+            </w:pPr>
+            <w:r>
+              <w:rPr>
+                <w:sz w:val="18"/>
+              </w:rPr>
+            </w:r>
+            <w:r>
+              <w:rPr>
+                <w:sz w:val="18"/>
+              </w:rPr>
+              <w:t>0.5 ms</w:t>
             </w:r>
           </w:p>
         </w:tc>
@@ -1591,16 +3982,19 @@
             <w:tcW w:type="dxa" w:w="5040"/>
           </w:tcPr>
           <w:p>
-            <w:r>
-              <w:rPr>
-                <w:sz w:val="18"/>
-              </w:rPr>
-            </w:r>
-            <w:r>
-              <w:rPr>
-                <w:sz w:val="18"/>
-              </w:rPr>
-              <w:t>E. Intent extraction</w:t>
+            <w:pPr>
+              <w:jc w:val="left"/>
+            </w:pPr>
+            <w:r>
+              <w:rPr>
+                <w:sz w:val="18"/>
+              </w:rPr>
+            </w:r>
+            <w:r>
+              <w:rPr>
+                <w:sz w:val="18"/>
+              </w:rPr>
+              <w:t>Rescore: LambdaMART, 3,100 x 67 features</w:t>
             </w:r>
           </w:p>
         </w:tc>
@@ -1609,16 +4003,19 @@
             <w:tcW w:type="dxa" w:w="5040"/>
           </w:tcPr>
           <w:p>
-            <w:r>
-              <w:rPr>
-                <w:sz w:val="18"/>
-              </w:rPr>
-            </w:r>
-            <w:r>
-              <w:rPr>
-                <w:sz w:val="18"/>
-              </w:rPr>
-              <w:t>era/genre/mood keywords parsed from the request; candidate era/genre match; album continuity; within-artist popularity and transition ranks; bucket-match counts</w:t>
+            <w:pPr>
+              <w:jc w:val="left"/>
+            </w:pPr>
+            <w:r>
+              <w:rPr>
+                <w:sz w:val="18"/>
+              </w:rPr>
+            </w:r>
+            <w:r>
+              <w:rPr>
+                <w:sz w:val="18"/>
+              </w:rPr>
+              <w:t>3.4 ms</w:t>
             </w:r>
           </w:p>
         </w:tc>
@@ -1629,16 +4026,19 @@
             <w:tcW w:type="dxa" w:w="5040"/>
           </w:tcPr>
           <w:p>
-            <w:r>
-              <w:rPr>
-                <w:sz w:val="18"/>
-              </w:rPr>
-            </w:r>
-            <w:r>
-              <w:rPr>
-                <w:sz w:val="18"/>
-              </w:rPr>
-              <w:t>F. Sequential ID</w:t>
+            <w:pPr>
+              <w:jc w:val="left"/>
+            </w:pPr>
+            <w:r>
+              <w:rPr>
+                <w:sz w:val="18"/>
+              </w:rPr>
+            </w:r>
+            <w:r>
+              <w:rPr>
+                <w:sz w:val="18"/>
+              </w:rPr>
+              <w:t>Serving memory, all components loaded</w:t>
             </w:r>
           </w:p>
         </w:tc>
@@ -1647,16 +4047,201 @@
             <w:tcW w:type="dxa" w:w="5040"/>
           </w:tcPr>
           <w:p>
-            <w:r>
-              <w:rPr>
-                <w:sz w:val="18"/>
-              </w:rPr>
-            </w:r>
-            <w:r>
-              <w:rPr>
-                <w:sz w:val="18"/>
-              </w:rPr>
-              <w:t>SASRec bucket-origin and rank (optional configuration)</w:t>
+            <w:pPr>
+              <w:jc w:val="left"/>
+            </w:pPr>
+            <w:r>
+              <w:rPr>
+                <w:sz w:val="18"/>
+              </w:rPr>
+            </w:r>
+            <w:r>
+              <w:rPr>
+                <w:sz w:val="18"/>
+              </w:rPr>
+              <w:t>1.85 GB</w:t>
+            </w:r>
+          </w:p>
+        </w:tc>
+      </w:tr>
+      <w:tr>
+        <w:tc>
+          <w:tcPr>
+            <w:tcW w:type="dxa" w:w="5040"/>
+          </w:tcPr>
+          <w:p>
+            <w:pPr>
+              <w:jc w:val="left"/>
+            </w:pPr>
+            <w:r>
+              <w:rPr>
+                <w:sz w:val="18"/>
+              </w:rPr>
+            </w:r>
+            <w:r>
+              <w:rPr>
+                <w:sz w:val="18"/>
+              </w:rPr>
+              <w:t>Trained artifact (LoRA adapter)</w:t>
+            </w:r>
+          </w:p>
+        </w:tc>
+        <w:tc>
+          <w:tcPr>
+            <w:tcW w:type="dxa" w:w="5040"/>
+          </w:tcPr>
+          <w:p>
+            <w:pPr>
+              <w:jc w:val="left"/>
+            </w:pPr>
+            <w:r>
+              <w:rPr>
+                <w:sz w:val="18"/>
+              </w:rPr>
+            </w:r>
+            <w:r>
+              <w:rPr>
+                <w:sz w:val="18"/>
+              </w:rPr>
+              <w:t>24 MB</w:t>
+            </w:r>
+          </w:p>
+        </w:tc>
+      </w:tr>
+      <w:tr>
+        <w:tc>
+          <w:tcPr>
+            <w:tcW w:type="dxa" w:w="5040"/>
+          </w:tcPr>
+          <w:p>
+            <w:pPr>
+              <w:jc w:val="left"/>
+            </w:pPr>
+            <w:r>
+              <w:rPr>
+                <w:sz w:val="18"/>
+              </w:rPr>
+            </w:r>
+            <w:r>
+              <w:rPr>
+                <w:sz w:val="18"/>
+              </w:rPr>
+              <w:t>Recall stage, per turn (nine sources)</w:t>
+            </w:r>
+          </w:p>
+        </w:tc>
+        <w:tc>
+          <w:tcPr>
+            <w:tcW w:type="dxa" w:w="5040"/>
+          </w:tcPr>
+          <w:p>
+            <w:pPr>
+              <w:jc w:val="left"/>
+            </w:pPr>
+            <w:r>
+              <w:rPr>
+                <w:sz w:val="18"/>
+              </w:rPr>
+            </w:r>
+            <w:r>
+              <w:rPr>
+                <w:sz w:val="18"/>
+              </w:rPr>
+              <w:t>~0.26 s</w:t>
+            </w:r>
+          </w:p>
+        </w:tc>
+      </w:tr>
+      <w:tr>
+        <w:tc>
+          <w:tcPr>
+            <w:tcW w:type="dxa" w:w="5040"/>
+          </w:tcPr>
+          <w:p>
+            <w:pPr>
+              <w:jc w:val="left"/>
+            </w:pPr>
+            <w:r>
+              <w:rPr>
+                <w:sz w:val="18"/>
+              </w:rPr>
+            </w:r>
+            <w:r>
+              <w:rPr>
+                <w:sz w:val="18"/>
+              </w:rPr>
+              <w:t>Rescore stage, per turn</w:t>
+            </w:r>
+          </w:p>
+        </w:tc>
+        <w:tc>
+          <w:tcPr>
+            <w:tcW w:type="dxa" w:w="5040"/>
+          </w:tcPr>
+          <w:p>
+            <w:pPr>
+              <w:jc w:val="left"/>
+            </w:pPr>
+            <w:r>
+              <w:rPr>
+                <w:sz w:val="18"/>
+              </w:rPr>
+            </w:r>
+            <w:r>
+              <w:rPr>
+                <w:sz w:val="18"/>
+              </w:rPr>
+              <w:t>3.4 ms</w:t>
+            </w:r>
+          </w:p>
+        </w:tc>
+      </w:tr>
+      <w:tr>
+        <w:tc>
+          <w:tcPr>
+            <w:tcW w:type="dxa" w:w="5040"/>
+            <w:tcBorders>
+              <w:bottom w:val="single" w:sz="12" w:space="0" w:color="000000"/>
+            </w:tcBorders>
+          </w:tcPr>
+          <w:p>
+            <w:pPr>
+              <w:jc w:val="left"/>
+            </w:pPr>
+            <w:r>
+              <w:rPr>
+                <w:sz w:val="18"/>
+              </w:rPr>
+            </w:r>
+            <w:r>
+              <w:rPr>
+                <w:sz w:val="18"/>
+              </w:rPr>
+              <w:t>End-to-end, per session (per turn)</w:t>
+            </w:r>
+          </w:p>
+        </w:tc>
+        <w:tc>
+          <w:tcPr>
+            <w:tcW w:type="dxa" w:w="5040"/>
+            <w:tcBorders>
+              <w:bottom w:val="single" w:sz="12" w:space="0" w:color="000000"/>
+            </w:tcBorders>
+          </w:tcPr>
+          <w:p>
+            <w:pPr>
+              <w:jc w:val="left"/>
+            </w:pPr>
+            <w:r>
+              <w:rPr>
+                <w:sz w:val="18"/>
+              </w:rPr>
+            </w:r>
+            <w:r>
+              <w:rPr>
+                <w:sz w:val="18"/>
+              </w:rPr>
+              <w:t>2.17 s (0.27 s)</w:t>
             </w:r>
           </w:p>
         </w:tc>
@@ -1667,7 +4252,7 @@
         <w:pStyle w:val="Head1"/>
       </w:pPr>
       <w:r>
-        <w:t>5 Results</w:t>
+        <w:t>7 Conclusion</w:t>
       </w:r>
     </w:p>
     <w:p>
@@ -1675,875 +4260,7 @@
         <w:pStyle w:val="Para"/>
       </w:pPr>
       <w:r>
-        <w:t>Table 3 lists only the changes that moved the development nDCG@20 (1,000 sessions). The two largest single jumps are non-model changes: excluding already-played tracks from BM25 (+0.035), and replacing linear fusion with a learned ranker, which unlocked every later feature. The goal-progress fixes of Section 3.3 account for the final step to 0.1864. On the blind sets the same system scores nDCG@20 = 0.3997 (Blind A) and composite 0.49 (Blind B). Two negative results shaped the design: post-hoc editing of the ranker's top-20 to "clean up obvious mistakes" regressed nDCG in every trial, because logged next-tracks often lie inside the same artist cluster a curator would prune; and zero-shot cross-encoder and LLM rerankers underperformed the feature-based LambdaMART while costing orders of magnitude more compute.</w:t>
-      </w:r>
-    </w:p>
-    <w:p>
-      <w:pPr>
-        <w:pStyle w:val="TableCaption"/>
-      </w:pPr>
-      <w:r>
-        <w:t>Table 3: Development nDCG@20 after each load-bearing change.</w:t>
-      </w:r>
-    </w:p>
-    <w:tbl>
-      <w:tblPr>
-        <w:tblStyle w:val="TableGrid"/>
-        <w:tblW w:type="auto" w:w="0"/>
-        <w:tblLook w:firstColumn="1" w:firstRow="1" w:lastColumn="0" w:lastRow="0" w:noHBand="0" w:noVBand="1" w:val="04A0"/>
-      </w:tblPr>
-      <w:tblGrid>
-        <w:gridCol w:w="5040"/>
-        <w:gridCol w:w="5040"/>
-      </w:tblGrid>
-      <w:tr>
-        <w:tc>
-          <w:tcPr>
-            <w:tcW w:type="dxa" w:w="5040"/>
-          </w:tcPr>
-          <w:p>
-            <w:r/>
-            <w:r>
-              <w:rPr>
-                <w:b/>
-                <w:sz w:val="18"/>
-              </w:rPr>
-              <w:t>Change</w:t>
-            </w:r>
-          </w:p>
-        </w:tc>
-        <w:tc>
-          <w:tcPr>
-            <w:tcW w:type="dxa" w:w="5040"/>
-          </w:tcPr>
-          <w:p>
-            <w:r/>
-            <w:r>
-              <w:rPr>
-                <w:b/>
-                <w:sz w:val="18"/>
-              </w:rPr>
-              <w:t>nDCG@20</w:t>
-            </w:r>
-          </w:p>
-        </w:tc>
-      </w:tr>
-      <w:tr>
-        <w:tc>
-          <w:tcPr>
-            <w:tcW w:type="dxa" w:w="5040"/>
-          </w:tcPr>
-          <w:p>
-            <w:r>
-              <w:rPr>
-                <w:sz w:val="18"/>
-              </w:rPr>
-            </w:r>
-            <w:r>
-              <w:rPr>
-                <w:sz w:val="18"/>
-              </w:rPr>
-              <w:t>BM25 over name + artist + album</w:t>
-            </w:r>
-          </w:p>
-        </w:tc>
-        <w:tc>
-          <w:tcPr>
-            <w:tcW w:type="dxa" w:w="5040"/>
-          </w:tcPr>
-          <w:p>
-            <w:r>
-              <w:rPr>
-                <w:sz w:val="18"/>
-              </w:rPr>
-            </w:r>
-            <w:r>
-              <w:rPr>
-                <w:sz w:val="18"/>
-              </w:rPr>
-              <w:t>0.0861</w:t>
-            </w:r>
-          </w:p>
-        </w:tc>
-      </w:tr>
-      <w:tr>
-        <w:tc>
-          <w:tcPr>
-            <w:tcW w:type="dxa" w:w="5040"/>
-          </w:tcPr>
-          <w:p>
-            <w:r>
-              <w:rPr>
-                <w:sz w:val="18"/>
-              </w:rPr>
-            </w:r>
-            <w:r>
-              <w:rPr>
-                <w:sz w:val="18"/>
-              </w:rPr>
-              <w:t>+ index the tag list</w:t>
-            </w:r>
-          </w:p>
-        </w:tc>
-        <w:tc>
-          <w:tcPr>
-            <w:tcW w:type="dxa" w:w="5040"/>
-          </w:tcPr>
-          <w:p>
-            <w:r>
-              <w:rPr>
-                <w:sz w:val="18"/>
-              </w:rPr>
-            </w:r>
-            <w:r>
-              <w:rPr>
-                <w:sz w:val="18"/>
-              </w:rPr>
-              <w:t>0.0960</w:t>
-            </w:r>
-          </w:p>
-        </w:tc>
-      </w:tr>
-      <w:tr>
-        <w:tc>
-          <w:tcPr>
-            <w:tcW w:type="dxa" w:w="5040"/>
-          </w:tcPr>
-          <w:p>
-            <w:r>
-              <w:rPr>
-                <w:sz w:val="18"/>
-              </w:rPr>
-            </w:r>
-            <w:r>
-              <w:rPr>
-                <w:sz w:val="18"/>
-              </w:rPr>
-              <w:t>+ exclude already-played tracks</w:t>
-            </w:r>
-          </w:p>
-        </w:tc>
-        <w:tc>
-          <w:tcPr>
-            <w:tcW w:type="dxa" w:w="5040"/>
-          </w:tcPr>
-          <w:p>
-            <w:r>
-              <w:rPr>
-                <w:sz w:val="18"/>
-              </w:rPr>
-            </w:r>
-            <w:r>
-              <w:rPr>
-                <w:sz w:val="18"/>
-              </w:rPr>
-              <w:t>0.1313</w:t>
-            </w:r>
-          </w:p>
-        </w:tc>
-      </w:tr>
-      <w:tr>
-        <w:tc>
-          <w:tcPr>
-            <w:tcW w:type="dxa" w:w="5040"/>
-          </w:tcPr>
-          <w:p>
-            <w:r>
-              <w:rPr>
-                <w:sz w:val="18"/>
-              </w:rPr>
-            </w:r>
-            <w:r>
-              <w:rPr>
-                <w:sz w:val="18"/>
-              </w:rPr>
-              <w:t>+ fine-tuned two-tower, linear fusion</w:t>
-            </w:r>
-          </w:p>
-        </w:tc>
-        <w:tc>
-          <w:tcPr>
-            <w:tcW w:type="dxa" w:w="5040"/>
-          </w:tcPr>
-          <w:p>
-            <w:r>
-              <w:rPr>
-                <w:sz w:val="18"/>
-              </w:rPr>
-            </w:r>
-            <w:r>
-              <w:rPr>
-                <w:sz w:val="18"/>
-              </w:rPr>
-              <w:t>0.1418</w:t>
-            </w:r>
-          </w:p>
-        </w:tc>
-      </w:tr>
-      <w:tr>
-        <w:tc>
-          <w:tcPr>
-            <w:tcW w:type="dxa" w:w="5040"/>
-          </w:tcPr>
-          <w:p>
-            <w:r>
-              <w:rPr>
-                <w:sz w:val="18"/>
-              </w:rPr>
-            </w:r>
-            <w:r>
-              <w:rPr>
-                <w:sz w:val="18"/>
-              </w:rPr>
-              <w:t>+ multi-source pool expansion</w:t>
-            </w:r>
-          </w:p>
-        </w:tc>
-        <w:tc>
-          <w:tcPr>
-            <w:tcW w:type="dxa" w:w="5040"/>
-          </w:tcPr>
-          <w:p>
-            <w:r>
-              <w:rPr>
-                <w:sz w:val="18"/>
-              </w:rPr>
-            </w:r>
-            <w:r>
-              <w:rPr>
-                <w:sz w:val="18"/>
-              </w:rPr>
-              <w:t>0.1533</w:t>
-            </w:r>
-          </w:p>
-        </w:tc>
-      </w:tr>
-      <w:tr>
-        <w:tc>
-          <w:tcPr>
-            <w:tcW w:type="dxa" w:w="5040"/>
-          </w:tcPr>
-          <w:p>
-            <w:r>
-              <w:rPr>
-                <w:sz w:val="18"/>
-              </w:rPr>
-            </w:r>
-            <w:r>
-              <w:rPr>
-                <w:sz w:val="18"/>
-              </w:rPr>
-              <w:t>+ LightGBM LambdaMART replaces linear fusion</w:t>
-            </w:r>
-          </w:p>
-        </w:tc>
-        <w:tc>
-          <w:tcPr>
-            <w:tcW w:type="dxa" w:w="5040"/>
-          </w:tcPr>
-          <w:p>
-            <w:r>
-              <w:rPr>
-                <w:sz w:val="18"/>
-              </w:rPr>
-            </w:r>
-            <w:r>
-              <w:rPr>
-                <w:sz w:val="18"/>
-              </w:rPr>
-              <w:t>0.1609</w:t>
-            </w:r>
-          </w:p>
-        </w:tc>
-      </w:tr>
-      <w:tr>
-        <w:tc>
-          <w:tcPr>
-            <w:tcW w:type="dxa" w:w="5040"/>
-          </w:tcPr>
-          <w:p>
-            <w:r>
-              <w:rPr>
-                <w:sz w:val="18"/>
-              </w:rPr>
-            </w:r>
-            <w:r>
-              <w:rPr>
-                <w:sz w:val="18"/>
-              </w:rPr>
-              <w:t>+ feature engineering, larger two-tower pool</w:t>
-            </w:r>
-          </w:p>
-        </w:tc>
-        <w:tc>
-          <w:tcPr>
-            <w:tcW w:type="dxa" w:w="5040"/>
-          </w:tcPr>
-          <w:p>
-            <w:r>
-              <w:rPr>
-                <w:sz w:val="18"/>
-              </w:rPr>
-            </w:r>
-            <w:r>
-              <w:rPr>
-                <w:sz w:val="18"/>
-              </w:rPr>
-              <w:t>0.1684</w:t>
-            </w:r>
-          </w:p>
-        </w:tc>
-      </w:tr>
-      <w:tr>
-        <w:tc>
-          <w:tcPr>
-            <w:tcW w:type="dxa" w:w="5040"/>
-          </w:tcPr>
-          <w:p>
-            <w:r>
-              <w:rPr>
-                <w:sz w:val="18"/>
-              </w:rPr>
-            </w:r>
-            <w:r>
-              <w:rPr>
-                <w:sz w:val="18"/>
-              </w:rPr>
-              <w:t>+ E5 role-tagged dialogue anchor</w:t>
-            </w:r>
-          </w:p>
-        </w:tc>
-        <w:tc>
-          <w:tcPr>
-            <w:tcW w:type="dxa" w:w="5040"/>
-          </w:tcPr>
-          <w:p>
-            <w:r>
-              <w:rPr>
-                <w:sz w:val="18"/>
-              </w:rPr>
-            </w:r>
-            <w:r>
-              <w:rPr>
-                <w:sz w:val="18"/>
-              </w:rPr>
-              <w:t>0.1748</w:t>
-            </w:r>
-          </w:p>
-        </w:tc>
-      </w:tr>
-      <w:tr>
-        <w:tc>
-          <w:tcPr>
-            <w:tcW w:type="dxa" w:w="5040"/>
-          </w:tcPr>
-          <w:p>
-            <w:r>
-              <w:rPr>
-                <w:sz w:val="18"/>
-              </w:rPr>
-            </w:r>
-            <w:r>
-              <w:rPr>
-                <w:sz w:val="18"/>
-              </w:rPr>
-              <w:t>+ GPA-aware inference and intent features</w:t>
-            </w:r>
-          </w:p>
-        </w:tc>
-        <w:tc>
-          <w:tcPr>
-            <w:tcW w:type="dxa" w:w="5040"/>
-          </w:tcPr>
-          <w:p>
-            <w:r>
-              <w:rPr>
-                <w:sz w:val="18"/>
-              </w:rPr>
-            </w:r>
-            <w:r>
-              <w:rPr>
-                <w:sz w:val="18"/>
-              </w:rPr>
-              <w:t>0.1864</w:t>
-            </w:r>
-          </w:p>
-        </w:tc>
-      </w:tr>
-    </w:tbl>
-    <w:p>
-      <w:pPr>
-        <w:pStyle w:val="Head1"/>
-      </w:pPr>
-      <w:r>
-        <w:t>6 Efficiency and Scalability</w:t>
-      </w:r>
-    </w:p>
-    <w:p>
-      <w:pPr>
-        <w:pStyle w:val="Para"/>
-      </w:pPr>
-      <w:r>
-        <w:t xml:space="preserve">Every stage is CPU-native; Table 4 (top) reports per-component latencies with all neural blocks forced to CPU. Exact brute-force similarity over the 47,071 x 768 matrix is a single matmul, so no approximate index is needed at this catalog scale, and every stage except the encoder passes is single-digit milliseconds. Measured end-to-end over the 200-session evaluation set, the full recall-plus- rescore pipeline runs at </w:t>
-      </w:r>
-      <w:r>
-        <w:rPr>
-          <w:b/>
-        </w:rPr>
-        <w:t>2.17 s per session, about 0.27 s per turn</w:t>
-      </w:r>
-      <w:r>
-        <w:t xml:space="preserve"> (Table 4, bottom). Of this, the rescore stage is negligible: scoring the ~3,300-candidate pool with LambdaMART takes ~3.4 ms, roughly 1% of turn latency, so recall (the nine sources and their two query-encoder passes) accounts for essentially all of it. Even with every neural block pinned to the CPU (Table 4, top), a full turn stays under one second; dropping the frozen Qwen3-0.6B encoder in the eight-source configuration removes the single largest cost. The trained artifact is a 24 MB LoRA adapter and the serving process fits in under ~2 GB of RAM, so the entire train/evaluate/iterate loop, including the one LoRA fine-tune, runs on a single 16 GB desktop, which is what made rapid iteration practical.</w:t>
-      </w:r>
-    </w:p>
-    <w:p>
-      <w:pPr>
-        <w:pStyle w:val="Para"/>
-      </w:pPr>
-      <w:r>
-        <w:rPr>
-          <w:b/>
-        </w:rPr>
-        <w:t>Table 4: Measured latency and footprint. Top: per component, all neural blocks forced to CPU (worst case), median over 20 runs. Bottom: end-to-end recall + rescore over the 200-session set, encoders on the Metal backend.</w:t>
-      </w:r>
-    </w:p>
-    <w:tbl>
-      <w:tblPr>
-        <w:tblStyle w:val="TableGrid"/>
-        <w:tblW w:type="auto" w:w="0"/>
-        <w:tblLook w:firstColumn="1" w:firstRow="1" w:lastColumn="0" w:lastRow="0" w:noHBand="0" w:noVBand="1" w:val="04A0"/>
-      </w:tblPr>
-      <w:tblGrid>
-        <w:gridCol w:w="5040"/>
-        <w:gridCol w:w="5040"/>
-      </w:tblGrid>
-      <w:tr>
-        <w:tc>
-          <w:tcPr>
-            <w:tcW w:type="dxa" w:w="5040"/>
-          </w:tcPr>
-          <w:p>
-            <w:r/>
-            <w:r>
-              <w:rPr>
-                <w:b/>
-                <w:sz w:val="18"/>
-              </w:rPr>
-              <w:t>Operation</w:t>
-            </w:r>
-          </w:p>
-        </w:tc>
-        <w:tc>
-          <w:tcPr>
-            <w:tcW w:type="dxa" w:w="5040"/>
-          </w:tcPr>
-          <w:p>
-            <w:r/>
-            <w:r>
-              <w:rPr>
-                <w:b/>
-                <w:sz w:val="18"/>
-              </w:rPr>
-              <w:t>Cost</w:t>
-            </w:r>
-          </w:p>
-        </w:tc>
-      </w:tr>
-      <w:tr>
-        <w:tc>
-          <w:tcPr>
-            <w:tcW w:type="dxa" w:w="5040"/>
-          </w:tcPr>
-          <w:p>
-            <w:r>
-              <w:rPr>
-                <w:sz w:val="18"/>
-              </w:rPr>
-            </w:r>
-            <w:r>
-              <w:rPr>
-                <w:sz w:val="18"/>
-              </w:rPr>
-              <w:t>Two-tower query encode (e5-base)</w:t>
-            </w:r>
-          </w:p>
-        </w:tc>
-        <w:tc>
-          <w:tcPr>
-            <w:tcW w:type="dxa" w:w="5040"/>
-          </w:tcPr>
-          <w:p>
-            <w:r>
-              <w:rPr>
-                <w:sz w:val="18"/>
-              </w:rPr>
-            </w:r>
-            <w:r>
-              <w:rPr>
-                <w:sz w:val="18"/>
-              </w:rPr>
-              <w:t>47 ms</w:t>
-            </w:r>
-          </w:p>
-        </w:tc>
-      </w:tr>
-      <w:tr>
-        <w:tc>
-          <w:tcPr>
-            <w:tcW w:type="dxa" w:w="5040"/>
-          </w:tcPr>
-          <w:p>
-            <w:r>
-              <w:rPr>
-                <w:sz w:val="18"/>
-              </w:rPr>
-            </w:r>
-            <w:r>
-              <w:rPr>
-                <w:sz w:val="18"/>
-              </w:rPr>
-              <w:t>Exact ANN, 47,071 x 768, top-2000</w:t>
-            </w:r>
-          </w:p>
-        </w:tc>
-        <w:tc>
-          <w:tcPr>
-            <w:tcW w:type="dxa" w:w="5040"/>
-          </w:tcPr>
-          <w:p>
-            <w:r>
-              <w:rPr>
-                <w:sz w:val="18"/>
-              </w:rPr>
-            </w:r>
-            <w:r>
-              <w:rPr>
-                <w:sz w:val="18"/>
-              </w:rPr>
-              <w:t>2.2 ms</w:t>
-            </w:r>
-          </w:p>
-        </w:tc>
-      </w:tr>
-      <w:tr>
-        <w:tc>
-          <w:tcPr>
-            <w:tcW w:type="dxa" w:w="5040"/>
-          </w:tcPr>
-          <w:p>
-            <w:r>
-              <w:rPr>
-                <w:sz w:val="18"/>
-              </w:rPr>
-            </w:r>
-            <w:r>
-              <w:rPr>
-                <w:sz w:val="18"/>
-              </w:rPr>
-              <w:t>Qwen3-0.6B query encode</w:t>
-            </w:r>
-          </w:p>
-        </w:tc>
-        <w:tc>
-          <w:tcPr>
-            <w:tcW w:type="dxa" w:w="5040"/>
-          </w:tcPr>
-          <w:p>
-            <w:r>
-              <w:rPr>
-                <w:sz w:val="18"/>
-              </w:rPr>
-            </w:r>
-            <w:r>
-              <w:rPr>
-                <w:sz w:val="18"/>
-              </w:rPr>
-              <w:t>601 ms</w:t>
-            </w:r>
-          </w:p>
-        </w:tc>
-      </w:tr>
-      <w:tr>
-        <w:tc>
-          <w:tcPr>
-            <w:tcW w:type="dxa" w:w="5040"/>
-          </w:tcPr>
-          <w:p>
-            <w:r>
-              <w:rPr>
-                <w:sz w:val="18"/>
-              </w:rPr>
-            </w:r>
-            <w:r>
-              <w:rPr>
-                <w:sz w:val="18"/>
-              </w:rPr>
-              <w:t>BM25 retrieve, top-500</w:t>
-            </w:r>
-          </w:p>
-        </w:tc>
-        <w:tc>
-          <w:tcPr>
-            <w:tcW w:type="dxa" w:w="5040"/>
-          </w:tcPr>
-          <w:p>
-            <w:r>
-              <w:rPr>
-                <w:sz w:val="18"/>
-              </w:rPr>
-            </w:r>
-            <w:r>
-              <w:rPr>
-                <w:sz w:val="18"/>
-              </w:rPr>
-              <w:t>0.5 ms</w:t>
-            </w:r>
-          </w:p>
-        </w:tc>
-      </w:tr>
-      <w:tr>
-        <w:tc>
-          <w:tcPr>
-            <w:tcW w:type="dxa" w:w="5040"/>
-          </w:tcPr>
-          <w:p>
-            <w:r>
-              <w:rPr>
-                <w:sz w:val="18"/>
-              </w:rPr>
-            </w:r>
-            <w:r>
-              <w:rPr>
-                <w:sz w:val="18"/>
-              </w:rPr>
-              <w:t>Rescore: LambdaMART, 3,100 x 67 features</w:t>
-            </w:r>
-          </w:p>
-        </w:tc>
-        <w:tc>
-          <w:tcPr>
-            <w:tcW w:type="dxa" w:w="5040"/>
-          </w:tcPr>
-          <w:p>
-            <w:r>
-              <w:rPr>
-                <w:sz w:val="18"/>
-              </w:rPr>
-            </w:r>
-            <w:r>
-              <w:rPr>
-                <w:sz w:val="18"/>
-              </w:rPr>
-              <w:t>3.4 ms</w:t>
-            </w:r>
-          </w:p>
-        </w:tc>
-      </w:tr>
-      <w:tr>
-        <w:tc>
-          <w:tcPr>
-            <w:tcW w:type="dxa" w:w="5040"/>
-          </w:tcPr>
-          <w:p>
-            <w:r>
-              <w:rPr>
-                <w:sz w:val="18"/>
-              </w:rPr>
-            </w:r>
-            <w:r>
-              <w:rPr>
-                <w:sz w:val="18"/>
-              </w:rPr>
-              <w:t>Serving memory, all components loaded</w:t>
-            </w:r>
-          </w:p>
-        </w:tc>
-        <w:tc>
-          <w:tcPr>
-            <w:tcW w:type="dxa" w:w="5040"/>
-          </w:tcPr>
-          <w:p>
-            <w:r>
-              <w:rPr>
-                <w:sz w:val="18"/>
-              </w:rPr>
-            </w:r>
-            <w:r>
-              <w:rPr>
-                <w:sz w:val="18"/>
-              </w:rPr>
-              <w:t>1.85 GB</w:t>
-            </w:r>
-          </w:p>
-        </w:tc>
-      </w:tr>
-      <w:tr>
-        <w:tc>
-          <w:tcPr>
-            <w:tcW w:type="dxa" w:w="5040"/>
-          </w:tcPr>
-          <w:p>
-            <w:r>
-              <w:rPr>
-                <w:sz w:val="18"/>
-              </w:rPr>
-            </w:r>
-            <w:r>
-              <w:rPr>
-                <w:sz w:val="18"/>
-              </w:rPr>
-              <w:t>Trained artifact (LoRA adapter)</w:t>
-            </w:r>
-          </w:p>
-        </w:tc>
-        <w:tc>
-          <w:tcPr>
-            <w:tcW w:type="dxa" w:w="5040"/>
-          </w:tcPr>
-          <w:p>
-            <w:r>
-              <w:rPr>
-                <w:sz w:val="18"/>
-              </w:rPr>
-            </w:r>
-            <w:r>
-              <w:rPr>
-                <w:sz w:val="18"/>
-              </w:rPr>
-              <w:t>24 MB</w:t>
-            </w:r>
-          </w:p>
-        </w:tc>
-      </w:tr>
-      <w:tr>
-        <w:tc>
-          <w:tcPr>
-            <w:tcW w:type="dxa" w:w="5040"/>
-          </w:tcPr>
-          <w:p>
-            <w:r>
-              <w:rPr>
-                <w:sz w:val="18"/>
-              </w:rPr>
-            </w:r>
-            <w:r>
-              <w:rPr>
-                <w:sz w:val="18"/>
-              </w:rPr>
-              <w:t>Recall stage, per turn (nine sources)</w:t>
-            </w:r>
-          </w:p>
-        </w:tc>
-        <w:tc>
-          <w:tcPr>
-            <w:tcW w:type="dxa" w:w="5040"/>
-          </w:tcPr>
-          <w:p>
-            <w:r>
-              <w:rPr>
-                <w:sz w:val="18"/>
-              </w:rPr>
-            </w:r>
-            <w:r>
-              <w:rPr>
-                <w:sz w:val="18"/>
-              </w:rPr>
-              <w:t>~0.26 s</w:t>
-            </w:r>
-          </w:p>
-        </w:tc>
-      </w:tr>
-      <w:tr>
-        <w:tc>
-          <w:tcPr>
-            <w:tcW w:type="dxa" w:w="5040"/>
-          </w:tcPr>
-          <w:p>
-            <w:r>
-              <w:rPr>
-                <w:sz w:val="18"/>
-              </w:rPr>
-            </w:r>
-            <w:r>
-              <w:rPr>
-                <w:sz w:val="18"/>
-              </w:rPr>
-              <w:t>Rescore stage, per turn</w:t>
-            </w:r>
-          </w:p>
-        </w:tc>
-        <w:tc>
-          <w:tcPr>
-            <w:tcW w:type="dxa" w:w="5040"/>
-          </w:tcPr>
-          <w:p>
-            <w:r>
-              <w:rPr>
-                <w:sz w:val="18"/>
-              </w:rPr>
-            </w:r>
-            <w:r>
-              <w:rPr>
-                <w:sz w:val="18"/>
-              </w:rPr>
-              <w:t>3.4 ms</w:t>
-            </w:r>
-          </w:p>
-        </w:tc>
-      </w:tr>
-      <w:tr>
-        <w:tc>
-          <w:tcPr>
-            <w:tcW w:type="dxa" w:w="5040"/>
-          </w:tcPr>
-          <w:p>
-            <w:r>
-              <w:rPr>
-                <w:sz w:val="18"/>
-              </w:rPr>
-            </w:r>
-            <w:r>
-              <w:rPr>
-                <w:sz w:val="18"/>
-              </w:rPr>
-              <w:t>End-to-end, per session (per turn)</w:t>
-            </w:r>
-          </w:p>
-        </w:tc>
-        <w:tc>
-          <w:tcPr>
-            <w:tcW w:type="dxa" w:w="5040"/>
-          </w:tcPr>
-          <w:p>
-            <w:r>
-              <w:rPr>
-                <w:sz w:val="18"/>
-              </w:rPr>
-            </w:r>
-            <w:r>
-              <w:rPr>
-                <w:sz w:val="18"/>
-              </w:rPr>
-              <w:t>2.17 s (0.27 s)</w:t>
-            </w:r>
-          </w:p>
-        </w:tc>
-      </w:tr>
-    </w:tbl>
-    <w:p>
-      <w:pPr>
-        <w:pStyle w:val="Head1"/>
-      </w:pPr>
-      <w:r>
-        <w:t>7 Conclusion</w:t>
-      </w:r>
-    </w:p>
-    <w:p>
-      <w:pPr>
-        <w:pStyle w:val="Para"/>
-      </w:pPr>
-      <w:r>
-        <w:t>A conversational music recommender need not use a GPU cluster or a per-candidate neural reranker to be competitive. Fusing many inexpensive retrievers, letting a gradient-boosted ranker arbitrate them, adding a single LoRA-adapted dialogue encoder, and correctly handling a goal-progress feedback signal that is off-by-one in time, contaminated with rejected tracks, and absent at test time together reach composite 0.49 on the blind set while training and serving on one desktop.</w:t>
+        <w:t>Treating goal-progress feedback as a delayed, sometimes-withheld preference-elicitation signal -- aligning it in time, removing rejected-track contamination, and reconstructing it from dialogue when absent -- feeds directly into recall, ranking, and the dialogue-aware retriever's anchor. Fusing many inexpensive retrievers, letting a gradient-boosted ranker arbitrate them, and adding a single LoRA-adapted dialogue encoder built around this signal together reach composite 0.49 on the blind set, entirely on one desktop with no discrete GPU.</w:t>
       </w:r>
     </w:p>
     <w:p>

</xml_diff>

<commit_message>
fix: docx tables overflow the template's two-column body section
The interim ACM template's body is two-column (~3.33in/column), not the
single 7in-wide column the table widths assumed, so fixed-width tables
overflowed past the column edge with cell text truncated mid-word (visible
in Table 1's Signal column). Wrap each table in a continuous section break
so it spans the full page width, matching how wide tables are normally
handled in two-column academic layouts. Also fixes the caption regex, which
didn't match the "Table 3a"/"Table 3b" labels added this session -- those
two tables were silently losing their caption style and falling back to
even column-width splits.
</commit_message>
<xml_diff>
--- a/paper_wikis/paper.docx
+++ b/paper_wikis/paper.docx
@@ -205,6 +205,16 @@
       <w:r>
         <w:t>: even low-precision sources help, because source membership feeds the agreement feature of Section 4.</w:t>
       </w:r>
+    </w:p>
+    <w:p>
+      <w:pPr>
+        <w:sectPr>
+          <w:type w:val="continuous"/>
+          <w:pgSz w:w="12240" w:h="15840" w:code="9"/>
+          <w:pgMar w:top="1500" w:right="1080" w:bottom="1600" w:left="1080" w:header="1080" w:footer="1080" w:gutter="0"/>
+          <w:cols w:num="1"/>
+        </w:sectPr>
+      </w:pPr>
     </w:p>
     <w:p>
       <w:pPr>
@@ -1119,6 +1129,16 @@
     </w:tbl>
     <w:p>
       <w:pPr>
+        <w:sectPr>
+          <w:type w:val="continuous"/>
+          <w:pgSz w:w="12240" w:h="15840" w:code="9"/>
+          <w:pgMar w:top="1500" w:right="1080" w:bottom="1600" w:left="1080" w:header="1080" w:footer="1080" w:gutter="0"/>
+          <w:cols w:num="2" w:space="480"/>
+        </w:sectPr>
+      </w:pPr>
+    </w:p>
+    <w:p>
+      <w:pPr>
         <w:pStyle w:val="Para"/>
       </w:pPr>
       <w:r>
@@ -1537,6 +1557,16 @@
       <w:r>
         <w:t>, absorbs heterogeneous features (cosines, ranks, count tables, metadata, session counters), and handles extreme imbalance natively (one positive per ~3,300 candidates) via pairwise gradients within each turn's group. Training runs the full retrieval in dump mode on 6,000 held-out sessions, yielding 27,166 groups and 89.7M rows; the 8.2% of groups whose gold track the pool missed carry no positive and are dropped, leaving 24,951 training groups. The model has 67 features (5-fold session CV nDCG@20 = 0.3144) and is a 0.6 MB file. The features fall into six groups (Table 2). Group B dominates: multi-source agreement accounts for roughly 57% of total model gain and is the feature that transfers best when goal and GPA are withheld on the blind set.</w:t>
       </w:r>
+    </w:p>
+    <w:p>
+      <w:pPr>
+        <w:sectPr>
+          <w:type w:val="continuous"/>
+          <w:pgSz w:w="12240" w:h="15840" w:code="9"/>
+          <w:pgMar w:top="1500" w:right="1080" w:bottom="1600" w:left="1080" w:header="1080" w:footer="1080" w:gutter="0"/>
+          <w:cols w:num="1"/>
+        </w:sectPr>
+      </w:pPr>
     </w:p>
     <w:p>
       <w:pPr>
@@ -1894,19 +1924,39 @@
     </w:tbl>
     <w:p>
       <w:pPr>
-        <w:pStyle w:val="Head1"/>
-      </w:pPr>
-      <w:r>
-        <w:t>5 Results</w:t>
-      </w:r>
+        <w:sectPr>
+          <w:type w:val="continuous"/>
+          <w:pgSz w:w="12240" w:h="15840" w:code="9"/>
+          <w:pgMar w:top="1500" w:right="1080" w:bottom="1600" w:left="1080" w:header="1080" w:footer="1080" w:gutter="0"/>
+          <w:cols w:num="2" w:space="480"/>
+        </w:sectPr>
+      </w:pPr>
     </w:p>
     <w:p>
       <w:pPr>
+        <w:pStyle w:val="Head1"/>
+      </w:pPr>
+      <w:r>
+        <w:t>5 Results</w:t>
+      </w:r>
+    </w:p>
+    <w:p>
+      <w:pPr>
         <w:pStyle w:val="Para"/>
       </w:pPr>
       <w:r>
         <w:t>Table 3 lists only the changes that moved the development nDCG@20 (1,000 sessions). The two largest single jumps are non-model changes: excluding already-played tracks from BM25 (+0.035), and replacing linear fusion with a learned ranker, which unlocked every later feature. The goal-progress fixes of Section 3.3 account for the final step to 0.1864. On the blind sets the same system scores nDCG@20 = 0.3997 (Blind A) and composite 0.49 (Blind B).</w:t>
       </w:r>
+    </w:p>
+    <w:p>
+      <w:pPr>
+        <w:sectPr>
+          <w:type w:val="continuous"/>
+          <w:pgSz w:w="12240" w:h="15840" w:code="9"/>
+          <w:pgMar w:top="1500" w:right="1080" w:bottom="1600" w:left="1080" w:header="1080" w:footer="1080" w:gutter="0"/>
+          <w:cols w:num="1"/>
+        </w:sectPr>
+      </w:pPr>
     </w:p>
     <w:p>
       <w:pPr>
@@ -2389,6 +2439,16 @@
     </w:tbl>
     <w:p>
       <w:pPr>
+        <w:sectPr>
+          <w:type w:val="continuous"/>
+          <w:pgSz w:w="12240" w:h="15840" w:code="9"/>
+          <w:pgMar w:top="1500" w:right="1080" w:bottom="1600" w:left="1080" w:header="1080" w:footer="1080" w:gutter="0"/>
+          <w:cols w:num="2" w:space="480"/>
+        </w:sectPr>
+      </w:pPr>
+    </w:p>
+    <w:p>
+      <w:pPr>
         <w:pStyle w:val="Head2"/>
       </w:pPr>
       <w:r>
@@ -2428,12 +2488,19 @@
     </w:p>
     <w:p>
       <w:pPr>
-        <w:pStyle w:val="Para"/>
-      </w:pPr>
-      <w:r>
-        <w:rPr>
-          <w:b/>
-        </w:rPr>
+        <w:sectPr>
+          <w:type w:val="continuous"/>
+          <w:pgSz w:w="12240" w:h="15840" w:code="9"/>
+          <w:pgMar w:top="1500" w:right="1080" w:bottom="1600" w:left="1080" w:header="1080" w:footer="1080" w:gutter="0"/>
+          <w:cols w:num="1"/>
+        </w:sectPr>
+      </w:pPr>
+    </w:p>
+    <w:p>
+      <w:pPr>
+        <w:pStyle w:val="TableCaption"/>
+      </w:pPr>
+      <w:r>
         <w:t>Table 3a: Reranking attempts on top of the LambdaMART baseline.</w:t>
       </w:r>
     </w:p>
@@ -2451,9 +2518,9 @@
         <w:tblLayout w:type="fixed"/>
       </w:tblPr>
       <w:tblGrid>
-        <w:gridCol w:w="3360"/>
-        <w:gridCol w:w="3360"/>
-        <w:gridCol w:w="3360"/>
+        <w:gridCol w:w="2880"/>
+        <w:gridCol w:w="4031"/>
+        <w:gridCol w:w="3168"/>
       </w:tblGrid>
       <w:tr>
         <w:trPr>
@@ -2461,7 +2528,7 @@
         </w:trPr>
         <w:tc>
           <w:tcPr>
-            <w:tcW w:type="dxa" w:w="3360"/>
+            <w:tcW w:type="dxa" w:w="2880"/>
             <w:shd w:val="clear" w:color="auto" w:fill="E7E7E7"/>
             <w:tcBorders>
               <w:top w:val="single" w:sz="12" w:space="0" w:color="000000"/>
@@ -2484,7 +2551,7 @@
         </w:tc>
         <w:tc>
           <w:tcPr>
-            <w:tcW w:type="dxa" w:w="3360"/>
+            <w:tcW w:type="dxa" w:w="4032"/>
             <w:shd w:val="clear" w:color="auto" w:fill="E7E7E7"/>
             <w:tcBorders>
               <w:top w:val="single" w:sz="12" w:space="0" w:color="000000"/>
@@ -2507,7 +2574,7 @@
         </w:tc>
         <w:tc>
           <w:tcPr>
-            <w:tcW w:type="dxa" w:w="3360"/>
+            <w:tcW w:type="dxa" w:w="3168"/>
             <w:shd w:val="clear" w:color="auto" w:fill="E7E7E7"/>
             <w:tcBorders>
               <w:top w:val="single" w:sz="12" w:space="0" w:color="000000"/>
@@ -2532,7 +2599,7 @@
       <w:tr>
         <w:tc>
           <w:tcPr>
-            <w:tcW w:type="dxa" w:w="3360"/>
+            <w:tcW w:type="dxa" w:w="2880"/>
           </w:tcPr>
           <w:p>
             <w:pPr>
@@ -2553,7 +2620,7 @@
         </w:tc>
         <w:tc>
           <w:tcPr>
-            <w:tcW w:type="dxa" w:w="3360"/>
+            <w:tcW w:type="dxa" w:w="4032"/>
           </w:tcPr>
           <w:p>
             <w:pPr>
@@ -2574,7 +2641,7 @@
         </w:tc>
         <w:tc>
           <w:tcPr>
-            <w:tcW w:type="dxa" w:w="3360"/>
+            <w:tcW w:type="dxa" w:w="3168"/>
           </w:tcPr>
           <w:p>
             <w:pPr>
@@ -2597,7 +2664,7 @@
       <w:tr>
         <w:tc>
           <w:tcPr>
-            <w:tcW w:type="dxa" w:w="3360"/>
+            <w:tcW w:type="dxa" w:w="2880"/>
           </w:tcPr>
           <w:p>
             <w:pPr>
@@ -2618,7 +2685,7 @@
         </w:tc>
         <w:tc>
           <w:tcPr>
-            <w:tcW w:type="dxa" w:w="3360"/>
+            <w:tcW w:type="dxa" w:w="4032"/>
           </w:tcPr>
           <w:p>
             <w:pPr>
@@ -2639,7 +2706,7 @@
         </w:tc>
         <w:tc>
           <w:tcPr>
-            <w:tcW w:type="dxa" w:w="3360"/>
+            <w:tcW w:type="dxa" w:w="3168"/>
           </w:tcPr>
           <w:p>
             <w:pPr>
@@ -2662,7 +2729,7 @@
       <w:tr>
         <w:tc>
           <w:tcPr>
-            <w:tcW w:type="dxa" w:w="3360"/>
+            <w:tcW w:type="dxa" w:w="2880"/>
           </w:tcPr>
           <w:p>
             <w:pPr>
@@ -2683,7 +2750,7 @@
         </w:tc>
         <w:tc>
           <w:tcPr>
-            <w:tcW w:type="dxa" w:w="3360"/>
+            <w:tcW w:type="dxa" w:w="4032"/>
           </w:tcPr>
           <w:p>
             <w:pPr>
@@ -2704,7 +2771,7 @@
         </w:tc>
         <w:tc>
           <w:tcPr>
-            <w:tcW w:type="dxa" w:w="3360"/>
+            <w:tcW w:type="dxa" w:w="3168"/>
           </w:tcPr>
           <w:p>
             <w:pPr>
@@ -2727,7 +2794,7 @@
       <w:tr>
         <w:tc>
           <w:tcPr>
-            <w:tcW w:type="dxa" w:w="3360"/>
+            <w:tcW w:type="dxa" w:w="2880"/>
             <w:tcBorders>
               <w:bottom w:val="single" w:sz="12" w:space="0" w:color="000000"/>
             </w:tcBorders>
@@ -2751,7 +2818,7 @@
         </w:tc>
         <w:tc>
           <w:tcPr>
-            <w:tcW w:type="dxa" w:w="3360"/>
+            <w:tcW w:type="dxa" w:w="4032"/>
             <w:tcBorders>
               <w:bottom w:val="single" w:sz="12" w:space="0" w:color="000000"/>
             </w:tcBorders>
@@ -2775,7 +2842,7 @@
         </w:tc>
         <w:tc>
           <w:tcPr>
-            <w:tcW w:type="dxa" w:w="3360"/>
+            <w:tcW w:type="dxa" w:w="3168"/>
             <w:tcBorders>
               <w:bottom w:val="single" w:sz="12" w:space="0" w:color="000000"/>
             </w:tcBorders>
@@ -2799,6 +2866,16 @@
         </w:tc>
       </w:tr>
     </w:tbl>
+    <w:p>
+      <w:pPr>
+        <w:sectPr>
+          <w:type w:val="continuous"/>
+          <w:pgSz w:w="12240" w:h="15840" w:code="9"/>
+          <w:pgMar w:top="1500" w:right="1080" w:bottom="1600" w:left="1080" w:header="1080" w:footer="1080" w:gutter="0"/>
+          <w:cols w:num="2" w:space="480"/>
+        </w:sectPr>
+      </w:pPr>
+    </w:p>
     <w:p>
       <w:pPr>
         <w:pStyle w:val="Para"/>
@@ -2854,12 +2931,19 @@
     </w:p>
     <w:p>
       <w:pPr>
-        <w:pStyle w:val="Para"/>
-      </w:pPr>
-      <w:r>
-        <w:rPr>
-          <w:b/>
-        </w:rPr>
+        <w:sectPr>
+          <w:type w:val="continuous"/>
+          <w:pgSz w:w="12240" w:h="15840" w:code="9"/>
+          <w:pgMar w:top="1500" w:right="1080" w:bottom="1600" w:left="1080" w:header="1080" w:footer="1080" w:gutter="0"/>
+          <w:cols w:num="1"/>
+        </w:sectPr>
+      </w:pPr>
+    </w:p>
+    <w:p>
+      <w:pPr>
+        <w:pStyle w:val="TableCaption"/>
+      </w:pPr>
+      <w:r>
         <w:t>Table 3b: Dev nDCG@20 by goal category.</w:t>
       </w:r>
     </w:p>
@@ -2877,9 +2961,9 @@
         <w:tblLayout w:type="fixed"/>
       </w:tblPr>
       <w:tblGrid>
-        <w:gridCol w:w="3360"/>
-        <w:gridCol w:w="3360"/>
-        <w:gridCol w:w="3360"/>
+        <w:gridCol w:w="864"/>
+        <w:gridCol w:w="7056"/>
+        <w:gridCol w:w="2160"/>
       </w:tblGrid>
       <w:tr>
         <w:trPr>
@@ -2887,7 +2971,7 @@
         </w:trPr>
         <w:tc>
           <w:tcPr>
-            <w:tcW w:type="dxa" w:w="3360"/>
+            <w:tcW w:type="dxa" w:w="864"/>
             <w:shd w:val="clear" w:color="auto" w:fill="E7E7E7"/>
             <w:tcBorders>
               <w:top w:val="single" w:sz="12" w:space="0" w:color="000000"/>
@@ -2896,7 +2980,7 @@
           </w:tcPr>
           <w:p>
             <w:pPr>
-              <w:jc w:val="left"/>
+              <w:jc w:val="center"/>
             </w:pPr>
             <w:r/>
             <w:r>
@@ -2910,7 +2994,7 @@
         </w:tc>
         <w:tc>
           <w:tcPr>
-            <w:tcW w:type="dxa" w:w="3360"/>
+            <w:tcW w:type="dxa" w:w="7056"/>
             <w:shd w:val="clear" w:color="auto" w:fill="E7E7E7"/>
             <w:tcBorders>
               <w:top w:val="single" w:sz="12" w:space="0" w:color="000000"/>
@@ -2933,7 +3017,7 @@
         </w:tc>
         <w:tc>
           <w:tcPr>
-            <w:tcW w:type="dxa" w:w="3360"/>
+            <w:tcW w:type="dxa" w:w="2160"/>
             <w:shd w:val="clear" w:color="auto" w:fill="E7E7E7"/>
             <w:tcBorders>
               <w:top w:val="single" w:sz="12" w:space="0" w:color="000000"/>
@@ -2942,7 +3026,7 @@
           </w:tcPr>
           <w:p>
             <w:pPr>
-              <w:jc w:val="left"/>
+              <w:jc w:val="right"/>
             </w:pPr>
             <w:r/>
             <w:r>
@@ -2958,7 +3042,28 @@
       <w:tr>
         <w:tc>
           <w:tcPr>
-            <w:tcW w:type="dxa" w:w="3360"/>
+            <w:tcW w:type="dxa" w:w="864"/>
+          </w:tcPr>
+          <w:p>
+            <w:pPr>
+              <w:jc w:val="center"/>
+            </w:pPr>
+            <w:r>
+              <w:rPr>
+                <w:sz w:val="18"/>
+              </w:rPr>
+            </w:r>
+            <w:r>
+              <w:rPr>
+                <w:sz w:val="18"/>
+              </w:rPr>
+              <w:t>I</w:t>
+            </w:r>
+          </w:p>
+        </w:tc>
+        <w:tc>
+          <w:tcPr>
+            <w:tcW w:type="dxa" w:w="7056"/>
           </w:tcPr>
           <w:p>
             <w:pPr>
@@ -2973,38 +3078,17 @@
               <w:rPr>
                 <w:sz w:val="18"/>
               </w:rPr>
-              <w:t>I</w:t>
-            </w:r>
-          </w:p>
-        </w:tc>
-        <w:tc>
-          <w:tcPr>
-            <w:tcW w:type="dxa" w:w="3360"/>
-          </w:tcPr>
-          <w:p>
-            <w:pPr>
-              <w:jc w:val="left"/>
-            </w:pPr>
-            <w:r>
-              <w:rPr>
-                <w:sz w:val="18"/>
-              </w:rPr>
-            </w:r>
-            <w:r>
-              <w:rPr>
-                <w:sz w:val="18"/>
-              </w:rPr>
               <w:t>specific globally popular song</w:t>
             </w:r>
           </w:p>
         </w:tc>
         <w:tc>
           <w:tcPr>
-            <w:tcW w:type="dxa" w:w="3360"/>
-          </w:tcPr>
-          <w:p>
-            <w:pPr>
-              <w:jc w:val="left"/>
+            <w:tcW w:type="dxa" w:w="2160"/>
+          </w:tcPr>
+          <w:p>
+            <w:pPr>
+              <w:jc w:val="right"/>
             </w:pPr>
             <w:r>
               <w:rPr>
@@ -3023,7 +3107,28 @@
       <w:tr>
         <w:tc>
           <w:tcPr>
-            <w:tcW w:type="dxa" w:w="3360"/>
+            <w:tcW w:type="dxa" w:w="864"/>
+          </w:tcPr>
+          <w:p>
+            <w:pPr>
+              <w:jc w:val="center"/>
+            </w:pPr>
+            <w:r>
+              <w:rPr>
+                <w:sz w:val="18"/>
+              </w:rPr>
+            </w:r>
+            <w:r>
+              <w:rPr>
+                <w:sz w:val="18"/>
+              </w:rPr>
+              <w:t>C</w:t>
+            </w:r>
+          </w:p>
+        </w:tc>
+        <w:tc>
+          <w:tcPr>
+            <w:tcW w:type="dxa" w:w="7056"/>
           </w:tcPr>
           <w:p>
             <w:pPr>
@@ -3038,38 +3143,17 @@
               <w:rPr>
                 <w:sz w:val="18"/>
               </w:rPr>
-              <w:t>C</w:t>
-            </w:r>
-          </w:p>
-        </w:tc>
-        <w:tc>
-          <w:tcPr>
-            <w:tcW w:type="dxa" w:w="3360"/>
-          </w:tcPr>
-          <w:p>
-            <w:pPr>
-              <w:jc w:val="left"/>
-            </w:pPr>
-            <w:r>
-              <w:rPr>
-                <w:sz w:val="18"/>
-              </w:rPr>
-            </w:r>
-            <w:r>
-              <w:rPr>
-                <w:sz w:val="18"/>
-              </w:rPr>
               <w:t>specific album by description</w:t>
             </w:r>
           </w:p>
         </w:tc>
         <w:tc>
           <w:tcPr>
-            <w:tcW w:type="dxa" w:w="3360"/>
-          </w:tcPr>
-          <w:p>
-            <w:pPr>
-              <w:jc w:val="left"/>
+            <w:tcW w:type="dxa" w:w="2160"/>
+          </w:tcPr>
+          <w:p>
+            <w:pPr>
+              <w:jc w:val="right"/>
             </w:pPr>
             <w:r>
               <w:rPr>
@@ -3088,7 +3172,28 @@
       <w:tr>
         <w:tc>
           <w:tcPr>
-            <w:tcW w:type="dxa" w:w="3360"/>
+            <w:tcW w:type="dxa" w:w="864"/>
+          </w:tcPr>
+          <w:p>
+            <w:pPr>
+              <w:jc w:val="center"/>
+            </w:pPr>
+            <w:r>
+              <w:rPr>
+                <w:sz w:val="18"/>
+              </w:rPr>
+            </w:r>
+            <w:r>
+              <w:rPr>
+                <w:sz w:val="18"/>
+              </w:rPr>
+              <w:t>K</w:t>
+            </w:r>
+          </w:p>
+        </w:tc>
+        <w:tc>
+          <w:tcPr>
+            <w:tcW w:type="dxa" w:w="7056"/>
           </w:tcPr>
           <w:p>
             <w:pPr>
@@ -3103,38 +3208,17 @@
               <w:rPr>
                 <w:sz w:val="18"/>
               </w:rPr>
-              <w:t>K</w:t>
-            </w:r>
-          </w:p>
-        </w:tc>
-        <w:tc>
-          <w:tcPr>
-            <w:tcW w:type="dxa" w:w="3360"/>
-          </w:tcPr>
-          <w:p>
-            <w:pPr>
-              <w:jc w:val="left"/>
-            </w:pPr>
-            <w:r>
-              <w:rPr>
-                <w:sz w:val="18"/>
-              </w:rPr>
-            </w:r>
-            <w:r>
-              <w:rPr>
-                <w:sz w:val="18"/>
-              </w:rPr>
               <w:t>discover, multi-instrumental, broad era</w:t>
             </w:r>
           </w:p>
         </w:tc>
         <w:tc>
           <w:tcPr>
-            <w:tcW w:type="dxa" w:w="3360"/>
-          </w:tcPr>
-          <w:p>
-            <w:pPr>
-              <w:jc w:val="left"/>
+            <w:tcW w:type="dxa" w:w="2160"/>
+          </w:tcPr>
+          <w:p>
+            <w:pPr>
+              <w:jc w:val="right"/>
             </w:pPr>
             <w:r>
               <w:rPr>
@@ -3153,7 +3237,28 @@
       <w:tr>
         <w:tc>
           <w:tcPr>
-            <w:tcW w:type="dxa" w:w="3360"/>
+            <w:tcW w:type="dxa" w:w="864"/>
+          </w:tcPr>
+          <w:p>
+            <w:pPr>
+              <w:jc w:val="center"/>
+            </w:pPr>
+            <w:r>
+              <w:rPr>
+                <w:sz w:val="18"/>
+              </w:rPr>
+            </w:r>
+            <w:r>
+              <w:rPr>
+                <w:sz w:val="18"/>
+              </w:rPr>
+              <w:t>J</w:t>
+            </w:r>
+          </w:p>
+        </w:tc>
+        <w:tc>
+          <w:tcPr>
+            <w:tcW w:type="dxa" w:w="7056"/>
           </w:tcPr>
           <w:p>
             <w:pPr>
@@ -3168,38 +3273,17 @@
               <w:rPr>
                 <w:sz w:val="18"/>
               </w:rPr>
-              <w:t>J</w:t>
-            </w:r>
-          </w:p>
-        </w:tc>
-        <w:tc>
-          <w:tcPr>
-            <w:tcW w:type="dxa" w:w="3360"/>
-          </w:tcPr>
-          <w:p>
-            <w:pPr>
-              <w:jc w:val="left"/>
-            </w:pPr>
-            <w:r>
-              <w:rPr>
-                <w:sz w:val="18"/>
-              </w:rPr>
-            </w:r>
-            <w:r>
-              <w:rPr>
-                <w:sz w:val="18"/>
-              </w:rPr>
               <w:t>specific hit</w:t>
             </w:r>
           </w:p>
         </w:tc>
         <w:tc>
           <w:tcPr>
-            <w:tcW w:type="dxa" w:w="3360"/>
-          </w:tcPr>
-          <w:p>
-            <w:pPr>
-              <w:jc w:val="left"/>
+            <w:tcW w:type="dxa" w:w="2160"/>
+          </w:tcPr>
+          <w:p>
+            <w:pPr>
+              <w:jc w:val="right"/>
             </w:pPr>
             <w:r>
               <w:rPr>
@@ -3218,7 +3302,28 @@
       <w:tr>
         <w:tc>
           <w:tcPr>
-            <w:tcW w:type="dxa" w:w="3360"/>
+            <w:tcW w:type="dxa" w:w="864"/>
+          </w:tcPr>
+          <w:p>
+            <w:pPr>
+              <w:jc w:val="center"/>
+            </w:pPr>
+            <w:r>
+              <w:rPr>
+                <w:sz w:val="18"/>
+              </w:rPr>
+            </w:r>
+            <w:r>
+              <w:rPr>
+                <w:sz w:val="18"/>
+              </w:rPr>
+              <w:t>G</w:t>
+            </w:r>
+          </w:p>
+        </w:tc>
+        <w:tc>
+          <w:tcPr>
+            <w:tcW w:type="dxa" w:w="7056"/>
           </w:tcPr>
           <w:p>
             <w:pPr>
@@ -3233,38 +3338,17 @@
               <w:rPr>
                 <w:sz w:val="18"/>
               </w:rPr>
-              <w:t>G</w:t>
-            </w:r>
-          </w:p>
-        </w:tc>
-        <w:tc>
-          <w:tcPr>
-            <w:tcW w:type="dxa" w:w="3360"/>
-          </w:tcPr>
-          <w:p>
-            <w:pPr>
-              <w:jc w:val="left"/>
-            </w:pPr>
-            <w:r>
-              <w:rPr>
-                <w:sz w:val="18"/>
-              </w:rPr>
-            </w:r>
-            <w:r>
-              <w:rPr>
-                <w:sz w:val="18"/>
-              </w:rPr>
               <w:t>multi mood</w:t>
             </w:r>
           </w:p>
         </w:tc>
         <w:tc>
           <w:tcPr>
-            <w:tcW w:type="dxa" w:w="3360"/>
-          </w:tcPr>
-          <w:p>
-            <w:pPr>
-              <w:jc w:val="left"/>
+            <w:tcW w:type="dxa" w:w="2160"/>
+          </w:tcPr>
+          <w:p>
+            <w:pPr>
+              <w:jc w:val="right"/>
             </w:pPr>
             <w:r>
               <w:rPr>
@@ -3283,7 +3367,28 @@
       <w:tr>
         <w:tc>
           <w:tcPr>
-            <w:tcW w:type="dxa" w:w="3360"/>
+            <w:tcW w:type="dxa" w:w="864"/>
+          </w:tcPr>
+          <w:p>
+            <w:pPr>
+              <w:jc w:val="center"/>
+            </w:pPr>
+            <w:r>
+              <w:rPr>
+                <w:sz w:val="18"/>
+              </w:rPr>
+            </w:r>
+            <w:r>
+              <w:rPr>
+                <w:sz w:val="18"/>
+              </w:rPr>
+              <w:t>A</w:t>
+            </w:r>
+          </w:p>
+        </w:tc>
+        <w:tc>
+          <w:tcPr>
+            <w:tcW w:type="dxa" w:w="7056"/>
           </w:tcPr>
           <w:p>
             <w:pPr>
@@ -3298,38 +3403,17 @@
               <w:rPr>
                 <w:sz w:val="18"/>
               </w:rPr>
-              <w:t>A</w:t>
-            </w:r>
-          </w:p>
-        </w:tc>
-        <w:tc>
-          <w:tcPr>
-            <w:tcW w:type="dxa" w:w="3360"/>
-          </w:tcPr>
-          <w:p>
-            <w:pPr>
-              <w:jc w:val="left"/>
-            </w:pPr>
-            <w:r>
-              <w:rPr>
-                <w:sz w:val="18"/>
-              </w:rPr>
-            </w:r>
-            <w:r>
-              <w:rPr>
-                <w:sz w:val="18"/>
-              </w:rPr>
               <w:t>specific instrumental (game/movie)</w:t>
             </w:r>
           </w:p>
         </w:tc>
         <w:tc>
           <w:tcPr>
-            <w:tcW w:type="dxa" w:w="3360"/>
-          </w:tcPr>
-          <w:p>
-            <w:pPr>
-              <w:jc w:val="left"/>
+            <w:tcW w:type="dxa" w:w="2160"/>
+          </w:tcPr>
+          <w:p>
+            <w:pPr>
+              <w:jc w:val="right"/>
             </w:pPr>
             <w:r>
               <w:rPr>
@@ -3348,7 +3432,28 @@
       <w:tr>
         <w:tc>
           <w:tcPr>
-            <w:tcW w:type="dxa" w:w="3360"/>
+            <w:tcW w:type="dxa" w:w="864"/>
+          </w:tcPr>
+          <w:p>
+            <w:pPr>
+              <w:jc w:val="center"/>
+            </w:pPr>
+            <w:r>
+              <w:rPr>
+                <w:sz w:val="18"/>
+              </w:rPr>
+            </w:r>
+            <w:r>
+              <w:rPr>
+                <w:sz w:val="18"/>
+              </w:rPr>
+              <w:t>D</w:t>
+            </w:r>
+          </w:p>
+        </w:tc>
+        <w:tc>
+          <w:tcPr>
+            <w:tcW w:type="dxa" w:w="7056"/>
           </w:tcPr>
           <w:p>
             <w:pPr>
@@ -3363,38 +3468,17 @@
               <w:rPr>
                 <w:sz w:val="18"/>
               </w:rPr>
-              <w:t>D</w:t>
-            </w:r>
-          </w:p>
-        </w:tc>
-        <w:tc>
-          <w:tcPr>
-            <w:tcW w:type="dxa" w:w="3360"/>
-          </w:tcPr>
-          <w:p>
-            <w:pPr>
-              <w:jc w:val="left"/>
-            </w:pPr>
-            <w:r>
-              <w:rPr>
-                <w:sz w:val="18"/>
-              </w:rPr>
-            </w:r>
-            <w:r>
-              <w:rPr>
-                <w:sz w:val="18"/>
-              </w:rPr>
               <w:t>specific soundtrack</w:t>
             </w:r>
           </w:p>
         </w:tc>
         <w:tc>
           <w:tcPr>
-            <w:tcW w:type="dxa" w:w="3360"/>
-          </w:tcPr>
-          <w:p>
-            <w:pPr>
-              <w:jc w:val="left"/>
+            <w:tcW w:type="dxa" w:w="2160"/>
+          </w:tcPr>
+          <w:p>
+            <w:pPr>
+              <w:jc w:val="right"/>
             </w:pPr>
             <w:r>
               <w:rPr>
@@ -3413,7 +3497,28 @@
       <w:tr>
         <w:tc>
           <w:tcPr>
-            <w:tcW w:type="dxa" w:w="3360"/>
+            <w:tcW w:type="dxa" w:w="864"/>
+          </w:tcPr>
+          <w:p>
+            <w:pPr>
+              <w:jc w:val="center"/>
+            </w:pPr>
+            <w:r>
+              <w:rPr>
+                <w:sz w:val="18"/>
+              </w:rPr>
+            </w:r>
+            <w:r>
+              <w:rPr>
+                <w:sz w:val="18"/>
+              </w:rPr>
+              <w:t>B</w:t>
+            </w:r>
+          </w:p>
+        </w:tc>
+        <w:tc>
+          <w:tcPr>
+            <w:tcW w:type="dxa" w:w="7056"/>
           </w:tcPr>
           <w:p>
             <w:pPr>
@@ -3428,38 +3533,17 @@
               <w:rPr>
                 <w:sz w:val="18"/>
               </w:rPr>
-              <w:t>B</w:t>
-            </w:r>
-          </w:p>
-        </w:tc>
-        <w:tc>
-          <w:tcPr>
-            <w:tcW w:type="dxa" w:w="3360"/>
-          </w:tcPr>
-          <w:p>
-            <w:pPr>
-              <w:jc w:val="left"/>
-            </w:pPr>
-            <w:r>
-              <w:rPr>
-                <w:sz w:val="18"/>
-              </w:rPr>
-            </w:r>
-            <w:r>
-              <w:rPr>
-                <w:sz w:val="18"/>
-              </w:rPr>
               <w:t>specific by lyric phrase</w:t>
             </w:r>
           </w:p>
         </w:tc>
         <w:tc>
           <w:tcPr>
-            <w:tcW w:type="dxa" w:w="3360"/>
-          </w:tcPr>
-          <w:p>
-            <w:pPr>
-              <w:jc w:val="left"/>
+            <w:tcW w:type="dxa" w:w="2160"/>
+          </w:tcPr>
+          <w:p>
+            <w:pPr>
+              <w:jc w:val="right"/>
             </w:pPr>
             <w:r>
               <w:rPr>
@@ -3478,7 +3562,28 @@
       <w:tr>
         <w:tc>
           <w:tcPr>
-            <w:tcW w:type="dxa" w:w="3360"/>
+            <w:tcW w:type="dxa" w:w="864"/>
+          </w:tcPr>
+          <w:p>
+            <w:pPr>
+              <w:jc w:val="center"/>
+            </w:pPr>
+            <w:r>
+              <w:rPr>
+                <w:sz w:val="18"/>
+              </w:rPr>
+            </w:r>
+            <w:r>
+              <w:rPr>
+                <w:sz w:val="18"/>
+              </w:rPr>
+              <w:t>H</w:t>
+            </w:r>
+          </w:p>
+        </w:tc>
+        <w:tc>
+          <w:tcPr>
+            <w:tcW w:type="dxa" w:w="7056"/>
           </w:tcPr>
           <w:p>
             <w:pPr>
@@ -3493,38 +3598,17 @@
               <w:rPr>
                 <w:sz w:val="18"/>
               </w:rPr>
-              <w:t>H</w:t>
-            </w:r>
-          </w:p>
-        </w:tc>
-        <w:tc>
-          <w:tcPr>
-            <w:tcW w:type="dxa" w:w="3360"/>
-          </w:tcPr>
-          <w:p>
-            <w:pPr>
-              <w:jc w:val="left"/>
-            </w:pPr>
-            <w:r>
-              <w:rPr>
-                <w:sz w:val="18"/>
-              </w:rPr>
-            </w:r>
-            <w:r>
-              <w:rPr>
-                <w:sz w:val="18"/>
-              </w:rPr>
               <w:t>multi artists</w:t>
             </w:r>
           </w:p>
         </w:tc>
         <w:tc>
           <w:tcPr>
-            <w:tcW w:type="dxa" w:w="3360"/>
-          </w:tcPr>
-          <w:p>
-            <w:pPr>
-              <w:jc w:val="left"/>
+            <w:tcW w:type="dxa" w:w="2160"/>
+          </w:tcPr>
+          <w:p>
+            <w:pPr>
+              <w:jc w:val="right"/>
             </w:pPr>
             <w:r>
               <w:rPr>
@@ -3543,7 +3627,28 @@
       <w:tr>
         <w:tc>
           <w:tcPr>
-            <w:tcW w:type="dxa" w:w="3360"/>
+            <w:tcW w:type="dxa" w:w="864"/>
+          </w:tcPr>
+          <w:p>
+            <w:pPr>
+              <w:jc w:val="center"/>
+            </w:pPr>
+            <w:r>
+              <w:rPr>
+                <w:sz w:val="18"/>
+              </w:rPr>
+            </w:r>
+            <w:r>
+              <w:rPr>
+                <w:sz w:val="18"/>
+              </w:rPr>
+              <w:t>E</w:t>
+            </w:r>
+          </w:p>
+        </w:tc>
+        <w:tc>
+          <w:tcPr>
+            <w:tcW w:type="dxa" w:w="7056"/>
           </w:tcPr>
           <w:p>
             <w:pPr>
@@ -3558,38 +3663,17 @@
               <w:rPr>
                 <w:sz w:val="18"/>
               </w:rPr>
-              <w:t>E</w:t>
-            </w:r>
-          </w:p>
-        </w:tc>
-        <w:tc>
-          <w:tcPr>
-            <w:tcW w:type="dxa" w:w="3360"/>
-          </w:tcPr>
-          <w:p>
-            <w:pPr>
-              <w:jc w:val="left"/>
-            </w:pPr>
-            <w:r>
-              <w:rPr>
-                <w:sz w:val="18"/>
-              </w:rPr>
-            </w:r>
-            <w:r>
-              <w:rPr>
-                <w:sz w:val="18"/>
-              </w:rPr>
               <w:t>musical journey, multi</w:t>
             </w:r>
           </w:p>
         </w:tc>
         <w:tc>
           <w:tcPr>
-            <w:tcW w:type="dxa" w:w="3360"/>
-          </w:tcPr>
-          <w:p>
-            <w:pPr>
-              <w:jc w:val="left"/>
+            <w:tcW w:type="dxa" w:w="2160"/>
+          </w:tcPr>
+          <w:p>
+            <w:pPr>
+              <w:jc w:val="right"/>
             </w:pPr>
             <w:r>
               <w:rPr>
@@ -3608,14 +3692,14 @@
       <w:tr>
         <w:tc>
           <w:tcPr>
-            <w:tcW w:type="dxa" w:w="3360"/>
+            <w:tcW w:type="dxa" w:w="864"/>
             <w:tcBorders>
               <w:bottom w:val="single" w:sz="12" w:space="0" w:color="000000"/>
             </w:tcBorders>
           </w:tcPr>
           <w:p>
             <w:pPr>
-              <w:jc w:val="left"/>
+              <w:jc w:val="center"/>
             </w:pPr>
             <w:r>
               <w:rPr>
@@ -3632,7 +3716,7 @@
         </w:tc>
         <w:tc>
           <w:tcPr>
-            <w:tcW w:type="dxa" w:w="3360"/>
+            <w:tcW w:type="dxa" w:w="7056"/>
             <w:tcBorders>
               <w:bottom w:val="single" w:sz="12" w:space="0" w:color="000000"/>
             </w:tcBorders>
@@ -3656,14 +3740,14 @@
         </w:tc>
         <w:tc>
           <w:tcPr>
-            <w:tcW w:type="dxa" w:w="3360"/>
+            <w:tcW w:type="dxa" w:w="2160"/>
             <w:tcBorders>
               <w:bottom w:val="single" w:sz="12" w:space="0" w:color="000000"/>
             </w:tcBorders>
           </w:tcPr>
           <w:p>
             <w:pPr>
-              <w:jc w:val="left"/>
+              <w:jc w:val="right"/>
             </w:pPr>
             <w:r>
               <w:rPr>
@@ -3680,6 +3764,16 @@
         </w:tc>
       </w:tr>
     </w:tbl>
+    <w:p>
+      <w:pPr>
+        <w:sectPr>
+          <w:type w:val="continuous"/>
+          <w:pgSz w:w="12240" w:h="15840" w:code="9"/>
+          <w:pgMar w:top="1500" w:right="1080" w:bottom="1600" w:left="1080" w:header="1080" w:footer="1080" w:gutter="0"/>
+          <w:cols w:num="2" w:space="480"/>
+        </w:sectPr>
+      </w:pPr>
+    </w:p>
     <w:p>
       <w:pPr>
         <w:pStyle w:val="Para"/>
@@ -3731,6 +3825,16 @@
         </w:rPr>
         <w:t>Table 4: Measured latency and footprint. Top: per component, all neural blocks forced to CPU (worst case), median over 20 runs. Bottom: end-to-end recall + rescore over the 200-session set, encoders on the Metal backend.</w:t>
       </w:r>
+    </w:p>
+    <w:p>
+      <w:pPr>
+        <w:sectPr>
+          <w:type w:val="continuous"/>
+          <w:pgSz w:w="12240" w:h="15840" w:code="9"/>
+          <w:pgMar w:top="1500" w:right="1080" w:bottom="1600" w:left="1080" w:header="1080" w:footer="1080" w:gutter="0"/>
+          <w:cols w:num="1"/>
+        </w:sectPr>
+      </w:pPr>
     </w:p>
     <w:tbl>
       <w:tblPr>
@@ -4247,6 +4351,16 @@
         </w:tc>
       </w:tr>
     </w:tbl>
+    <w:p>
+      <w:pPr>
+        <w:sectPr>
+          <w:type w:val="continuous"/>
+          <w:pgSz w:w="12240" w:h="15840" w:code="9"/>
+          <w:pgMar w:top="1500" w:right="1080" w:bottom="1600" w:left="1080" w:header="1080" w:footer="1080" w:gutter="0"/>
+          <w:cols w:num="2" w:space="480"/>
+        </w:sectPr>
+      </w:pPr>
+    </w:p>
     <w:p>
       <w:pPr>
         <w:pStyle w:val="Head1"/>

</xml_diff>

<commit_message>
fix: multi-line table captions were silently dropped in docx build
The caption regex required opening and closing ** on the same source
line. Table 4's caption spans three lines in paper_draft.md, so it
never matched, last_caption stayed None, and add_table() fell back to
an even column-width split (3.5/3.5) instead of the intended 5.0/2.0
spec -- the visible source of the remaining table formatting issue.
Accumulate lines until the closing ** is found before matching.
</commit_message>
<xml_diff>
--- a/paper_wikis/paper.docx
+++ b/paper_wikis/paper.docx
@@ -3817,17 +3817,6 @@
     </w:p>
     <w:p>
       <w:pPr>
-        <w:pStyle w:val="Para"/>
-      </w:pPr>
-      <w:r>
-        <w:rPr>
-          <w:b/>
-        </w:rPr>
-        <w:t>Table 4: Measured latency and footprint. Top: per component, all neural blocks forced to CPU (worst case), median over 20 runs. Bottom: end-to-end recall + rescore over the 200-session set, encoders on the Metal backend.</w:t>
-      </w:r>
-    </w:p>
-    <w:p>
-      <w:pPr>
         <w:sectPr>
           <w:type w:val="continuous"/>
           <w:pgSz w:w="12240" w:h="15840" w:code="9"/>
@@ -3835,6 +3824,14 @@
           <w:cols w:num="1"/>
         </w:sectPr>
       </w:pPr>
+    </w:p>
+    <w:p>
+      <w:pPr>
+        <w:pStyle w:val="TableCaption"/>
+      </w:pPr>
+      <w:r>
+        <w:t>Table 4: Measured latency and footprint. Top: per component, all neural blocks forced to CPU (worst case), median over 20 runs. Bottom: end-to-end recall + rescore over the 200-session set, encoders on the Metal backend.</w:t>
+      </w:r>
     </w:p>
     <w:tbl>
       <w:tblPr>
@@ -3850,8 +3847,8 @@
         <w:tblLayout w:type="fixed"/>
       </w:tblPr>
       <w:tblGrid>
-        <w:gridCol w:w="5040"/>
-        <w:gridCol w:w="5040"/>
+        <w:gridCol w:w="7200"/>
+        <w:gridCol w:w="2880"/>
       </w:tblGrid>
       <w:tr>
         <w:trPr>
@@ -3859,7 +3856,7 @@
         </w:trPr>
         <w:tc>
           <w:tcPr>
-            <w:tcW w:type="dxa" w:w="5040"/>
+            <w:tcW w:type="dxa" w:w="7200"/>
             <w:shd w:val="clear" w:color="auto" w:fill="E7E7E7"/>
             <w:tcBorders>
               <w:top w:val="single" w:sz="12" w:space="0" w:color="000000"/>
@@ -3882,7 +3879,7 @@
         </w:tc>
         <w:tc>
           <w:tcPr>
-            <w:tcW w:type="dxa" w:w="5040"/>
+            <w:tcW w:type="dxa" w:w="2880"/>
             <w:shd w:val="clear" w:color="auto" w:fill="E7E7E7"/>
             <w:tcBorders>
               <w:top w:val="single" w:sz="12" w:space="0" w:color="000000"/>
@@ -3891,7 +3888,7 @@
           </w:tcPr>
           <w:p>
             <w:pPr>
-              <w:jc w:val="left"/>
+              <w:jc w:val="right"/>
             </w:pPr>
             <w:r/>
             <w:r>
@@ -3907,7 +3904,7 @@
       <w:tr>
         <w:tc>
           <w:tcPr>
-            <w:tcW w:type="dxa" w:w="5040"/>
+            <w:tcW w:type="dxa" w:w="7200"/>
           </w:tcPr>
           <w:p>
             <w:pPr>
@@ -3928,11 +3925,11 @@
         </w:tc>
         <w:tc>
           <w:tcPr>
-            <w:tcW w:type="dxa" w:w="5040"/>
-          </w:tcPr>
-          <w:p>
-            <w:pPr>
-              <w:jc w:val="left"/>
+            <w:tcW w:type="dxa" w:w="2880"/>
+          </w:tcPr>
+          <w:p>
+            <w:pPr>
+              <w:jc w:val="right"/>
             </w:pPr>
             <w:r>
               <w:rPr>
@@ -3951,7 +3948,7 @@
       <w:tr>
         <w:tc>
           <w:tcPr>
-            <w:tcW w:type="dxa" w:w="5040"/>
+            <w:tcW w:type="dxa" w:w="7200"/>
           </w:tcPr>
           <w:p>
             <w:pPr>
@@ -3972,11 +3969,11 @@
         </w:tc>
         <w:tc>
           <w:tcPr>
-            <w:tcW w:type="dxa" w:w="5040"/>
-          </w:tcPr>
-          <w:p>
-            <w:pPr>
-              <w:jc w:val="left"/>
+            <w:tcW w:type="dxa" w:w="2880"/>
+          </w:tcPr>
+          <w:p>
+            <w:pPr>
+              <w:jc w:val="right"/>
             </w:pPr>
             <w:r>
               <w:rPr>
@@ -3995,7 +3992,7 @@
       <w:tr>
         <w:tc>
           <w:tcPr>
-            <w:tcW w:type="dxa" w:w="5040"/>
+            <w:tcW w:type="dxa" w:w="7200"/>
           </w:tcPr>
           <w:p>
             <w:pPr>
@@ -4016,11 +4013,11 @@
         </w:tc>
         <w:tc>
           <w:tcPr>
-            <w:tcW w:type="dxa" w:w="5040"/>
-          </w:tcPr>
-          <w:p>
-            <w:pPr>
-              <w:jc w:val="left"/>
+            <w:tcW w:type="dxa" w:w="2880"/>
+          </w:tcPr>
+          <w:p>
+            <w:pPr>
+              <w:jc w:val="right"/>
             </w:pPr>
             <w:r>
               <w:rPr>
@@ -4039,7 +4036,7 @@
       <w:tr>
         <w:tc>
           <w:tcPr>
-            <w:tcW w:type="dxa" w:w="5040"/>
+            <w:tcW w:type="dxa" w:w="7200"/>
           </w:tcPr>
           <w:p>
             <w:pPr>
@@ -4060,11 +4057,11 @@
         </w:tc>
         <w:tc>
           <w:tcPr>
-            <w:tcW w:type="dxa" w:w="5040"/>
-          </w:tcPr>
-          <w:p>
-            <w:pPr>
-              <w:jc w:val="left"/>
+            <w:tcW w:type="dxa" w:w="2880"/>
+          </w:tcPr>
+          <w:p>
+            <w:pPr>
+              <w:jc w:val="right"/>
             </w:pPr>
             <w:r>
               <w:rPr>
@@ -4083,7 +4080,7 @@
       <w:tr>
         <w:tc>
           <w:tcPr>
-            <w:tcW w:type="dxa" w:w="5040"/>
+            <w:tcW w:type="dxa" w:w="7200"/>
           </w:tcPr>
           <w:p>
             <w:pPr>
@@ -4104,11 +4101,11 @@
         </w:tc>
         <w:tc>
           <w:tcPr>
-            <w:tcW w:type="dxa" w:w="5040"/>
-          </w:tcPr>
-          <w:p>
-            <w:pPr>
-              <w:jc w:val="left"/>
+            <w:tcW w:type="dxa" w:w="2880"/>
+          </w:tcPr>
+          <w:p>
+            <w:pPr>
+              <w:jc w:val="right"/>
             </w:pPr>
             <w:r>
               <w:rPr>
@@ -4127,7 +4124,7 @@
       <w:tr>
         <w:tc>
           <w:tcPr>
-            <w:tcW w:type="dxa" w:w="5040"/>
+            <w:tcW w:type="dxa" w:w="7200"/>
           </w:tcPr>
           <w:p>
             <w:pPr>
@@ -4148,11 +4145,11 @@
         </w:tc>
         <w:tc>
           <w:tcPr>
-            <w:tcW w:type="dxa" w:w="5040"/>
-          </w:tcPr>
-          <w:p>
-            <w:pPr>
-              <w:jc w:val="left"/>
+            <w:tcW w:type="dxa" w:w="2880"/>
+          </w:tcPr>
+          <w:p>
+            <w:pPr>
+              <w:jc w:val="right"/>
             </w:pPr>
             <w:r>
               <w:rPr>
@@ -4171,7 +4168,7 @@
       <w:tr>
         <w:tc>
           <w:tcPr>
-            <w:tcW w:type="dxa" w:w="5040"/>
+            <w:tcW w:type="dxa" w:w="7200"/>
           </w:tcPr>
           <w:p>
             <w:pPr>
@@ -4192,11 +4189,11 @@
         </w:tc>
         <w:tc>
           <w:tcPr>
-            <w:tcW w:type="dxa" w:w="5040"/>
-          </w:tcPr>
-          <w:p>
-            <w:pPr>
-              <w:jc w:val="left"/>
+            <w:tcW w:type="dxa" w:w="2880"/>
+          </w:tcPr>
+          <w:p>
+            <w:pPr>
+              <w:jc w:val="right"/>
             </w:pPr>
             <w:r>
               <w:rPr>
@@ -4215,7 +4212,7 @@
       <w:tr>
         <w:tc>
           <w:tcPr>
-            <w:tcW w:type="dxa" w:w="5040"/>
+            <w:tcW w:type="dxa" w:w="7200"/>
           </w:tcPr>
           <w:p>
             <w:pPr>
@@ -4236,11 +4233,11 @@
         </w:tc>
         <w:tc>
           <w:tcPr>
-            <w:tcW w:type="dxa" w:w="5040"/>
-          </w:tcPr>
-          <w:p>
-            <w:pPr>
-              <w:jc w:val="left"/>
+            <w:tcW w:type="dxa" w:w="2880"/>
+          </w:tcPr>
+          <w:p>
+            <w:pPr>
+              <w:jc w:val="right"/>
             </w:pPr>
             <w:r>
               <w:rPr>
@@ -4259,7 +4256,7 @@
       <w:tr>
         <w:tc>
           <w:tcPr>
-            <w:tcW w:type="dxa" w:w="5040"/>
+            <w:tcW w:type="dxa" w:w="7200"/>
           </w:tcPr>
           <w:p>
             <w:pPr>
@@ -4280,11 +4277,11 @@
         </w:tc>
         <w:tc>
           <w:tcPr>
-            <w:tcW w:type="dxa" w:w="5040"/>
-          </w:tcPr>
-          <w:p>
-            <w:pPr>
-              <w:jc w:val="left"/>
+            <w:tcW w:type="dxa" w:w="2880"/>
+          </w:tcPr>
+          <w:p>
+            <w:pPr>
+              <w:jc w:val="right"/>
             </w:pPr>
             <w:r>
               <w:rPr>
@@ -4303,7 +4300,7 @@
       <w:tr>
         <w:tc>
           <w:tcPr>
-            <w:tcW w:type="dxa" w:w="5040"/>
+            <w:tcW w:type="dxa" w:w="7200"/>
             <w:tcBorders>
               <w:bottom w:val="single" w:sz="12" w:space="0" w:color="000000"/>
             </w:tcBorders>
@@ -4327,14 +4324,14 @@
         </w:tc>
         <w:tc>
           <w:tcPr>
-            <w:tcW w:type="dxa" w:w="5040"/>
+            <w:tcW w:type="dxa" w:w="2880"/>
             <w:tcBorders>
               <w:bottom w:val="single" w:sz="12" w:space="0" w:color="000000"/>
             </w:tcBorders>
           </w:tcPr>
           <w:p>
             <w:pPr>
-              <w:jc w:val="left"/>
+              <w:jc w:val="right"/>
             </w:pPr>
             <w:r>
               <w:rPr>

</xml_diff>

<commit_message>
fix: inverted section breaks forced whole body into single column
A sectPr inside a paragraph ends the section *containing* that
paragraph (applies backwards, not forwards). The pre-table break
carried cols=1 and the post-table break carried cols=2, so every body
region between tables (including the entire intro) was closed as
single-column and each table was closed as two-column -- the exact
inverse of the intent. The rendered docx had no two-column body at all.

Swap the two counts (pre-table break closes the 2-col body, post-table
break closes the table's full-width 1-col section) and add a
front-matter break so the title/author block stays full width while
everything from ABSTRACT onward flows two-column. Matches the ACM
interim template's section layout (title 1-col, body 2-col).
</commit_message>
<xml_diff>
--- a/paper_wikis/paper.docx
+++ b/paper_wikis/paper.docx
@@ -28,191 +28,201 @@
     </w:p>
     <w:p>
       <w:pPr>
-        <w:pStyle w:val="AbsHead"/>
-      </w:pPr>
-      <w:r>
-        <w:t>ABSTRACT</w:t>
-      </w:r>
-    </w:p>
-    <w:p>
-      <w:pPr>
-        <w:pStyle w:val="Abstract"/>
-      </w:pPr>
-      <w:r>
-        <w:t>We present a conversational music recommender for the TalkPlayData Challenge (ACM RecSys 2026) that treats each dialogue turn's user reactions as a preference- elicitation signal for both retrieval and ranking. The dataset's goal-progress feedback is delayed by one turn and includes rejected tracks logged as if they were positives; we align the signal in time, remove rejected-track contamination from training, and reconstruct it from raw dialogue when it is withheld at test time. This signal drives a role-tagged dialogue anchor -- encoding prior turns, recommendations, and per-turn reactions -- behind a LoRA fine-tune of a 279M-parameter multilingual encoder, the system's only trained neural component. Retrieval around this anchor is a union of nine inexpensive sources arbitrated by a gradient-boosted learning-to-rank model over 67 features, with multi-source agreement the strongest single feature. The full pipeline trains and serves on a single consumer desktop with no discrete GPU, and reaches a composite score of 0.49 on the blind generalization set.</w:t>
-      </w:r>
-    </w:p>
-    <w:p>
-      <w:pPr>
-        <w:pStyle w:val="CCSHead"/>
-      </w:pPr>
-      <w:r>
-        <w:t>CCS CONCEPTS</w:t>
-      </w:r>
-    </w:p>
-    <w:p>
-      <w:pPr>
-        <w:pStyle w:val="CCSDescription"/>
-      </w:pPr>
-      <w:r>
-        <w:t>Information systems -&gt; Recommender systems; Learning to rank; Language models.</w:t>
-      </w:r>
-    </w:p>
-    <w:p>
-      <w:pPr>
-        <w:pStyle w:val="KeyWordHead"/>
-      </w:pPr>
-      <w:r>
-        <w:t>KEYWORDS</w:t>
-      </w:r>
-    </w:p>
-    <w:p>
-      <w:pPr>
-        <w:pStyle w:val="KeyWords"/>
-      </w:pPr>
-      <w:r>
-        <w:t>multi-turn preference elicitation, dialogue-aware recommendation, conversational recommendation, music recommendation, learning to rank, dense retrieval, LoRA fine-tuning, CPU-only inference</w:t>
-      </w:r>
-    </w:p>
-    <w:p>
-      <w:pPr>
-        <w:pStyle w:val="Head1"/>
-      </w:pPr>
-      <w:r>
-        <w:t>1 Introduction</w:t>
-      </w:r>
-    </w:p>
-    <w:p>
-      <w:pPr>
-        <w:pStyle w:val="Para"/>
-      </w:pPr>
-      <w:r>
-        <w:t>The TalkPlayData Challenge frames music recommendation as a multi-turn dialogue. At each turn the system must (a) rank 20 tracks from a catalog of 47,071 so that the single logged next track ranks high, and (b) produce the assistant's reply. Submissions are scored by a composite metric:</w:t>
-      </w:r>
-    </w:p>
-    <w:p>
-      <w:pPr>
-        <w:pStyle w:val="Quote"/>
-      </w:pPr>
-      <w:r>
-        <w:t>Score = 0.50 * nDCG@20 + 0.10 * CatalogDiversity + 0.10 * LexicalDiversity + 0.30 * JudgeNorm,</w:t>
-      </w:r>
-    </w:p>
-    <w:p>
-      <w:pPr>
-        <w:pStyle w:val="Quote"/>
-      </w:pPr>
-      <w:r>
-        <w:t>JudgeNorm = (judge_score - 1) / 4.</w:t>
-      </w:r>
-    </w:p>
-    <w:p>
-      <w:pPr>
-        <w:pStyle w:val="Para"/>
-      </w:pPr>
-      <w:r>
-        <w:t>The judge is a language model that reads only the response text (personalization and explanation quality); it never sees the track list. The blind generalization set ("Blind B") is harder than the labeled data: the conversation goal, the per-turn goal-progress assessments, and the model's internal thoughts are removed, and half of its 80 sessions are cold-start with no user profile.</w:t>
-      </w:r>
-    </w:p>
-    <w:p>
-      <w:pPr>
-        <w:pStyle w:val="Para"/>
-      </w:pPr>
-      <w:r>
-        <w:t xml:space="preserve">Our system has three stages. </w:t>
-      </w:r>
-      <w:r>
-        <w:rPr>
-          <w:i/>
-        </w:rPr>
-        <w:t>Recall</w:t>
-      </w:r>
-      <w:r>
-        <w:t xml:space="preserve"> runs nine retrievers per turn and merges their outputs into one deduplicated pool (mean ~3,300 candidates); no single source exceeds ~59% gold recall at 500 candidates, but the fused pool reaches ~89% on the blind-simulated holdout. </w:t>
-      </w:r>
-      <w:r>
-        <w:rPr>
-          <w:i/>
-        </w:rPr>
-        <w:t>Rescore</w:t>
-      </w:r>
-      <w:r>
-        <w:t xml:space="preserve"> is a LightGBM LambdaMART model that scores every candidate from 67 features and emits the top 20, replacing hand-tuned score fusion. </w:t>
-      </w:r>
-      <w:r>
-        <w:rPr>
-          <w:i/>
-        </w:rPr>
-        <w:t>Respond</w:t>
-      </w:r>
-      <w:r>
-        <w:t xml:space="preserve"> is decoupled: because the judge reads only text, the response may describe the ranked list but never reorders it. All three stages run on one Apple M4 machine (16 GB unified memory, no GPU), and the only trained neural component is the LoRA encoder of Section 3.</w:t>
-      </w:r>
-    </w:p>
-    <w:p>
-      <w:pPr>
-        <w:pStyle w:val="Para"/>
-      </w:pPr>
-      <w:r>
-        <w:rPr>
-          <w:b/>
-        </w:rPr>
-        <w:t>Contributions.</w:t>
-      </w:r>
-      <w:r>
-        <w:t xml:space="preserve"> (1) A treatment of the goal-progress feedback signal that is off-by-one in time and contaminated with rejected tracks: we align it, decontaminate it, and reconstruct it from raw dialogue when it is withheld at test time. (2) A structured, role-tagged dialogue anchor that encodes prior turns, recommendations, and per-turn reactions as explicit fields, paired with a priority-ordered hard-negative recipe that recycles confirmed session rejections as training negatives. (3) A dialogue-aware retriever: a LoRA fine-tune of </w:t>
-      </w:r>
-      <w:r>
-        <w:rPr>
-          <w:rFonts w:ascii="Courier New" w:hAnsi="Courier New"/>
-        </w:rPr>
-        <w:t>multilingual-e5-base</w:t>
-      </w:r>
-      <w:r>
-        <w:t xml:space="preserve"> over that anchor, combining (1) and (2) into a single trained artifact. (4) A recall design that treats retrieval as </w:t>
-      </w:r>
-      <w:r>
-        <w:rPr>
-          <w:i/>
-        </w:rPr>
-        <w:t>set union, not weighted fusion</w:t>
-      </w:r>
-      <w:r>
-        <w:t>: each source contributes candidates and per-source features, and a learned ranker decides how far to trust each; multi-source agreement is the single strongest feature.</w:t>
-      </w:r>
-    </w:p>
-    <w:p>
-      <w:pPr>
-        <w:pStyle w:val="Head1"/>
-      </w:pPr>
-      <w:r>
-        <w:t>2 Recall Architecture</w:t>
-      </w:r>
-    </w:p>
-    <w:p>
-      <w:pPr>
-        <w:pStyle w:val="Para"/>
-      </w:pPr>
-      <w:r>
-        <w:t xml:space="preserve">Recall is a union of nine retrievers (Table 1). Each candidate carries the per-source scores and origin flags that later become ranker features. The design rule is to </w:t>
-      </w:r>
-      <w:r>
-        <w:rPr>
-          <w:i/>
-        </w:rPr>
-        <w:t>add candidates, never re-weight sources by hand</w:t>
-      </w:r>
-      <w:r>
-        <w:t>: even low-precision sources help, because source membership feeds the agreement feature of Section 4.</w:t>
-      </w:r>
-    </w:p>
-    <w:p>
-      <w:pPr>
         <w:sectPr>
           <w:type w:val="continuous"/>
           <w:pgSz w:w="12240" w:h="15840" w:code="9"/>
           <w:pgMar w:top="1500" w:right="1080" w:bottom="1600" w:left="1080" w:header="1080" w:footer="1080" w:gutter="0"/>
           <w:cols w:num="1"/>
+        </w:sectPr>
+      </w:pPr>
+    </w:p>
+    <w:p>
+      <w:pPr>
+        <w:pStyle w:val="AbsHead"/>
+      </w:pPr>
+      <w:r>
+        <w:t>ABSTRACT</w:t>
+      </w:r>
+    </w:p>
+    <w:p>
+      <w:pPr>
+        <w:pStyle w:val="Abstract"/>
+      </w:pPr>
+      <w:r>
+        <w:t>We present a conversational music recommender for the TalkPlayData Challenge (ACM RecSys 2026) that treats each dialogue turn's user reactions as a preference- elicitation signal for both retrieval and ranking. The dataset's goal-progress feedback is delayed by one turn and includes rejected tracks logged as if they were positives; we align the signal in time, remove rejected-track contamination from training, and reconstruct it from raw dialogue when it is withheld at test time. This signal drives a role-tagged dialogue anchor -- encoding prior turns, recommendations, and per-turn reactions -- behind a LoRA fine-tune of a 279M-parameter multilingual encoder, the system's only trained neural component. Retrieval around this anchor is a union of nine inexpensive sources arbitrated by a gradient-boosted learning-to-rank model over 67 features, with multi-source agreement the strongest single feature. The full pipeline trains and serves on a single consumer desktop with no discrete GPU, and reaches a composite score of 0.49 on the blind generalization set.</w:t>
+      </w:r>
+    </w:p>
+    <w:p>
+      <w:pPr>
+        <w:pStyle w:val="CCSHead"/>
+      </w:pPr>
+      <w:r>
+        <w:t>CCS CONCEPTS</w:t>
+      </w:r>
+    </w:p>
+    <w:p>
+      <w:pPr>
+        <w:pStyle w:val="CCSDescription"/>
+      </w:pPr>
+      <w:r>
+        <w:t>Information systems -&gt; Recommender systems; Learning to rank; Language models.</w:t>
+      </w:r>
+    </w:p>
+    <w:p>
+      <w:pPr>
+        <w:pStyle w:val="KeyWordHead"/>
+      </w:pPr>
+      <w:r>
+        <w:t>KEYWORDS</w:t>
+      </w:r>
+    </w:p>
+    <w:p>
+      <w:pPr>
+        <w:pStyle w:val="KeyWords"/>
+      </w:pPr>
+      <w:r>
+        <w:t>multi-turn preference elicitation, dialogue-aware recommendation, conversational recommendation, music recommendation, learning to rank, dense retrieval, LoRA fine-tuning, CPU-only inference</w:t>
+      </w:r>
+    </w:p>
+    <w:p>
+      <w:pPr>
+        <w:pStyle w:val="Head1"/>
+      </w:pPr>
+      <w:r>
+        <w:t>1 Introduction</w:t>
+      </w:r>
+    </w:p>
+    <w:p>
+      <w:pPr>
+        <w:pStyle w:val="Para"/>
+      </w:pPr>
+      <w:r>
+        <w:t>The TalkPlayData Challenge frames music recommendation as a multi-turn dialogue. At each turn the system must (a) rank 20 tracks from a catalog of 47,071 so that the single logged next track ranks high, and (b) produce the assistant's reply. Submissions are scored by a composite metric:</w:t>
+      </w:r>
+    </w:p>
+    <w:p>
+      <w:pPr>
+        <w:pStyle w:val="Quote"/>
+      </w:pPr>
+      <w:r>
+        <w:t>Score = 0.50 * nDCG@20 + 0.10 * CatalogDiversity + 0.10 * LexicalDiversity + 0.30 * JudgeNorm,</w:t>
+      </w:r>
+    </w:p>
+    <w:p>
+      <w:pPr>
+        <w:pStyle w:val="Quote"/>
+      </w:pPr>
+      <w:r>
+        <w:t>JudgeNorm = (judge_score - 1) / 4.</w:t>
+      </w:r>
+    </w:p>
+    <w:p>
+      <w:pPr>
+        <w:pStyle w:val="Para"/>
+      </w:pPr>
+      <w:r>
+        <w:t>The judge is a language model that reads only the response text (personalization and explanation quality); it never sees the track list. The blind generalization set ("Blind B") is harder than the labeled data: the conversation goal, the per-turn goal-progress assessments, and the model's internal thoughts are removed, and half of its 80 sessions are cold-start with no user profile.</w:t>
+      </w:r>
+    </w:p>
+    <w:p>
+      <w:pPr>
+        <w:pStyle w:val="Para"/>
+      </w:pPr>
+      <w:r>
+        <w:t xml:space="preserve">Our system has three stages. </w:t>
+      </w:r>
+      <w:r>
+        <w:rPr>
+          <w:i/>
+        </w:rPr>
+        <w:t>Recall</w:t>
+      </w:r>
+      <w:r>
+        <w:t xml:space="preserve"> runs nine retrievers per turn and merges their outputs into one deduplicated pool (mean ~3,300 candidates); no single source exceeds ~59% gold recall at 500 candidates, but the fused pool reaches ~89% on the blind-simulated holdout. </w:t>
+      </w:r>
+      <w:r>
+        <w:rPr>
+          <w:i/>
+        </w:rPr>
+        <w:t>Rescore</w:t>
+      </w:r>
+      <w:r>
+        <w:t xml:space="preserve"> is a LightGBM LambdaMART model that scores every candidate from 67 features and emits the top 20, replacing hand-tuned score fusion. </w:t>
+      </w:r>
+      <w:r>
+        <w:rPr>
+          <w:i/>
+        </w:rPr>
+        <w:t>Respond</w:t>
+      </w:r>
+      <w:r>
+        <w:t xml:space="preserve"> is decoupled: because the judge reads only text, the response may describe the ranked list but never reorders it. All three stages run on one Apple M4 machine (16 GB unified memory, no GPU), and the only trained neural component is the LoRA encoder of Section 3.</w:t>
+      </w:r>
+    </w:p>
+    <w:p>
+      <w:pPr>
+        <w:pStyle w:val="Para"/>
+      </w:pPr>
+      <w:r>
+        <w:rPr>
+          <w:b/>
+        </w:rPr>
+        <w:t>Contributions.</w:t>
+      </w:r>
+      <w:r>
+        <w:t xml:space="preserve"> (1) A treatment of the goal-progress feedback signal that is off-by-one in time and contaminated with rejected tracks: we align it, decontaminate it, and reconstruct it from raw dialogue when it is withheld at test time. (2) A structured, role-tagged dialogue anchor that encodes prior turns, recommendations, and per-turn reactions as explicit fields, paired with a priority-ordered hard-negative recipe that recycles confirmed session rejections as training negatives. (3) A dialogue-aware retriever: a LoRA fine-tune of </w:t>
+      </w:r>
+      <w:r>
+        <w:rPr>
+          <w:rFonts w:ascii="Courier New" w:hAnsi="Courier New"/>
+        </w:rPr>
+        <w:t>multilingual-e5-base</w:t>
+      </w:r>
+      <w:r>
+        <w:t xml:space="preserve"> over that anchor, combining (1) and (2) into a single trained artifact. (4) A recall design that treats retrieval as </w:t>
+      </w:r>
+      <w:r>
+        <w:rPr>
+          <w:i/>
+        </w:rPr>
+        <w:t>set union, not weighted fusion</w:t>
+      </w:r>
+      <w:r>
+        <w:t>: each source contributes candidates and per-source features, and a learned ranker decides how far to trust each; multi-source agreement is the single strongest feature.</w:t>
+      </w:r>
+    </w:p>
+    <w:p>
+      <w:pPr>
+        <w:pStyle w:val="Head1"/>
+      </w:pPr>
+      <w:r>
+        <w:t>2 Recall Architecture</w:t>
+      </w:r>
+    </w:p>
+    <w:p>
+      <w:pPr>
+        <w:pStyle w:val="Para"/>
+      </w:pPr>
+      <w:r>
+        <w:t xml:space="preserve">Recall is a union of nine retrievers (Table 1). Each candidate carries the per-source scores and origin flags that later become ranker features. The design rule is to </w:t>
+      </w:r>
+      <w:r>
+        <w:rPr>
+          <w:i/>
+        </w:rPr>
+        <w:t>add candidates, never re-weight sources by hand</w:t>
+      </w:r>
+      <w:r>
+        <w:t>: even low-precision sources help, because source membership feeds the agreement feature of Section 4.</w:t>
+      </w:r>
+    </w:p>
+    <w:p>
+      <w:pPr>
+        <w:sectPr>
+          <w:type w:val="continuous"/>
+          <w:pgSz w:w="12240" w:h="15840" w:code="9"/>
+          <w:pgMar w:top="1500" w:right="1080" w:bottom="1600" w:left="1080" w:header="1080" w:footer="1080" w:gutter="0"/>
+          <w:cols w:num="2" w:space="480"/>
         </w:sectPr>
       </w:pPr>
     </w:p>
@@ -1133,7 +1143,7 @@
           <w:type w:val="continuous"/>
           <w:pgSz w:w="12240" w:h="15840" w:code="9"/>
           <w:pgMar w:top="1500" w:right="1080" w:bottom="1600" w:left="1080" w:header="1080" w:footer="1080" w:gutter="0"/>
-          <w:cols w:num="2" w:space="480"/>
+          <w:cols w:num="1"/>
         </w:sectPr>
       </w:pPr>
     </w:p>
@@ -1564,7 +1574,7 @@
           <w:type w:val="continuous"/>
           <w:pgSz w:w="12240" w:h="15840" w:code="9"/>
           <w:pgMar w:top="1500" w:right="1080" w:bottom="1600" w:left="1080" w:header="1080" w:footer="1080" w:gutter="0"/>
-          <w:cols w:num="1"/>
+          <w:cols w:num="2" w:space="480"/>
         </w:sectPr>
       </w:pPr>
     </w:p>
@@ -1928,7 +1938,7 @@
           <w:type w:val="continuous"/>
           <w:pgSz w:w="12240" w:h="15840" w:code="9"/>
           <w:pgMar w:top="1500" w:right="1080" w:bottom="1600" w:left="1080" w:header="1080" w:footer="1080" w:gutter="0"/>
-          <w:cols w:num="2" w:space="480"/>
+          <w:cols w:num="1"/>
         </w:sectPr>
       </w:pPr>
     </w:p>
@@ -1954,7 +1964,7 @@
           <w:type w:val="continuous"/>
           <w:pgSz w:w="12240" w:h="15840" w:code="9"/>
           <w:pgMar w:top="1500" w:right="1080" w:bottom="1600" w:left="1080" w:header="1080" w:footer="1080" w:gutter="0"/>
-          <w:cols w:num="1"/>
+          <w:cols w:num="2" w:space="480"/>
         </w:sectPr>
       </w:pPr>
     </w:p>
@@ -2443,7 +2453,7 @@
           <w:type w:val="continuous"/>
           <w:pgSz w:w="12240" w:h="15840" w:code="9"/>
           <w:pgMar w:top="1500" w:right="1080" w:bottom="1600" w:left="1080" w:header="1080" w:footer="1080" w:gutter="0"/>
-          <w:cols w:num="2" w:space="480"/>
+          <w:cols w:num="1"/>
         </w:sectPr>
       </w:pPr>
     </w:p>
@@ -2492,7 +2502,7 @@
           <w:type w:val="continuous"/>
           <w:pgSz w:w="12240" w:h="15840" w:code="9"/>
           <w:pgMar w:top="1500" w:right="1080" w:bottom="1600" w:left="1080" w:header="1080" w:footer="1080" w:gutter="0"/>
-          <w:cols w:num="1"/>
+          <w:cols w:num="2" w:space="480"/>
         </w:sectPr>
       </w:pPr>
     </w:p>
@@ -2872,7 +2882,7 @@
           <w:type w:val="continuous"/>
           <w:pgSz w:w="12240" w:h="15840" w:code="9"/>
           <w:pgMar w:top="1500" w:right="1080" w:bottom="1600" w:left="1080" w:header="1080" w:footer="1080" w:gutter="0"/>
-          <w:cols w:num="2" w:space="480"/>
+          <w:cols w:num="1"/>
         </w:sectPr>
       </w:pPr>
     </w:p>
@@ -2935,7 +2945,7 @@
           <w:type w:val="continuous"/>
           <w:pgSz w:w="12240" w:h="15840" w:code="9"/>
           <w:pgMar w:top="1500" w:right="1080" w:bottom="1600" w:left="1080" w:header="1080" w:footer="1080" w:gutter="0"/>
-          <w:cols w:num="1"/>
+          <w:cols w:num="2" w:space="480"/>
         </w:sectPr>
       </w:pPr>
     </w:p>
@@ -3770,7 +3780,7 @@
           <w:type w:val="continuous"/>
           <w:pgSz w:w="12240" w:h="15840" w:code="9"/>
           <w:pgMar w:top="1500" w:right="1080" w:bottom="1600" w:left="1080" w:header="1080" w:footer="1080" w:gutter="0"/>
-          <w:cols w:num="2" w:space="480"/>
+          <w:cols w:num="1"/>
         </w:sectPr>
       </w:pPr>
     </w:p>
@@ -3821,7 +3831,7 @@
           <w:type w:val="continuous"/>
           <w:pgSz w:w="12240" w:h="15840" w:code="9"/>
           <w:pgMar w:top="1500" w:right="1080" w:bottom="1600" w:left="1080" w:header="1080" w:footer="1080" w:gutter="0"/>
-          <w:cols w:num="1"/>
+          <w:cols w:num="2" w:space="480"/>
         </w:sectPr>
       </w:pPr>
     </w:p>
@@ -4354,7 +4364,7 @@
           <w:type w:val="continuous"/>
           <w:pgSz w:w="12240" w:h="15840" w:code="9"/>
           <w:pgMar w:top="1500" w:right="1080" w:bottom="1600" w:left="1080" w:header="1080" w:footer="1080" w:gutter="0"/>
-          <w:cols w:num="2" w:space="480"/>
+          <w:cols w:num="1"/>
         </w:sectPr>
       </w:pPr>
     </w:p>

</xml_diff>